<commit_message>
docs: student2 testing report
</commit_message>
<xml_diff>
--- a/reports/Student #2/C2/Testing Report Student #2.docx
+++ b/reports/Student #2/C2/Testing Report Student #2.docx
@@ -45,14 +45,23 @@
           <w:rFonts w:ascii="Aptos" w:eastAsia="Aptos" w:hAnsi="Aptos" w:cs="Aptos"/>
           <w:color w:val="000000" w:themeColor="text1"/>
         </w:rPr>
-        <w:t xml:space="preserve">DELIVERABLE </w:t>
-      </w:r>
-      <w:r>
+        <w:t>C2</w:t>
+      </w:r>
+    </w:p>
+    <w:p>
+      <w:pPr>
+        <w:jc w:val="center"/>
         <w:rPr>
           <w:rFonts w:ascii="Aptos" w:eastAsia="Aptos" w:hAnsi="Aptos" w:cs="Aptos"/>
           <w:color w:val="000000" w:themeColor="text1"/>
         </w:rPr>
-        <w:t>4</w:t>
+      </w:pPr>
+      <w:r>
+        <w:rPr>
+          <w:rFonts w:ascii="Aptos" w:eastAsia="Aptos" w:hAnsi="Aptos" w:cs="Aptos"/>
+          <w:color w:val="000000" w:themeColor="text1"/>
+        </w:rPr>
+        <w:t>DESING AND TESTING 2</w:t>
       </w:r>
     </w:p>
     <w:p>
@@ -68,23 +77,28 @@
           <w:rFonts w:ascii="Aptos" w:eastAsia="Aptos" w:hAnsi="Aptos" w:cs="Aptos"/>
           <w:color w:val="000000" w:themeColor="text1"/>
         </w:rPr>
-        <w:t>DESING AND TESTING 2</w:t>
-      </w:r>
-    </w:p>
-    <w:p>
-      <w:pPr>
-        <w:jc w:val="center"/>
+        <w:t xml:space="preserve"> 202</w:t>
+      </w:r>
+      <w:r>
         <w:rPr>
           <w:rFonts w:ascii="Aptos" w:eastAsia="Aptos" w:hAnsi="Aptos" w:cs="Aptos"/>
           <w:color w:val="000000" w:themeColor="text1"/>
         </w:rPr>
-      </w:pPr>
+        <w:t>4</w:t>
+      </w:r>
       <w:r>
         <w:rPr>
           <w:rFonts w:ascii="Aptos" w:eastAsia="Aptos" w:hAnsi="Aptos" w:cs="Aptos"/>
           <w:color w:val="000000" w:themeColor="text1"/>
         </w:rPr>
-        <w:t xml:space="preserve"> 2023-2024</w:t>
+        <w:t>-202</w:t>
+      </w:r>
+      <w:r>
+        <w:rPr>
+          <w:rFonts w:ascii="Aptos" w:eastAsia="Aptos" w:hAnsi="Aptos" w:cs="Aptos"/>
+          <w:color w:val="000000" w:themeColor="text1"/>
+        </w:rPr>
+        <w:t>5</w:t>
       </w:r>
     </w:p>
     <w:p>
@@ -199,7 +213,7 @@
               <w:rPr>
                 <w:rFonts w:ascii="Aptos" w:eastAsia="Aptos" w:hAnsi="Aptos" w:cs="Aptos"/>
               </w:rPr>
-              <w:t>5</w:t>
+              <w:t>7</w:t>
             </w:r>
             <w:r>
               <w:rPr>
@@ -211,19 +225,19 @@
               <w:rPr>
                 <w:rFonts w:ascii="Aptos" w:eastAsia="Aptos" w:hAnsi="Aptos" w:cs="Aptos"/>
               </w:rPr>
-              <w:t>2</w:t>
+              <w:t>02</w:t>
             </w:r>
             <w:r>
               <w:rPr>
                 <w:rFonts w:ascii="Aptos" w:eastAsia="Aptos" w:hAnsi="Aptos" w:cs="Aptos"/>
               </w:rPr>
-              <w:t>7</w:t>
+              <w:t>/202</w:t>
             </w:r>
             <w:r>
               <w:rPr>
                 <w:rFonts w:ascii="Aptos" w:eastAsia="Aptos" w:hAnsi="Aptos" w:cs="Aptos"/>
               </w:rPr>
-              <w:t>/2024</w:t>
+              <w:t>5</w:t>
             </w:r>
           </w:p>
         </w:tc>
@@ -308,11 +322,19 @@
                 <w:rFonts w:ascii="Aptos" w:eastAsia="Aptos" w:hAnsi="Aptos" w:cs="Aptos"/>
               </w:rPr>
             </w:pPr>
+            <w:proofErr w:type="spellStart"/>
             <w:r>
               <w:rPr>
                 <w:lang w:val="es-ES"/>
               </w:rPr>
-              <w:t xml:space="preserve">Group: </w:t>
+              <w:t>Group</w:t>
+            </w:r>
+            <w:proofErr w:type="spellEnd"/>
+            <w:r>
+              <w:rPr>
+                <w:lang w:val="es-ES"/>
+              </w:rPr>
+              <w:t xml:space="preserve">: </w:t>
             </w:r>
             <w:r>
               <w:t>C1.053</w:t>
@@ -340,12 +362,14 @@
                 <w:rFonts w:ascii="Aptos" w:eastAsia="Aptos" w:hAnsi="Aptos" w:cs="Aptos"/>
               </w:rPr>
             </w:pPr>
+            <w:proofErr w:type="spellStart"/>
             <w:r>
               <w:rPr>
                 <w:lang w:val="es-ES"/>
               </w:rPr>
               <w:t>Members</w:t>
             </w:r>
+            <w:proofErr w:type="spellEnd"/>
           </w:p>
         </w:tc>
         <w:tc>
@@ -626,11 +650,19 @@
                 <w:rFonts w:ascii="Aptos" w:eastAsia="Aptos" w:hAnsi="Aptos" w:cs="Aptos"/>
               </w:rPr>
             </w:pPr>
+            <w:proofErr w:type="spellStart"/>
             <w:r>
               <w:rPr>
                 <w:lang w:val="es-ES"/>
               </w:rPr>
-              <w:t>Periáñez Franco, Luis Javier</w:t>
+              <w:t>Periáñez</w:t>
+            </w:r>
+            <w:proofErr w:type="spellEnd"/>
+            <w:r>
+              <w:rPr>
+                <w:lang w:val="es-ES"/>
+              </w:rPr>
+              <w:t xml:space="preserve"> Franco, Luis Javier</w:t>
             </w:r>
           </w:p>
         </w:tc>
@@ -691,7 +723,7 @@
             <w:rStyle w:val="Hipervnculo"/>
             <w:rFonts w:ascii="Segoe UI" w:eastAsia="Segoe UI" w:hAnsi="Segoe UI" w:cs="Segoe UI"/>
           </w:rPr>
-          <w:t>https://github.com/miggonort1/Acme-ANS-D04</w:t>
+          <w:t>https://github.com/MiguelPalomo/Acme-ANS-C2.git</w:t>
         </w:r>
       </w:hyperlink>
     </w:p>
@@ -911,9 +943,33 @@
             </w:pPr>
             <w:r>
               <w:rPr>
-                <w:rFonts w:ascii="Aptos Display" w:hAnsi="Aptos Display" w:cs="Aptos Display"/>
+                <w:rFonts w:ascii="Aptos" w:eastAsia="Aptos" w:hAnsi="Aptos" w:cs="Aptos"/>
               </w:rPr>
-              <w:t>05/26/2025</w:t>
+              <w:t>07</w:t>
+            </w:r>
+            <w:r>
+              <w:rPr>
+                <w:rFonts w:ascii="Aptos" w:eastAsia="Aptos" w:hAnsi="Aptos" w:cs="Aptos"/>
+              </w:rPr>
+              <w:t>/</w:t>
+            </w:r>
+            <w:r>
+              <w:rPr>
+                <w:rFonts w:ascii="Aptos" w:eastAsia="Aptos" w:hAnsi="Aptos" w:cs="Aptos"/>
+              </w:rPr>
+              <w:t>02</w:t>
+            </w:r>
+            <w:r>
+              <w:rPr>
+                <w:rFonts w:ascii="Aptos" w:eastAsia="Aptos" w:hAnsi="Aptos" w:cs="Aptos"/>
+              </w:rPr>
+              <w:t>/202</w:t>
+            </w:r>
+            <w:r>
+              <w:rPr>
+                <w:rFonts w:ascii="Aptos" w:eastAsia="Aptos" w:hAnsi="Aptos" w:cs="Aptos"/>
+              </w:rPr>
+              <w:t>5</w:t>
             </w:r>
           </w:p>
         </w:tc>
@@ -1121,783 +1177,12 @@
       <w:bookmarkEnd w:id="5"/>
     </w:p>
     <w:p>
-      <w:pPr>
-        <w:pStyle w:val="Ttulo4"/>
-      </w:pPr>
-      <w:bookmarkStart w:id="6" w:name="_Toc199190111"/>
-      <w:r>
-        <w:t>List</w:t>
-      </w:r>
-      <w:bookmarkEnd w:id="6"/>
-    </w:p>
-    <w:p>
-      <w:r>
-        <w:t>The tests here were simple, so I achieved 100% coverage. I created .safe tests to access and view the listing, including pagination and related functionality. The .hack tests simulate access attempts by users with different roles, unauthenticated users, and users with the same role accessing their own list.</w:t>
-      </w:r>
-    </w:p>
-    <w:p>
-      <w:pPr>
-        <w:pStyle w:val="Ttulo4"/>
-      </w:pPr>
-      <w:bookmarkStart w:id="7" w:name="_Toc199190112"/>
-      <w:r>
-        <w:t>Show</w:t>
-      </w:r>
-      <w:bookmarkEnd w:id="7"/>
-    </w:p>
-    <w:p>
-      <w:pPr>
-        <w:pStyle w:val="Ttulo4"/>
-        <w:rPr>
-          <w:rFonts w:eastAsiaTheme="minorEastAsia" w:cstheme="minorBidi"/>
-          <w:i w:val="0"/>
-          <w:iCs w:val="0"/>
-          <w:color w:val="auto"/>
-        </w:rPr>
-      </w:pPr>
-      <w:bookmarkStart w:id="8" w:name="_Toc199190113"/>
-      <w:r>
-        <w:rPr>
-          <w:rFonts w:eastAsiaTheme="minorEastAsia" w:cstheme="minorBidi"/>
-          <w:i w:val="0"/>
-          <w:iCs w:val="0"/>
-          <w:color w:val="auto"/>
-        </w:rPr>
-        <w:t>I also achieved 100% coverage here. The .safe tests check access to both published and unpublished bookings. The .hack tests include attempts by users with different roles, unauthenticated users, users with the same role but not the creator, and also attempts to access a null booking. All cases were tested for both published and unpublished bookings.</w:t>
-      </w:r>
-      <w:bookmarkEnd w:id="8"/>
-    </w:p>
-    <w:p>
-      <w:pPr>
-        <w:pStyle w:val="Ttulo4"/>
-      </w:pPr>
-      <w:bookmarkStart w:id="9" w:name="_Toc199190114"/>
-      <w:r>
-        <w:t>Create</w:t>
-      </w:r>
-      <w:bookmarkEnd w:id="9"/>
-    </w:p>
-    <w:p>
-      <w:r>
-        <w:t>Here I reached 98% coverage. The .safe tests involve executing the operation with different parameters to validate all types of constraints. The .hack tests simulate a create attempt by a user with a different role, an unauthenticated user, and a user with the same role accessing their own create. I also tested possible client-side manipulations via F12 by tampering with flight-related data.</w:t>
-      </w:r>
-    </w:p>
-    <w:p>
-      <w:pPr>
-        <w:pStyle w:val="Ttulo4"/>
-      </w:pPr>
-      <w:bookmarkStart w:id="10" w:name="_Toc199190115"/>
-      <w:r>
-        <w:t>Delete</w:t>
-      </w:r>
-      <w:bookmarkEnd w:id="10"/>
-    </w:p>
-    <w:p>
-      <w:r>
-        <w:t>For delete, I obtained 97.9% coverage. The .safe tests verify deletion of an unpublished booking. The .hack tests cover access attempts by unauthenticated users, users with a different role, users with the same role but not the creator, and attempts to delete a published booking.</w:t>
-      </w:r>
-    </w:p>
-    <w:p>
-      <w:pPr>
-        <w:pStyle w:val="Ttulo4"/>
-      </w:pPr>
-      <w:bookmarkStart w:id="11" w:name="_Toc199190116"/>
-      <w:r>
-        <w:lastRenderedPageBreak/>
-        <w:t>Update</w:t>
-      </w:r>
-      <w:bookmarkEnd w:id="11"/>
-    </w:p>
-    <w:p>
-      <w:pPr>
-        <w:pStyle w:val="Ttulo4"/>
-        <w:rPr>
-          <w:rFonts w:eastAsiaTheme="minorEastAsia" w:cstheme="minorBidi"/>
-          <w:i w:val="0"/>
-          <w:iCs w:val="0"/>
-          <w:color w:val="auto"/>
-        </w:rPr>
-      </w:pPr>
-      <w:bookmarkStart w:id="12" w:name="_Toc199190117"/>
-      <w:r>
-        <w:rPr>
-          <w:rFonts w:eastAsiaTheme="minorEastAsia" w:cstheme="minorBidi"/>
-          <w:i w:val="0"/>
-          <w:iCs w:val="0"/>
-          <w:color w:val="auto"/>
-        </w:rPr>
-        <w:t>Here I achieved 97.3% coverage. The .safe tests include multiple parameter combinations to trigger all validation paths. The .hack tests involve an authenticated user with a different role, an unauthenticated user, a user with the same role but not the creator, and a published booking. Some conditional branches (if statements) couldn’t be fully covered, but I believe they are necessary and justified.</w:t>
-      </w:r>
-      <w:bookmarkEnd w:id="12"/>
-    </w:p>
-    <w:p>
-      <w:pPr>
-        <w:pStyle w:val="Ttulo4"/>
-      </w:pPr>
-      <w:bookmarkStart w:id="13" w:name="_Toc199190118"/>
-      <w:r>
-        <w:t>Publish</w:t>
-      </w:r>
-      <w:bookmarkEnd w:id="13"/>
-    </w:p>
-    <w:p>
-      <w:pPr>
-        <w:pStyle w:val="Ttulo3"/>
-        <w:rPr>
-          <w:rFonts w:eastAsiaTheme="minorEastAsia" w:cstheme="minorBidi"/>
-          <w:color w:val="auto"/>
-          <w:sz w:val="24"/>
-          <w:szCs w:val="24"/>
-        </w:rPr>
-      </w:pPr>
-      <w:bookmarkStart w:id="14" w:name="_Toc199190119"/>
-      <w:r>
-        <w:rPr>
-          <w:rFonts w:eastAsiaTheme="minorEastAsia" w:cstheme="minorBidi"/>
-          <w:color w:val="auto"/>
-          <w:sz w:val="24"/>
-          <w:szCs w:val="24"/>
-        </w:rPr>
-        <w:t>I obtained 97.6% coverage for the publish operation. The .safe tests focus on different parameter combinations to validate all constraints. The .hack tests include access attempts by an authenticated user with a different role, an unauthenticated user, a user with the same role but not the creator, and a published booking. As with update, there are some conditional clauses I couldn’t fully cover, but I consider them necessary for security and consistency.</w:t>
-      </w:r>
-      <w:bookmarkEnd w:id="14"/>
-    </w:p>
-    <w:p/>
-    <w:p>
-      <w:pPr>
-        <w:rPr>
-          <w:lang w:val="es-ES"/>
-        </w:rPr>
-      </w:pPr>
-      <w:r>
-        <w:rPr>
-          <w:lang w:val="es-ES"/>
-        </w:rPr>
-        <w:t xml:space="preserve">In both the </w:t>
-      </w:r>
-      <w:r>
-        <w:rPr>
-          <w:b/>
-          <w:bCs/>
-          <w:lang w:val="es-ES"/>
-        </w:rPr>
-        <w:t>Update</w:t>
-      </w:r>
-      <w:r>
-        <w:rPr>
-          <w:lang w:val="es-ES"/>
-        </w:rPr>
-        <w:t xml:space="preserve"> and </w:t>
-      </w:r>
-      <w:r>
-        <w:rPr>
-          <w:b/>
-          <w:bCs/>
-          <w:lang w:val="es-ES"/>
-        </w:rPr>
-        <w:t>Publish</w:t>
-      </w:r>
-      <w:r>
-        <w:rPr>
-          <w:lang w:val="es-ES"/>
-        </w:rPr>
-        <w:t xml:space="preserve"> operations, it is possible to modify the price field via the browser’s developer tools (F12) and submit the form without triggering an error — although the value is not actually updated. Initially, I had designed the system to throw an </w:t>
-      </w:r>
-      <w:r>
-        <w:rPr>
-          <w:i/>
-          <w:iCs/>
-          <w:lang w:val="es-ES"/>
-        </w:rPr>
-        <w:t>unauthorised</w:t>
-      </w:r>
-      <w:r>
-        <w:rPr>
-          <w:lang w:val="es-ES"/>
-        </w:rPr>
-        <w:t xml:space="preserve"> error in such cases, to detect and block any tampering.</w:t>
-      </w:r>
-    </w:p>
-    <w:p>
-      <w:pPr>
-        <w:rPr>
-          <w:lang w:val="es-ES"/>
-        </w:rPr>
-      </w:pPr>
-      <w:r>
-        <w:rPr>
-          <w:lang w:val="es-ES"/>
-        </w:rPr>
-        <w:t xml:space="preserve">However, this led to significant issues related to the flight, since the price is directly derived from it. For example, if someone hacked the form to set the flight to null, the system would always throw an </w:t>
-      </w:r>
-      <w:r>
-        <w:rPr>
-          <w:i/>
-          <w:iCs/>
-          <w:lang w:val="es-ES"/>
-        </w:rPr>
-        <w:t>unauthorised</w:t>
-      </w:r>
-      <w:r>
-        <w:rPr>
-          <w:lang w:val="es-ES"/>
-        </w:rPr>
-        <w:t xml:space="preserve"> error because it detected a mismatch in the calculated price, causing the process to break even in legitimate scenarios.</w:t>
-      </w:r>
-    </w:p>
-    <w:p>
-      <w:pPr>
-        <w:rPr>
-          <w:lang w:val="es-ES"/>
-        </w:rPr>
-      </w:pPr>
-      <w:r>
-        <w:rPr>
-          <w:lang w:val="es-ES"/>
-        </w:rPr>
-        <w:t>Due to the complexity and the risk of false positives, I ultimately decided the best option was to remove that specific authorisation check.</w:t>
-      </w:r>
-    </w:p>
-    <w:p/>
-    <w:p>
-      <w:pPr>
-        <w:pStyle w:val="Ttulo3"/>
-        <w:rPr>
-          <w:b/>
-          <w:bCs/>
-          <w:u w:val="single"/>
-        </w:rPr>
-      </w:pPr>
-      <w:bookmarkStart w:id="15" w:name="_Toc199190120"/>
-      <w:r>
-        <w:rPr>
-          <w:b/>
-          <w:bCs/>
-          <w:u w:val="single"/>
-        </w:rPr>
-        <w:t>Booking Passenger (</w:t>
-      </w:r>
-      <w:r>
-        <w:rPr>
-          <w:b/>
-          <w:bCs/>
-          <w:u w:val="single"/>
-        </w:rPr>
-        <w:t>intermediate entity</w:t>
-      </w:r>
-      <w:r>
-        <w:rPr>
-          <w:b/>
-          <w:bCs/>
-          <w:u w:val="single"/>
-        </w:rPr>
-        <w:t>)</w:t>
-      </w:r>
-      <w:bookmarkEnd w:id="15"/>
-    </w:p>
-    <w:p>
-      <w:pPr>
-        <w:pStyle w:val="Ttulo4"/>
-      </w:pPr>
-      <w:bookmarkStart w:id="16" w:name="_Toc199190121"/>
-      <w:r>
-        <w:t>List</w:t>
-      </w:r>
-      <w:bookmarkEnd w:id="16"/>
-    </w:p>
-    <w:p>
-      <w:r>
-        <w:t>I achieved 100% coverage. The .safe tests check the listing of passengers for both published and unpublished bookings. The .hack tests simulate access attempts by unauthenticated users, users with a different role, and users with the same role but who are not the owner of the booking.</w:t>
-      </w:r>
-    </w:p>
-    <w:p>
-      <w:pPr>
-        <w:pStyle w:val="Ttulo4"/>
-      </w:pPr>
-      <w:bookmarkStart w:id="17" w:name="_Toc199190122"/>
-      <w:r>
-        <w:lastRenderedPageBreak/>
-        <w:t>Show</w:t>
-      </w:r>
-      <w:bookmarkEnd w:id="17"/>
-    </w:p>
-    <w:p>
-      <w:r>
-        <w:t>I also reached 100% coverage here. The .safe tests verify access to individual BookingPassenger entries, particularly showing the linked passenger through the master bookingPassenger.passenger. The .hack tests cover the usual cases: unauthenticated users, users with a different role, and users with the same role but not the owner.</w:t>
-      </w:r>
-    </w:p>
-    <w:p>
-      <w:pPr>
-        <w:pStyle w:val="Ttulo4"/>
-      </w:pPr>
-      <w:bookmarkStart w:id="18" w:name="_Toc199190123"/>
-      <w:r>
-        <w:t>Create</w:t>
-      </w:r>
-      <w:bookmarkEnd w:id="18"/>
-    </w:p>
-    <w:p>
-      <w:pPr>
-        <w:rPr>
-          <w:lang w:val="es-ES"/>
-        </w:rPr>
-      </w:pPr>
-      <w:r>
-        <w:rPr>
-          <w:lang w:val="es-ES"/>
-        </w:rPr>
-        <w:t>Here I obtained 96.2% coverage. The .safe tests focus on adding passengers and verifying that the total price updates accordingly, as well as triggering a validation error if the total currency amount reaches the limit of 1,000,000. The .hack tests include attempts by various types of users (different role, unauthenticated, same role but different customer) and cover both published and unpublished scenarios.</w:t>
-      </w:r>
-    </w:p>
-    <w:p>
-      <w:pPr>
-        <w:rPr>
-          <w:lang w:val="es-ES"/>
-        </w:rPr>
-      </w:pPr>
-      <w:r>
-        <w:rPr>
-          <w:lang w:val="es-ES"/>
-        </w:rPr>
-        <w:t>There was a particular issue here: while running tests, I encountered a payload error in which the test returned OK even when passengerId=0 was submitted — regardless of what I tried to inject via F12. As a result, validation errors (e.g., "passenger cannot be null") were triggered at a later stage, making the test behavior somewhat confusing and preventing me from fully testing that part of the code.</w:t>
-      </w:r>
-    </w:p>
-    <w:p>
-      <w:pPr>
-        <w:rPr>
-          <w:lang w:val="es-ES"/>
-        </w:rPr>
-      </w:pPr>
-      <w:r>
-        <w:rPr>
-          <w:lang w:val="es-ES"/>
-        </w:rPr>
-        <w:t>However, I’ve attached a video named ERROR that demonstrates how the validations behave correctly when manually tested. The tested passenger IDs were:</w:t>
-      </w:r>
-    </w:p>
-    <w:p>
-      <w:pPr>
-        <w:numPr>
-          <w:ilvl w:val="0"/>
-          <w:numId w:val="14"/>
-        </w:numPr>
-        <w:rPr>
-          <w:lang w:val="es-ES"/>
-        </w:rPr>
-      </w:pPr>
-      <w:r>
-        <w:rPr>
-          <w:b/>
-          <w:bCs/>
-          <w:lang w:val="es-ES"/>
-        </w:rPr>
-        <w:t>ID 439</w:t>
-      </w:r>
-      <w:r>
-        <w:rPr>
-          <w:lang w:val="es-ES"/>
-        </w:rPr>
-        <w:t>: Passenger not published</w:t>
-      </w:r>
-    </w:p>
-    <w:p>
-      <w:pPr>
-        <w:numPr>
-          <w:ilvl w:val="0"/>
-          <w:numId w:val="14"/>
-        </w:numPr>
-        <w:rPr>
-          <w:lang w:val="es-ES"/>
-        </w:rPr>
-      </w:pPr>
-      <w:r>
-        <w:rPr>
-          <w:b/>
-          <w:bCs/>
-          <w:lang w:val="es-ES"/>
-        </w:rPr>
-        <w:t>ID 472</w:t>
-      </w:r>
-      <w:r>
-        <w:rPr>
-          <w:lang w:val="es-ES"/>
-        </w:rPr>
-        <w:t>: Passenger belonging to another customer</w:t>
-      </w:r>
-    </w:p>
-    <w:p>
-      <w:pPr>
-        <w:numPr>
-          <w:ilvl w:val="0"/>
-          <w:numId w:val="14"/>
-        </w:numPr>
-        <w:rPr>
-          <w:lang w:val="es-ES"/>
-        </w:rPr>
-      </w:pPr>
-      <w:r>
-        <w:rPr>
-          <w:b/>
-          <w:bCs/>
-          <w:lang w:val="es-ES"/>
-        </w:rPr>
-        <w:t>ID 440</w:t>
-      </w:r>
-      <w:r>
-        <w:rPr>
-          <w:lang w:val="es-ES"/>
-        </w:rPr>
-        <w:t>: Passenger already assigned to the same booking</w:t>
-      </w:r>
-    </w:p>
-    <w:p>
-      <w:pPr>
-        <w:numPr>
-          <w:ilvl w:val="0"/>
-          <w:numId w:val="14"/>
-        </w:numPr>
-        <w:rPr>
-          <w:lang w:val="es-ES"/>
-        </w:rPr>
-      </w:pPr>
-      <w:r>
-        <w:rPr>
-          <w:b/>
-          <w:bCs/>
-          <w:lang w:val="es-ES"/>
-        </w:rPr>
-        <w:t>ID 445</w:t>
-      </w:r>
-      <w:r>
-        <w:rPr>
-          <w:lang w:val="es-ES"/>
-        </w:rPr>
-        <w:t>: Passenger born after the booking date</w:t>
-      </w:r>
-    </w:p>
-    <w:p/>
-    <w:p>
-      <w:pPr>
-        <w:pStyle w:val="Ttulo4"/>
-      </w:pPr>
-      <w:bookmarkStart w:id="19" w:name="_Toc199190124"/>
-      <w:r>
-        <w:t>Delete</w:t>
-      </w:r>
-      <w:bookmarkEnd w:id="19"/>
-    </w:p>
-    <w:p>
-      <w:r>
-        <w:t>Here I achieved 93.2% coverage, even though everything appears green in the coverage report, so I’m not entirely sure why it didn’t reach 100%. The .safe test deletes an existing connection, while the .hack tests attempt to perform the deletion using unauthenticated users, users with a different role, and users with the same role but not the owner.</w:t>
-      </w:r>
-    </w:p>
-    <w:p/>
-    <w:p>
-      <w:pPr>
-        <w:pStyle w:val="Ttulo3"/>
-        <w:rPr>
-          <w:b/>
-          <w:bCs/>
-          <w:u w:val="single"/>
-        </w:rPr>
-      </w:pPr>
-      <w:bookmarkStart w:id="20" w:name="_Toc199190125"/>
-      <w:r>
-        <w:rPr>
-          <w:b/>
-          <w:bCs/>
-          <w:u w:val="single"/>
-        </w:rPr>
-        <w:lastRenderedPageBreak/>
-        <w:t>Passenger</w:t>
-      </w:r>
-      <w:bookmarkEnd w:id="20"/>
-    </w:p>
-    <w:p>
-      <w:pPr>
-        <w:pStyle w:val="Ttulo4"/>
-      </w:pPr>
-      <w:bookmarkStart w:id="21" w:name="_Toc199190126"/>
-      <w:r>
-        <w:t>List</w:t>
-      </w:r>
-      <w:bookmarkEnd w:id="21"/>
-    </w:p>
-    <w:p>
-      <w:r>
-        <w:t>The tests here were simple, so I achieved 100% coverage. I created .safe tests to access and view the listing, including pagination and related functionality. The .hack tests simulate access attempts by users with different roles, unauthenticated users, and users with the same role accessing their own list.</w:t>
-      </w:r>
-    </w:p>
-    <w:p>
-      <w:pPr>
-        <w:pStyle w:val="Ttulo4"/>
-      </w:pPr>
-      <w:bookmarkStart w:id="22" w:name="_Toc199190127"/>
-      <w:r>
-        <w:t>Show</w:t>
-      </w:r>
-      <w:bookmarkEnd w:id="22"/>
-    </w:p>
-    <w:p>
-      <w:pPr>
-        <w:pStyle w:val="Ttulo4"/>
-        <w:rPr>
-          <w:rFonts w:eastAsiaTheme="minorEastAsia" w:cstheme="minorBidi"/>
-          <w:i w:val="0"/>
-          <w:iCs w:val="0"/>
-          <w:color w:val="auto"/>
-        </w:rPr>
-      </w:pPr>
-      <w:bookmarkStart w:id="23" w:name="_Toc199190128"/>
-      <w:r>
-        <w:rPr>
-          <w:rFonts w:eastAsiaTheme="minorEastAsia" w:cstheme="minorBidi"/>
-          <w:i w:val="0"/>
-          <w:iCs w:val="0"/>
-          <w:color w:val="auto"/>
-        </w:rPr>
-        <w:t>I also achieved 100% coverage here. The .safe tests check access to both published and unpublished bookings. The .hack tests include attempts by users with different roles, unauthenticated users, users with the same role but not the creator, and also attempts to access a null booking. All cases were tested for both published and unpublished bookings.</w:t>
-      </w:r>
-      <w:bookmarkEnd w:id="23"/>
-    </w:p>
-    <w:p>
-      <w:pPr>
-        <w:pStyle w:val="Ttulo4"/>
-      </w:pPr>
-      <w:bookmarkStart w:id="24" w:name="_Toc199190129"/>
-      <w:r>
-        <w:t>Create</w:t>
-      </w:r>
-      <w:bookmarkEnd w:id="24"/>
-    </w:p>
-    <w:p>
-      <w:r>
-        <w:t>Here I reached 9</w:t>
-      </w:r>
-      <w:r>
-        <w:t>6.5</w:t>
-      </w:r>
-      <w:r>
-        <w:t>% coverage. The .safe tests involve executing the operation with different parameters to validate all types of constraints. The .hack tests simulate a create attempt by a user with a different role, an unauthenticated user, and a user with the same role accessing their own create.</w:t>
-      </w:r>
-    </w:p>
-    <w:p>
-      <w:pPr>
-        <w:pStyle w:val="Ttulo4"/>
-      </w:pPr>
-      <w:bookmarkStart w:id="25" w:name="_Toc199190130"/>
-      <w:r>
-        <w:t>Delete</w:t>
-      </w:r>
-      <w:bookmarkEnd w:id="25"/>
-    </w:p>
-    <w:p>
-      <w:r>
-        <w:t>For delete, I obtained 9</w:t>
-      </w:r>
-      <w:r>
-        <w:t>6</w:t>
-      </w:r>
-      <w:r>
-        <w:t xml:space="preserve">.9% coverage. The .safe tests verify deletion of an unpublished booking. The .hack tests cover access attempts by unauthenticated users, users with a different role, users with the same role but not the creator, and attempts to delete a published </w:t>
-      </w:r>
-      <w:r>
-        <w:t>passenger</w:t>
-      </w:r>
-      <w:r>
-        <w:t>.</w:t>
-      </w:r>
-    </w:p>
-    <w:p>
-      <w:pPr>
-        <w:pStyle w:val="Ttulo4"/>
-      </w:pPr>
-      <w:bookmarkStart w:id="26" w:name="_Toc199190131"/>
-      <w:r>
-        <w:t>Update</w:t>
-      </w:r>
-      <w:bookmarkEnd w:id="26"/>
-    </w:p>
-    <w:p>
-      <w:pPr>
-        <w:pStyle w:val="Ttulo4"/>
-        <w:rPr>
-          <w:rFonts w:eastAsiaTheme="minorEastAsia" w:cstheme="minorBidi"/>
-          <w:i w:val="0"/>
-          <w:iCs w:val="0"/>
-          <w:color w:val="auto"/>
-        </w:rPr>
-      </w:pPr>
-      <w:bookmarkStart w:id="27" w:name="_Toc199190132"/>
-      <w:r>
-        <w:rPr>
-          <w:rFonts w:eastAsiaTheme="minorEastAsia" w:cstheme="minorBidi"/>
-          <w:i w:val="0"/>
-          <w:iCs w:val="0"/>
-          <w:color w:val="auto"/>
-        </w:rPr>
-        <w:t>Here I achieved 9</w:t>
-      </w:r>
-      <w:r>
-        <w:rPr>
-          <w:rFonts w:eastAsiaTheme="minorEastAsia" w:cstheme="minorBidi"/>
-          <w:i w:val="0"/>
-          <w:iCs w:val="0"/>
-          <w:color w:val="auto"/>
-        </w:rPr>
-        <w:t>6</w:t>
-      </w:r>
-      <w:r>
-        <w:rPr>
-          <w:rFonts w:eastAsiaTheme="minorEastAsia" w:cstheme="minorBidi"/>
-          <w:i w:val="0"/>
-          <w:iCs w:val="0"/>
-          <w:color w:val="auto"/>
-        </w:rPr>
-        <w:t>.</w:t>
-      </w:r>
-      <w:r>
-        <w:rPr>
-          <w:rFonts w:eastAsiaTheme="minorEastAsia" w:cstheme="minorBidi"/>
-          <w:i w:val="0"/>
-          <w:iCs w:val="0"/>
-          <w:color w:val="auto"/>
-        </w:rPr>
-        <w:t>9</w:t>
-      </w:r>
-      <w:r>
-        <w:rPr>
-          <w:rFonts w:eastAsiaTheme="minorEastAsia" w:cstheme="minorBidi"/>
-          <w:i w:val="0"/>
-          <w:iCs w:val="0"/>
-          <w:color w:val="auto"/>
-        </w:rPr>
-        <w:t>% coverage. The .safe tests include multiple parameter combinations to trigger all validation paths. The .hack tests involve an authenticated user with a different role, an unauthenticated user, a user with the same role but not the creator, and a published booking.</w:t>
-      </w:r>
-      <w:bookmarkEnd w:id="27"/>
-      <w:r>
-        <w:rPr>
-          <w:rFonts w:eastAsiaTheme="minorEastAsia" w:cstheme="minorBidi"/>
-          <w:i w:val="0"/>
-          <w:iCs w:val="0"/>
-          <w:color w:val="auto"/>
-        </w:rPr>
-        <w:t xml:space="preserve"> </w:t>
-      </w:r>
-    </w:p>
-    <w:p/>
-    <w:p>
-      <w:pPr>
-        <w:pStyle w:val="Ttulo4"/>
-      </w:pPr>
-      <w:bookmarkStart w:id="28" w:name="_Toc199190133"/>
-      <w:r>
-        <w:t>Publish</w:t>
-      </w:r>
-      <w:bookmarkEnd w:id="28"/>
-    </w:p>
-    <w:p>
-      <w:pPr>
-        <w:pStyle w:val="Ttulo3"/>
-        <w:rPr>
-          <w:rFonts w:eastAsiaTheme="minorEastAsia" w:cstheme="minorBidi"/>
-          <w:color w:val="auto"/>
-          <w:sz w:val="24"/>
-          <w:szCs w:val="24"/>
-        </w:rPr>
-      </w:pPr>
-      <w:bookmarkStart w:id="29" w:name="_Toc199190134"/>
-      <w:r>
-        <w:rPr>
-          <w:rFonts w:eastAsiaTheme="minorEastAsia" w:cstheme="minorBidi"/>
-          <w:color w:val="auto"/>
-          <w:sz w:val="24"/>
-          <w:szCs w:val="24"/>
-        </w:rPr>
-        <w:t>I obtained 97.</w:t>
-      </w:r>
-      <w:r>
-        <w:rPr>
-          <w:rFonts w:eastAsiaTheme="minorEastAsia" w:cstheme="minorBidi"/>
-          <w:color w:val="auto"/>
-          <w:sz w:val="24"/>
-          <w:szCs w:val="24"/>
-        </w:rPr>
-        <w:t>0</w:t>
-      </w:r>
-      <w:r>
-        <w:rPr>
-          <w:rFonts w:eastAsiaTheme="minorEastAsia" w:cstheme="minorBidi"/>
-          <w:color w:val="auto"/>
-          <w:sz w:val="24"/>
-          <w:szCs w:val="24"/>
-        </w:rPr>
-        <w:t>% coverage for the publish operation. The .safe tests focus on different parameter combinations to validate all constraints. The .hack tests include access attempts by an authenticated user with a different role, an unauthenticated user, a user with the same role but not the creator, and a published booking.</w:t>
-      </w:r>
-      <w:bookmarkEnd w:id="29"/>
-      <w:r>
-        <w:rPr>
-          <w:rFonts w:eastAsiaTheme="minorEastAsia" w:cstheme="minorBidi"/>
-          <w:color w:val="auto"/>
-          <w:sz w:val="24"/>
-          <w:szCs w:val="24"/>
-        </w:rPr>
-        <w:t xml:space="preserve"> </w:t>
-      </w:r>
-    </w:p>
-    <w:p/>
-    <w:p>
-      <w:pPr>
-        <w:pStyle w:val="Ttulo2"/>
-        <w:numPr>
-          <w:ilvl w:val="0"/>
-          <w:numId w:val="6"/>
-        </w:numPr>
-      </w:pPr>
-      <w:bookmarkStart w:id="30" w:name="_Toc199190135"/>
-      <w:r>
-        <w:lastRenderedPageBreak/>
-        <w:t>Performance Test</w:t>
-      </w:r>
-      <w:bookmarkEnd w:id="30"/>
-    </w:p>
-    <w:p>
-      <w:r>
-        <w:t>The performance has been analyzed before and after the application of the indices, where we see a considerable improvement in performance.</w:t>
-      </w:r>
-    </w:p>
-    <w:p/>
-    <w:p>
-      <w:pPr>
-        <w:pStyle w:val="Ttulo3"/>
-        <w:rPr>
-          <w:b/>
-          <w:bCs/>
-          <w:u w:val="single"/>
-        </w:rPr>
-      </w:pPr>
-      <w:bookmarkStart w:id="31" w:name="_Toc199190136"/>
-      <w:r>
-        <w:rPr>
-          <w:b/>
-          <w:bCs/>
-          <w:u w:val="single"/>
-        </w:rPr>
-        <w:t>No Index</w:t>
-      </w:r>
-      <w:bookmarkEnd w:id="31"/>
-    </w:p>
-    <w:p/>
-    <w:p>
-      <w:r>
-        <w:rPr>
-          <w:noProof/>
-        </w:rPr>
+      <w:r>
         <w:drawing>
-          <wp:inline distT="0" distB="0" distL="0" distR="0" wp14:anchorId="49A3007D" wp14:editId="7F43445D">
-            <wp:extent cx="5943600" cy="2280920"/>
-            <wp:effectExtent l="0" t="0" r="0" b="5080"/>
-            <wp:docPr id="1334001486" name="Imagen 1" descr="Gráfico&#10;&#10;El contenido generado por IA puede ser incorrecto."/>
+          <wp:inline distT="0" distB="0" distL="0" distR="0" wp14:anchorId="1365FB9E" wp14:editId="279EDAB4">
+            <wp:extent cx="4163006" cy="1314633"/>
+            <wp:effectExtent l="0" t="0" r="9525" b="0"/>
+            <wp:docPr id="1839865235" name="Imagen 1" descr="Interfaz de usuario gráfica, Texto, Aplicación&#10;&#10;El contenido generado por IA puede ser incorrecto."/>
             <wp:cNvGraphicFramePr>
               <a:graphicFrameLocks xmlns:a="http://schemas.openxmlformats.org/drawingml/2006/main" noChangeAspect="1"/>
             </wp:cNvGraphicFramePr>
@@ -1905,7 +1190,7 @@
               <a:graphicData uri="http://schemas.openxmlformats.org/drawingml/2006/picture">
                 <pic:pic xmlns:pic="http://schemas.openxmlformats.org/drawingml/2006/picture">
                   <pic:nvPicPr>
-                    <pic:cNvPr id="1334001486" name="Imagen 1" descr="Gráfico&#10;&#10;El contenido generado por IA puede ser incorrecto."/>
+                    <pic:cNvPr id="1839865235" name="Imagen 1" descr="Interfaz de usuario gráfica, Texto, Aplicación&#10;&#10;El contenido generado por IA puede ser incorrecto."/>
                     <pic:cNvPicPr/>
                   </pic:nvPicPr>
                   <pic:blipFill>
@@ -1917,7 +1202,7 @@
                   <pic:spPr>
                     <a:xfrm>
                       <a:off x="0" y="0"/>
-                      <a:ext cx="5943600" cy="2280920"/>
+                      <a:ext cx="4163006" cy="1314633"/>
                     </a:xfrm>
                     <a:prstGeom prst="rect">
                       <a:avLst/>
@@ -1930,11 +1215,2056 @@
         </w:drawing>
       </w:r>
     </w:p>
+    <w:p/>
     <w:p>
-      <w:r>
-        <w:t>The graph allows us to intuitively observe that the average response time of the different instructions is more or less homogeneous, highlighting those operations that need to write to the database and therefore have a considerably longer time.</w:t>
-      </w:r>
+      <w:pPr>
+        <w:pStyle w:val="Ttulo4"/>
+      </w:pPr>
+      <w:bookmarkStart w:id="6" w:name="_Toc199190111"/>
+      <w:r>
+        <w:t>List</w:t>
+      </w:r>
+      <w:bookmarkEnd w:id="6"/>
     </w:p>
+    <w:p>
+      <w:r>
+        <w:t xml:space="preserve">The tests here were simple, so I achieved 100% coverage. I </w:t>
+      </w:r>
+      <w:proofErr w:type="gramStart"/>
+      <w:r>
+        <w:t>created .safe</w:t>
+      </w:r>
+      <w:proofErr w:type="gramEnd"/>
+      <w:r>
+        <w:t xml:space="preserve"> tests to access and view the listing, including pagination and related functionality. </w:t>
+      </w:r>
+      <w:proofErr w:type="gramStart"/>
+      <w:r>
+        <w:t>The .hack</w:t>
+      </w:r>
+      <w:proofErr w:type="gramEnd"/>
+      <w:r>
+        <w:t xml:space="preserve"> tests simulate access attempts by users with different roles, unauthenticated users, and users with the same role accessing their own list.</w:t>
+      </w:r>
+    </w:p>
+    <w:p>
+      <w:pPr>
+        <w:pStyle w:val="Ttulo4"/>
+      </w:pPr>
+      <w:bookmarkStart w:id="7" w:name="_Toc199190112"/>
+      <w:r>
+        <w:t>Show</w:t>
+      </w:r>
+      <w:bookmarkEnd w:id="7"/>
+    </w:p>
+    <w:p>
+      <w:pPr>
+        <w:pStyle w:val="Ttulo4"/>
+        <w:rPr>
+          <w:rFonts w:eastAsiaTheme="minorEastAsia" w:cstheme="minorBidi"/>
+          <w:i w:val="0"/>
+          <w:iCs w:val="0"/>
+          <w:color w:val="auto"/>
+        </w:rPr>
+      </w:pPr>
+      <w:bookmarkStart w:id="8" w:name="_Toc199190113"/>
+      <w:r>
+        <w:rPr>
+          <w:rFonts w:eastAsiaTheme="minorEastAsia" w:cstheme="minorBidi"/>
+          <w:i w:val="0"/>
+          <w:iCs w:val="0"/>
+          <w:color w:val="auto"/>
+        </w:rPr>
+        <w:t xml:space="preserve">I also achieved 100% coverage here. </w:t>
+      </w:r>
+      <w:proofErr w:type="gramStart"/>
+      <w:r>
+        <w:rPr>
+          <w:rFonts w:eastAsiaTheme="minorEastAsia" w:cstheme="minorBidi"/>
+          <w:i w:val="0"/>
+          <w:iCs w:val="0"/>
+          <w:color w:val="auto"/>
+        </w:rPr>
+        <w:t>The .safe</w:t>
+      </w:r>
+      <w:proofErr w:type="gramEnd"/>
+      <w:r>
+        <w:rPr>
+          <w:rFonts w:eastAsiaTheme="minorEastAsia" w:cstheme="minorBidi"/>
+          <w:i w:val="0"/>
+          <w:iCs w:val="0"/>
+          <w:color w:val="auto"/>
+        </w:rPr>
+        <w:t xml:space="preserve"> tests check access to both published and unpublished bookings. </w:t>
+      </w:r>
+      <w:proofErr w:type="gramStart"/>
+      <w:r>
+        <w:rPr>
+          <w:rFonts w:eastAsiaTheme="minorEastAsia" w:cstheme="minorBidi"/>
+          <w:i w:val="0"/>
+          <w:iCs w:val="0"/>
+          <w:color w:val="auto"/>
+        </w:rPr>
+        <w:t>The .hack</w:t>
+      </w:r>
+      <w:proofErr w:type="gramEnd"/>
+      <w:r>
+        <w:rPr>
+          <w:rFonts w:eastAsiaTheme="minorEastAsia" w:cstheme="minorBidi"/>
+          <w:i w:val="0"/>
+          <w:iCs w:val="0"/>
+          <w:color w:val="auto"/>
+        </w:rPr>
+        <w:t xml:space="preserve"> tests include attempts by users with different roles, unauthenticated users, users with the same role but not the creator, </w:t>
+      </w:r>
+      <w:proofErr w:type="gramStart"/>
+      <w:r>
+        <w:rPr>
+          <w:rFonts w:eastAsiaTheme="minorEastAsia" w:cstheme="minorBidi"/>
+          <w:i w:val="0"/>
+          <w:iCs w:val="0"/>
+          <w:color w:val="auto"/>
+        </w:rPr>
+        <w:t>and also</w:t>
+      </w:r>
+      <w:proofErr w:type="gramEnd"/>
+      <w:r>
+        <w:rPr>
+          <w:rFonts w:eastAsiaTheme="minorEastAsia" w:cstheme="minorBidi"/>
+          <w:i w:val="0"/>
+          <w:iCs w:val="0"/>
+          <w:color w:val="auto"/>
+        </w:rPr>
+        <w:t xml:space="preserve"> attempts to access a null booking. All cases were tested for both published and unpublished bookings.</w:t>
+      </w:r>
+      <w:bookmarkEnd w:id="8"/>
+    </w:p>
+    <w:p>
+      <w:pPr>
+        <w:pStyle w:val="Ttulo4"/>
+      </w:pPr>
+      <w:bookmarkStart w:id="9" w:name="_Toc199190114"/>
+      <w:r>
+        <w:t>Create</w:t>
+      </w:r>
+      <w:bookmarkEnd w:id="9"/>
+    </w:p>
+    <w:p>
+      <w:r>
+        <w:t xml:space="preserve">Here I reached 98% coverage. </w:t>
+      </w:r>
+      <w:proofErr w:type="gramStart"/>
+      <w:r>
+        <w:t>The .safe</w:t>
+      </w:r>
+      <w:proofErr w:type="gramEnd"/>
+      <w:r>
+        <w:t xml:space="preserve"> tests involve executing the operation with different parameters to validate all types of constraints. </w:t>
+      </w:r>
+      <w:proofErr w:type="gramStart"/>
+      <w:r>
+        <w:t>The .hack</w:t>
+      </w:r>
+      <w:proofErr w:type="gramEnd"/>
+      <w:r>
+        <w:t xml:space="preserve"> tests simulate a </w:t>
+      </w:r>
+      <w:proofErr w:type="gramStart"/>
+      <w:r>
+        <w:t>create</w:t>
+      </w:r>
+      <w:proofErr w:type="gramEnd"/>
+      <w:r>
+        <w:t xml:space="preserve"> attempt by a user with a different role, an unauthenticated user, and a user with the same role accessing their own </w:t>
+      </w:r>
+      <w:proofErr w:type="gramStart"/>
+      <w:r>
+        <w:t>create</w:t>
+      </w:r>
+      <w:proofErr w:type="gramEnd"/>
+      <w:r>
+        <w:t>. I also tested possible client-side manipulations via F12 by tampering with flight-related data.</w:t>
+      </w:r>
+    </w:p>
+    <w:p>
+      <w:pPr>
+        <w:pStyle w:val="Ttulo4"/>
+      </w:pPr>
+      <w:bookmarkStart w:id="10" w:name="_Toc199190115"/>
+      <w:r>
+        <w:t>Delete</w:t>
+      </w:r>
+      <w:bookmarkEnd w:id="10"/>
+    </w:p>
+    <w:p>
+      <w:r>
+        <w:t xml:space="preserve">For delete, I obtained 97.9% coverage. </w:t>
+      </w:r>
+      <w:proofErr w:type="gramStart"/>
+      <w:r>
+        <w:t>The .safe</w:t>
+      </w:r>
+      <w:proofErr w:type="gramEnd"/>
+      <w:r>
+        <w:t xml:space="preserve"> tests verify </w:t>
+      </w:r>
+      <w:proofErr w:type="gramStart"/>
+      <w:r>
+        <w:t>deletion</w:t>
+      </w:r>
+      <w:proofErr w:type="gramEnd"/>
+      <w:r>
+        <w:t xml:space="preserve"> of an unpublished booking. </w:t>
+      </w:r>
+      <w:proofErr w:type="gramStart"/>
+      <w:r>
+        <w:t>The .hack</w:t>
+      </w:r>
+      <w:proofErr w:type="gramEnd"/>
+      <w:r>
+        <w:t xml:space="preserve"> tests cover access attempts by unauthenticated users, users with a different role, users with the same role but not the creator, and </w:t>
+      </w:r>
+      <w:proofErr w:type="gramStart"/>
+      <w:r>
+        <w:t>attempts</w:t>
+      </w:r>
+      <w:proofErr w:type="gramEnd"/>
+      <w:r>
+        <w:t xml:space="preserve"> to delete a published booking.</w:t>
+      </w:r>
+    </w:p>
+    <w:p>
+      <w:pPr>
+        <w:pStyle w:val="Ttulo4"/>
+      </w:pPr>
+      <w:bookmarkStart w:id="11" w:name="_Toc199190116"/>
+      <w:r>
+        <w:lastRenderedPageBreak/>
+        <w:t>Update</w:t>
+      </w:r>
+      <w:bookmarkEnd w:id="11"/>
+    </w:p>
+    <w:p>
+      <w:pPr>
+        <w:pStyle w:val="Ttulo4"/>
+        <w:rPr>
+          <w:rFonts w:eastAsiaTheme="minorEastAsia" w:cstheme="minorBidi"/>
+          <w:i w:val="0"/>
+          <w:iCs w:val="0"/>
+          <w:color w:val="auto"/>
+        </w:rPr>
+      </w:pPr>
+      <w:bookmarkStart w:id="12" w:name="_Toc199190117"/>
+      <w:r>
+        <w:rPr>
+          <w:rFonts w:eastAsiaTheme="minorEastAsia" w:cstheme="minorBidi"/>
+          <w:i w:val="0"/>
+          <w:iCs w:val="0"/>
+          <w:color w:val="auto"/>
+        </w:rPr>
+        <w:t xml:space="preserve">Here I achieved 97.3% coverage. </w:t>
+      </w:r>
+      <w:proofErr w:type="gramStart"/>
+      <w:r>
+        <w:rPr>
+          <w:rFonts w:eastAsiaTheme="minorEastAsia" w:cstheme="minorBidi"/>
+          <w:i w:val="0"/>
+          <w:iCs w:val="0"/>
+          <w:color w:val="auto"/>
+        </w:rPr>
+        <w:t>The .safe</w:t>
+      </w:r>
+      <w:proofErr w:type="gramEnd"/>
+      <w:r>
+        <w:rPr>
+          <w:rFonts w:eastAsiaTheme="minorEastAsia" w:cstheme="minorBidi"/>
+          <w:i w:val="0"/>
+          <w:iCs w:val="0"/>
+          <w:color w:val="auto"/>
+        </w:rPr>
+        <w:t xml:space="preserve"> tests include multiple parameter combinations to trigger all validation paths. </w:t>
+      </w:r>
+      <w:proofErr w:type="gramStart"/>
+      <w:r>
+        <w:rPr>
+          <w:rFonts w:eastAsiaTheme="minorEastAsia" w:cstheme="minorBidi"/>
+          <w:i w:val="0"/>
+          <w:iCs w:val="0"/>
+          <w:color w:val="auto"/>
+        </w:rPr>
+        <w:t>The .hack</w:t>
+      </w:r>
+      <w:proofErr w:type="gramEnd"/>
+      <w:r>
+        <w:rPr>
+          <w:rFonts w:eastAsiaTheme="minorEastAsia" w:cstheme="minorBidi"/>
+          <w:i w:val="0"/>
+          <w:iCs w:val="0"/>
+          <w:color w:val="auto"/>
+        </w:rPr>
+        <w:t xml:space="preserve"> tests involve an authenticated user with a different role, an unauthenticated user, a user with the same role but not the creator, and a published booking. Some conditional branches (if statements) couldn’t be fully covered, but I believe they are necessary and justified.</w:t>
+      </w:r>
+      <w:bookmarkEnd w:id="12"/>
+    </w:p>
+    <w:p>
+      <w:r>
+        <w:t xml:space="preserve">I also tested by manipulating the fields using F12, altering the Flight field (with an unpublished flight, a null value, and a flight that has already taken place) and the </w:t>
+      </w:r>
+      <w:proofErr w:type="spellStart"/>
+      <w:r>
+        <w:t>PurchaseMoment</w:t>
+      </w:r>
+      <w:proofErr w:type="spellEnd"/>
+      <w:r>
+        <w:t>, to verify that no uncontrolled actions are performed.</w:t>
+      </w:r>
+    </w:p>
+    <w:p>
+      <w:pPr>
+        <w:pStyle w:val="Ttulo4"/>
+      </w:pPr>
+      <w:bookmarkStart w:id="13" w:name="_Toc199190118"/>
+      <w:r>
+        <w:t>Publish</w:t>
+      </w:r>
+      <w:bookmarkEnd w:id="13"/>
+    </w:p>
+    <w:p>
+      <w:pPr>
+        <w:pStyle w:val="Ttulo3"/>
+        <w:rPr>
+          <w:rFonts w:eastAsiaTheme="minorEastAsia" w:cstheme="minorBidi"/>
+          <w:color w:val="auto"/>
+          <w:sz w:val="24"/>
+          <w:szCs w:val="24"/>
+        </w:rPr>
+      </w:pPr>
+      <w:bookmarkStart w:id="14" w:name="_Toc199190119"/>
+      <w:r>
+        <w:rPr>
+          <w:rFonts w:eastAsiaTheme="minorEastAsia" w:cstheme="minorBidi"/>
+          <w:color w:val="auto"/>
+          <w:sz w:val="24"/>
+          <w:szCs w:val="24"/>
+        </w:rPr>
+        <w:t xml:space="preserve">I obtained 97.6% coverage for the </w:t>
+      </w:r>
+      <w:proofErr w:type="gramStart"/>
+      <w:r>
+        <w:rPr>
+          <w:rFonts w:eastAsiaTheme="minorEastAsia" w:cstheme="minorBidi"/>
+          <w:color w:val="auto"/>
+          <w:sz w:val="24"/>
+          <w:szCs w:val="24"/>
+        </w:rPr>
+        <w:t>publish</w:t>
+      </w:r>
+      <w:proofErr w:type="gramEnd"/>
+      <w:r>
+        <w:rPr>
+          <w:rFonts w:eastAsiaTheme="minorEastAsia" w:cstheme="minorBidi"/>
+          <w:color w:val="auto"/>
+          <w:sz w:val="24"/>
+          <w:szCs w:val="24"/>
+        </w:rPr>
+        <w:t xml:space="preserve"> operation. </w:t>
+      </w:r>
+      <w:proofErr w:type="gramStart"/>
+      <w:r>
+        <w:rPr>
+          <w:rFonts w:eastAsiaTheme="minorEastAsia" w:cstheme="minorBidi"/>
+          <w:color w:val="auto"/>
+          <w:sz w:val="24"/>
+          <w:szCs w:val="24"/>
+        </w:rPr>
+        <w:t>The .safe</w:t>
+      </w:r>
+      <w:proofErr w:type="gramEnd"/>
+      <w:r>
+        <w:rPr>
+          <w:rFonts w:eastAsiaTheme="minorEastAsia" w:cstheme="minorBidi"/>
+          <w:color w:val="auto"/>
+          <w:sz w:val="24"/>
+          <w:szCs w:val="24"/>
+        </w:rPr>
+        <w:t xml:space="preserve"> tests focus on different parameter combinations to validate all constraints. </w:t>
+      </w:r>
+      <w:proofErr w:type="gramStart"/>
+      <w:r>
+        <w:rPr>
+          <w:rFonts w:eastAsiaTheme="minorEastAsia" w:cstheme="minorBidi"/>
+          <w:color w:val="auto"/>
+          <w:sz w:val="24"/>
+          <w:szCs w:val="24"/>
+        </w:rPr>
+        <w:t>The .hack</w:t>
+      </w:r>
+      <w:proofErr w:type="gramEnd"/>
+      <w:r>
+        <w:rPr>
+          <w:rFonts w:eastAsiaTheme="minorEastAsia" w:cstheme="minorBidi"/>
+          <w:color w:val="auto"/>
+          <w:sz w:val="24"/>
+          <w:szCs w:val="24"/>
+        </w:rPr>
+        <w:t xml:space="preserve"> tests include access attempts by an authenticated user with a different role, an unauthenticated user, a user with the same role but not the creator, and a published booking. As with update, there are some conditional clauses I couldn’t fully cover, but I consider them necessary for security and consistency.</w:t>
+      </w:r>
+      <w:bookmarkEnd w:id="14"/>
+    </w:p>
+    <w:p>
+      <w:r>
+        <w:t xml:space="preserve">I also tested by manipulating the fields using F12, altering the Flight field (with an unpublished flight, a null value, and a flight that has already taken place) and the </w:t>
+      </w:r>
+      <w:proofErr w:type="spellStart"/>
+      <w:r>
+        <w:t>PurchaseMoment</w:t>
+      </w:r>
+      <w:proofErr w:type="spellEnd"/>
+      <w:r>
+        <w:t>, to verify that no uncontrolled actions are performed.</w:t>
+      </w:r>
+    </w:p>
+    <w:p/>
+    <w:p>
+      <w:pPr>
+        <w:rPr>
+          <w:lang w:val="es-ES"/>
+        </w:rPr>
+      </w:pPr>
+      <w:r>
+        <w:rPr>
+          <w:lang w:val="es-ES"/>
+        </w:rPr>
+        <w:t xml:space="preserve">In </w:t>
+      </w:r>
+      <w:proofErr w:type="spellStart"/>
+      <w:r>
+        <w:rPr>
+          <w:lang w:val="es-ES"/>
+        </w:rPr>
+        <w:t>both</w:t>
+      </w:r>
+      <w:proofErr w:type="spellEnd"/>
+      <w:r>
+        <w:rPr>
+          <w:lang w:val="es-ES"/>
+        </w:rPr>
+        <w:t xml:space="preserve"> </w:t>
+      </w:r>
+      <w:proofErr w:type="spellStart"/>
+      <w:r>
+        <w:rPr>
+          <w:lang w:val="es-ES"/>
+        </w:rPr>
+        <w:t>the</w:t>
+      </w:r>
+      <w:proofErr w:type="spellEnd"/>
+      <w:r>
+        <w:rPr>
+          <w:lang w:val="es-ES"/>
+        </w:rPr>
+        <w:t xml:space="preserve"> </w:t>
+      </w:r>
+      <w:proofErr w:type="spellStart"/>
+      <w:r>
+        <w:rPr>
+          <w:b/>
+          <w:bCs/>
+          <w:lang w:val="es-ES"/>
+        </w:rPr>
+        <w:t>Update</w:t>
+      </w:r>
+      <w:proofErr w:type="spellEnd"/>
+      <w:r>
+        <w:rPr>
+          <w:lang w:val="es-ES"/>
+        </w:rPr>
+        <w:t xml:space="preserve"> and </w:t>
+      </w:r>
+      <w:proofErr w:type="spellStart"/>
+      <w:r>
+        <w:rPr>
+          <w:b/>
+          <w:bCs/>
+          <w:lang w:val="es-ES"/>
+        </w:rPr>
+        <w:t>Publish</w:t>
+      </w:r>
+      <w:proofErr w:type="spellEnd"/>
+      <w:r>
+        <w:rPr>
+          <w:lang w:val="es-ES"/>
+        </w:rPr>
+        <w:t xml:space="preserve"> </w:t>
+      </w:r>
+      <w:proofErr w:type="spellStart"/>
+      <w:r>
+        <w:rPr>
+          <w:lang w:val="es-ES"/>
+        </w:rPr>
+        <w:t>operations</w:t>
+      </w:r>
+      <w:proofErr w:type="spellEnd"/>
+      <w:r>
+        <w:rPr>
+          <w:lang w:val="es-ES"/>
+        </w:rPr>
+        <w:t xml:space="preserve">, </w:t>
+      </w:r>
+      <w:proofErr w:type="spellStart"/>
+      <w:r>
+        <w:rPr>
+          <w:lang w:val="es-ES"/>
+        </w:rPr>
+        <w:t>it</w:t>
+      </w:r>
+      <w:proofErr w:type="spellEnd"/>
+      <w:r>
+        <w:rPr>
+          <w:lang w:val="es-ES"/>
+        </w:rPr>
+        <w:t xml:space="preserve"> </w:t>
+      </w:r>
+      <w:proofErr w:type="spellStart"/>
+      <w:r>
+        <w:rPr>
+          <w:lang w:val="es-ES"/>
+        </w:rPr>
+        <w:t>is</w:t>
+      </w:r>
+      <w:proofErr w:type="spellEnd"/>
+      <w:r>
+        <w:rPr>
+          <w:lang w:val="es-ES"/>
+        </w:rPr>
+        <w:t xml:space="preserve"> </w:t>
+      </w:r>
+      <w:proofErr w:type="spellStart"/>
+      <w:r>
+        <w:rPr>
+          <w:lang w:val="es-ES"/>
+        </w:rPr>
+        <w:t>possible</w:t>
+      </w:r>
+      <w:proofErr w:type="spellEnd"/>
+      <w:r>
+        <w:rPr>
+          <w:lang w:val="es-ES"/>
+        </w:rPr>
+        <w:t xml:space="preserve"> </w:t>
+      </w:r>
+      <w:proofErr w:type="spellStart"/>
+      <w:r>
+        <w:rPr>
+          <w:lang w:val="es-ES"/>
+        </w:rPr>
+        <w:t>to</w:t>
+      </w:r>
+      <w:proofErr w:type="spellEnd"/>
+      <w:r>
+        <w:rPr>
+          <w:lang w:val="es-ES"/>
+        </w:rPr>
+        <w:t xml:space="preserve"> </w:t>
+      </w:r>
+      <w:proofErr w:type="spellStart"/>
+      <w:r>
+        <w:rPr>
+          <w:lang w:val="es-ES"/>
+        </w:rPr>
+        <w:t>modify</w:t>
+      </w:r>
+      <w:proofErr w:type="spellEnd"/>
+      <w:r>
+        <w:rPr>
+          <w:lang w:val="es-ES"/>
+        </w:rPr>
+        <w:t xml:space="preserve"> </w:t>
+      </w:r>
+      <w:proofErr w:type="spellStart"/>
+      <w:r>
+        <w:rPr>
+          <w:lang w:val="es-ES"/>
+        </w:rPr>
+        <w:t>the</w:t>
+      </w:r>
+      <w:proofErr w:type="spellEnd"/>
+      <w:r>
+        <w:rPr>
+          <w:lang w:val="es-ES"/>
+        </w:rPr>
+        <w:t xml:space="preserve"> </w:t>
+      </w:r>
+      <w:proofErr w:type="spellStart"/>
+      <w:r>
+        <w:rPr>
+          <w:lang w:val="es-ES"/>
+        </w:rPr>
+        <w:t>price</w:t>
+      </w:r>
+      <w:proofErr w:type="spellEnd"/>
+      <w:r>
+        <w:rPr>
+          <w:lang w:val="es-ES"/>
+        </w:rPr>
+        <w:t xml:space="preserve"> </w:t>
+      </w:r>
+      <w:proofErr w:type="spellStart"/>
+      <w:r>
+        <w:rPr>
+          <w:lang w:val="es-ES"/>
+        </w:rPr>
+        <w:t>field</w:t>
+      </w:r>
+      <w:proofErr w:type="spellEnd"/>
+      <w:r>
+        <w:rPr>
+          <w:lang w:val="es-ES"/>
+        </w:rPr>
+        <w:t xml:space="preserve"> </w:t>
+      </w:r>
+      <w:proofErr w:type="spellStart"/>
+      <w:r>
+        <w:rPr>
+          <w:lang w:val="es-ES"/>
+        </w:rPr>
+        <w:t>via</w:t>
+      </w:r>
+      <w:proofErr w:type="spellEnd"/>
+      <w:r>
+        <w:rPr>
+          <w:lang w:val="es-ES"/>
+        </w:rPr>
+        <w:t xml:space="preserve"> </w:t>
+      </w:r>
+      <w:proofErr w:type="spellStart"/>
+      <w:r>
+        <w:rPr>
+          <w:lang w:val="es-ES"/>
+        </w:rPr>
+        <w:t>the</w:t>
+      </w:r>
+      <w:proofErr w:type="spellEnd"/>
+      <w:r>
+        <w:rPr>
+          <w:lang w:val="es-ES"/>
+        </w:rPr>
+        <w:t xml:space="preserve"> </w:t>
+      </w:r>
+      <w:proofErr w:type="spellStart"/>
+      <w:r>
+        <w:rPr>
+          <w:lang w:val="es-ES"/>
+        </w:rPr>
+        <w:t>browser’s</w:t>
+      </w:r>
+      <w:proofErr w:type="spellEnd"/>
+      <w:r>
+        <w:rPr>
+          <w:lang w:val="es-ES"/>
+        </w:rPr>
+        <w:t xml:space="preserve"> </w:t>
+      </w:r>
+      <w:proofErr w:type="spellStart"/>
+      <w:r>
+        <w:rPr>
+          <w:lang w:val="es-ES"/>
+        </w:rPr>
+        <w:t>developer</w:t>
+      </w:r>
+      <w:proofErr w:type="spellEnd"/>
+      <w:r>
+        <w:rPr>
+          <w:lang w:val="es-ES"/>
+        </w:rPr>
+        <w:t xml:space="preserve"> </w:t>
+      </w:r>
+      <w:proofErr w:type="spellStart"/>
+      <w:r>
+        <w:rPr>
+          <w:lang w:val="es-ES"/>
+        </w:rPr>
+        <w:t>tools</w:t>
+      </w:r>
+      <w:proofErr w:type="spellEnd"/>
+      <w:r>
+        <w:rPr>
+          <w:lang w:val="es-ES"/>
+        </w:rPr>
+        <w:t xml:space="preserve"> (F12) and </w:t>
+      </w:r>
+      <w:proofErr w:type="spellStart"/>
+      <w:r>
+        <w:rPr>
+          <w:lang w:val="es-ES"/>
+        </w:rPr>
+        <w:t>submit</w:t>
+      </w:r>
+      <w:proofErr w:type="spellEnd"/>
+      <w:r>
+        <w:rPr>
+          <w:lang w:val="es-ES"/>
+        </w:rPr>
+        <w:t xml:space="preserve"> </w:t>
+      </w:r>
+      <w:proofErr w:type="spellStart"/>
+      <w:r>
+        <w:rPr>
+          <w:lang w:val="es-ES"/>
+        </w:rPr>
+        <w:t>the</w:t>
+      </w:r>
+      <w:proofErr w:type="spellEnd"/>
+      <w:r>
+        <w:rPr>
+          <w:lang w:val="es-ES"/>
+        </w:rPr>
+        <w:t xml:space="preserve"> </w:t>
+      </w:r>
+      <w:proofErr w:type="spellStart"/>
+      <w:r>
+        <w:rPr>
+          <w:lang w:val="es-ES"/>
+        </w:rPr>
+        <w:t>form</w:t>
+      </w:r>
+      <w:proofErr w:type="spellEnd"/>
+      <w:r>
+        <w:rPr>
+          <w:lang w:val="es-ES"/>
+        </w:rPr>
+        <w:t xml:space="preserve"> </w:t>
+      </w:r>
+      <w:proofErr w:type="spellStart"/>
+      <w:r>
+        <w:rPr>
+          <w:lang w:val="es-ES"/>
+        </w:rPr>
+        <w:t>without</w:t>
+      </w:r>
+      <w:proofErr w:type="spellEnd"/>
+      <w:r>
+        <w:rPr>
+          <w:lang w:val="es-ES"/>
+        </w:rPr>
+        <w:t xml:space="preserve"> </w:t>
+      </w:r>
+      <w:proofErr w:type="spellStart"/>
+      <w:r>
+        <w:rPr>
+          <w:lang w:val="es-ES"/>
+        </w:rPr>
+        <w:t>triggering</w:t>
+      </w:r>
+      <w:proofErr w:type="spellEnd"/>
+      <w:r>
+        <w:rPr>
+          <w:lang w:val="es-ES"/>
+        </w:rPr>
+        <w:t xml:space="preserve"> </w:t>
+      </w:r>
+      <w:proofErr w:type="spellStart"/>
+      <w:proofErr w:type="gramStart"/>
+      <w:r>
+        <w:rPr>
+          <w:lang w:val="es-ES"/>
+        </w:rPr>
+        <w:t>an</w:t>
+      </w:r>
+      <w:proofErr w:type="spellEnd"/>
+      <w:r>
+        <w:rPr>
+          <w:lang w:val="es-ES"/>
+        </w:rPr>
+        <w:t xml:space="preserve"> error</w:t>
+      </w:r>
+      <w:proofErr w:type="gramEnd"/>
+      <w:r>
+        <w:rPr>
+          <w:lang w:val="es-ES"/>
+        </w:rPr>
+        <w:t xml:space="preserve"> — </w:t>
+      </w:r>
+      <w:proofErr w:type="spellStart"/>
+      <w:r>
+        <w:rPr>
+          <w:lang w:val="es-ES"/>
+        </w:rPr>
+        <w:t>although</w:t>
+      </w:r>
+      <w:proofErr w:type="spellEnd"/>
+      <w:r>
+        <w:rPr>
+          <w:lang w:val="es-ES"/>
+        </w:rPr>
+        <w:t xml:space="preserve"> </w:t>
+      </w:r>
+      <w:proofErr w:type="spellStart"/>
+      <w:r>
+        <w:rPr>
+          <w:lang w:val="es-ES"/>
+        </w:rPr>
+        <w:t>the</w:t>
+      </w:r>
+      <w:proofErr w:type="spellEnd"/>
+      <w:r>
+        <w:rPr>
+          <w:lang w:val="es-ES"/>
+        </w:rPr>
+        <w:t xml:space="preserve"> </w:t>
+      </w:r>
+      <w:proofErr w:type="spellStart"/>
+      <w:r>
+        <w:rPr>
+          <w:lang w:val="es-ES"/>
+        </w:rPr>
+        <w:t>value</w:t>
+      </w:r>
+      <w:proofErr w:type="spellEnd"/>
+      <w:r>
+        <w:rPr>
+          <w:lang w:val="es-ES"/>
+        </w:rPr>
+        <w:t xml:space="preserve"> </w:t>
+      </w:r>
+      <w:proofErr w:type="spellStart"/>
+      <w:r>
+        <w:rPr>
+          <w:lang w:val="es-ES"/>
+        </w:rPr>
+        <w:t>is</w:t>
+      </w:r>
+      <w:proofErr w:type="spellEnd"/>
+      <w:r>
+        <w:rPr>
+          <w:lang w:val="es-ES"/>
+        </w:rPr>
+        <w:t xml:space="preserve"> </w:t>
+      </w:r>
+      <w:proofErr w:type="spellStart"/>
+      <w:r>
+        <w:rPr>
+          <w:lang w:val="es-ES"/>
+        </w:rPr>
+        <w:t>not</w:t>
+      </w:r>
+      <w:proofErr w:type="spellEnd"/>
+      <w:r>
+        <w:rPr>
+          <w:lang w:val="es-ES"/>
+        </w:rPr>
+        <w:t xml:space="preserve"> </w:t>
+      </w:r>
+      <w:proofErr w:type="spellStart"/>
+      <w:r>
+        <w:rPr>
+          <w:lang w:val="es-ES"/>
+        </w:rPr>
+        <w:t>actually</w:t>
+      </w:r>
+      <w:proofErr w:type="spellEnd"/>
+      <w:r>
+        <w:rPr>
+          <w:lang w:val="es-ES"/>
+        </w:rPr>
+        <w:t xml:space="preserve"> </w:t>
+      </w:r>
+      <w:proofErr w:type="spellStart"/>
+      <w:r>
+        <w:rPr>
+          <w:lang w:val="es-ES"/>
+        </w:rPr>
+        <w:t>updated</w:t>
+      </w:r>
+      <w:proofErr w:type="spellEnd"/>
+      <w:r>
+        <w:rPr>
+          <w:lang w:val="es-ES"/>
+        </w:rPr>
+        <w:t xml:space="preserve">. </w:t>
+      </w:r>
+      <w:proofErr w:type="spellStart"/>
+      <w:r>
+        <w:rPr>
+          <w:lang w:val="es-ES"/>
+        </w:rPr>
+        <w:t>Initially</w:t>
+      </w:r>
+      <w:proofErr w:type="spellEnd"/>
+      <w:r>
+        <w:rPr>
+          <w:lang w:val="es-ES"/>
+        </w:rPr>
+        <w:t xml:space="preserve">, I </w:t>
+      </w:r>
+      <w:proofErr w:type="spellStart"/>
+      <w:r>
+        <w:rPr>
+          <w:lang w:val="es-ES"/>
+        </w:rPr>
+        <w:t>had</w:t>
+      </w:r>
+      <w:proofErr w:type="spellEnd"/>
+      <w:r>
+        <w:rPr>
+          <w:lang w:val="es-ES"/>
+        </w:rPr>
+        <w:t xml:space="preserve"> </w:t>
+      </w:r>
+      <w:proofErr w:type="spellStart"/>
+      <w:r>
+        <w:rPr>
+          <w:lang w:val="es-ES"/>
+        </w:rPr>
+        <w:t>designed</w:t>
+      </w:r>
+      <w:proofErr w:type="spellEnd"/>
+      <w:r>
+        <w:rPr>
+          <w:lang w:val="es-ES"/>
+        </w:rPr>
+        <w:t xml:space="preserve"> </w:t>
+      </w:r>
+      <w:proofErr w:type="spellStart"/>
+      <w:r>
+        <w:rPr>
+          <w:lang w:val="es-ES"/>
+        </w:rPr>
+        <w:t>the</w:t>
+      </w:r>
+      <w:proofErr w:type="spellEnd"/>
+      <w:r>
+        <w:rPr>
+          <w:lang w:val="es-ES"/>
+        </w:rPr>
+        <w:t xml:space="preserve"> </w:t>
+      </w:r>
+      <w:proofErr w:type="spellStart"/>
+      <w:r>
+        <w:rPr>
+          <w:lang w:val="es-ES"/>
+        </w:rPr>
+        <w:t>system</w:t>
+      </w:r>
+      <w:proofErr w:type="spellEnd"/>
+      <w:r>
+        <w:rPr>
+          <w:lang w:val="es-ES"/>
+        </w:rPr>
+        <w:t xml:space="preserve"> </w:t>
+      </w:r>
+      <w:proofErr w:type="spellStart"/>
+      <w:r>
+        <w:rPr>
+          <w:lang w:val="es-ES"/>
+        </w:rPr>
+        <w:t>to</w:t>
+      </w:r>
+      <w:proofErr w:type="spellEnd"/>
+      <w:r>
+        <w:rPr>
+          <w:lang w:val="es-ES"/>
+        </w:rPr>
+        <w:t xml:space="preserve"> </w:t>
+      </w:r>
+      <w:proofErr w:type="spellStart"/>
+      <w:r>
+        <w:rPr>
+          <w:lang w:val="es-ES"/>
+        </w:rPr>
+        <w:t>throw</w:t>
+      </w:r>
+      <w:proofErr w:type="spellEnd"/>
+      <w:r>
+        <w:rPr>
+          <w:lang w:val="es-ES"/>
+        </w:rPr>
+        <w:t xml:space="preserve"> </w:t>
+      </w:r>
+      <w:proofErr w:type="spellStart"/>
+      <w:r>
+        <w:rPr>
+          <w:lang w:val="es-ES"/>
+        </w:rPr>
+        <w:t>an</w:t>
+      </w:r>
+      <w:proofErr w:type="spellEnd"/>
+      <w:r>
+        <w:rPr>
+          <w:lang w:val="es-ES"/>
+        </w:rPr>
+        <w:t xml:space="preserve"> </w:t>
+      </w:r>
+      <w:proofErr w:type="spellStart"/>
+      <w:r>
+        <w:rPr>
+          <w:i/>
+          <w:iCs/>
+          <w:lang w:val="es-ES"/>
+        </w:rPr>
+        <w:t>unauthorised</w:t>
+      </w:r>
+      <w:proofErr w:type="spellEnd"/>
+      <w:r>
+        <w:rPr>
+          <w:lang w:val="es-ES"/>
+        </w:rPr>
+        <w:t xml:space="preserve"> error in </w:t>
+      </w:r>
+      <w:proofErr w:type="spellStart"/>
+      <w:r>
+        <w:rPr>
+          <w:lang w:val="es-ES"/>
+        </w:rPr>
+        <w:t>such</w:t>
+      </w:r>
+      <w:proofErr w:type="spellEnd"/>
+      <w:r>
+        <w:rPr>
+          <w:lang w:val="es-ES"/>
+        </w:rPr>
+        <w:t xml:space="preserve"> cases, </w:t>
+      </w:r>
+      <w:proofErr w:type="spellStart"/>
+      <w:r>
+        <w:rPr>
+          <w:lang w:val="es-ES"/>
+        </w:rPr>
+        <w:t>to</w:t>
+      </w:r>
+      <w:proofErr w:type="spellEnd"/>
+      <w:r>
+        <w:rPr>
+          <w:lang w:val="es-ES"/>
+        </w:rPr>
+        <w:t xml:space="preserve"> </w:t>
+      </w:r>
+      <w:proofErr w:type="spellStart"/>
+      <w:r>
+        <w:rPr>
+          <w:lang w:val="es-ES"/>
+        </w:rPr>
+        <w:t>detect</w:t>
+      </w:r>
+      <w:proofErr w:type="spellEnd"/>
+      <w:r>
+        <w:rPr>
+          <w:lang w:val="es-ES"/>
+        </w:rPr>
+        <w:t xml:space="preserve"> and block </w:t>
+      </w:r>
+      <w:proofErr w:type="spellStart"/>
+      <w:r>
+        <w:rPr>
+          <w:lang w:val="es-ES"/>
+        </w:rPr>
+        <w:t>any</w:t>
+      </w:r>
+      <w:proofErr w:type="spellEnd"/>
+      <w:r>
+        <w:rPr>
+          <w:lang w:val="es-ES"/>
+        </w:rPr>
+        <w:t xml:space="preserve"> </w:t>
+      </w:r>
+      <w:proofErr w:type="spellStart"/>
+      <w:r>
+        <w:rPr>
+          <w:lang w:val="es-ES"/>
+        </w:rPr>
+        <w:t>tampering</w:t>
+      </w:r>
+      <w:proofErr w:type="spellEnd"/>
+      <w:r>
+        <w:rPr>
+          <w:lang w:val="es-ES"/>
+        </w:rPr>
+        <w:t>.</w:t>
+      </w:r>
+    </w:p>
+    <w:p>
+      <w:pPr>
+        <w:rPr>
+          <w:lang w:val="es-ES"/>
+        </w:rPr>
+      </w:pPr>
+      <w:proofErr w:type="spellStart"/>
+      <w:r>
+        <w:rPr>
+          <w:lang w:val="es-ES"/>
+        </w:rPr>
+        <w:t>However</w:t>
+      </w:r>
+      <w:proofErr w:type="spellEnd"/>
+      <w:r>
+        <w:rPr>
+          <w:lang w:val="es-ES"/>
+        </w:rPr>
+        <w:t xml:space="preserve">, </w:t>
+      </w:r>
+      <w:proofErr w:type="spellStart"/>
+      <w:r>
+        <w:rPr>
+          <w:lang w:val="es-ES"/>
+        </w:rPr>
+        <w:t>this</w:t>
+      </w:r>
+      <w:proofErr w:type="spellEnd"/>
+      <w:r>
+        <w:rPr>
+          <w:lang w:val="es-ES"/>
+        </w:rPr>
+        <w:t xml:space="preserve"> led </w:t>
+      </w:r>
+      <w:proofErr w:type="spellStart"/>
+      <w:r>
+        <w:rPr>
+          <w:lang w:val="es-ES"/>
+        </w:rPr>
+        <w:t>to</w:t>
+      </w:r>
+      <w:proofErr w:type="spellEnd"/>
+      <w:r>
+        <w:rPr>
+          <w:lang w:val="es-ES"/>
+        </w:rPr>
+        <w:t xml:space="preserve"> </w:t>
+      </w:r>
+      <w:proofErr w:type="spellStart"/>
+      <w:r>
+        <w:rPr>
+          <w:lang w:val="es-ES"/>
+        </w:rPr>
+        <w:t>significant</w:t>
+      </w:r>
+      <w:proofErr w:type="spellEnd"/>
+      <w:r>
+        <w:rPr>
+          <w:lang w:val="es-ES"/>
+        </w:rPr>
+        <w:t xml:space="preserve"> </w:t>
+      </w:r>
+      <w:proofErr w:type="spellStart"/>
+      <w:r>
+        <w:rPr>
+          <w:lang w:val="es-ES"/>
+        </w:rPr>
+        <w:t>issues</w:t>
+      </w:r>
+      <w:proofErr w:type="spellEnd"/>
+      <w:r>
+        <w:rPr>
+          <w:lang w:val="es-ES"/>
+        </w:rPr>
+        <w:t xml:space="preserve"> </w:t>
+      </w:r>
+      <w:proofErr w:type="spellStart"/>
+      <w:r>
+        <w:rPr>
+          <w:lang w:val="es-ES"/>
+        </w:rPr>
+        <w:t>related</w:t>
+      </w:r>
+      <w:proofErr w:type="spellEnd"/>
+      <w:r>
+        <w:rPr>
+          <w:lang w:val="es-ES"/>
+        </w:rPr>
+        <w:t xml:space="preserve"> </w:t>
+      </w:r>
+      <w:proofErr w:type="spellStart"/>
+      <w:r>
+        <w:rPr>
+          <w:lang w:val="es-ES"/>
+        </w:rPr>
+        <w:t>to</w:t>
+      </w:r>
+      <w:proofErr w:type="spellEnd"/>
+      <w:r>
+        <w:rPr>
+          <w:lang w:val="es-ES"/>
+        </w:rPr>
+        <w:t xml:space="preserve"> </w:t>
+      </w:r>
+      <w:proofErr w:type="spellStart"/>
+      <w:r>
+        <w:rPr>
+          <w:lang w:val="es-ES"/>
+        </w:rPr>
+        <w:t>the</w:t>
+      </w:r>
+      <w:proofErr w:type="spellEnd"/>
+      <w:r>
+        <w:rPr>
+          <w:lang w:val="es-ES"/>
+        </w:rPr>
+        <w:t xml:space="preserve"> </w:t>
+      </w:r>
+      <w:proofErr w:type="spellStart"/>
+      <w:r>
+        <w:rPr>
+          <w:lang w:val="es-ES"/>
+        </w:rPr>
+        <w:t>flight</w:t>
+      </w:r>
+      <w:proofErr w:type="spellEnd"/>
+      <w:r>
+        <w:rPr>
+          <w:lang w:val="es-ES"/>
+        </w:rPr>
+        <w:t xml:space="preserve">, </w:t>
+      </w:r>
+      <w:proofErr w:type="spellStart"/>
+      <w:r>
+        <w:rPr>
+          <w:lang w:val="es-ES"/>
+        </w:rPr>
+        <w:t>since</w:t>
+      </w:r>
+      <w:proofErr w:type="spellEnd"/>
+      <w:r>
+        <w:rPr>
+          <w:lang w:val="es-ES"/>
+        </w:rPr>
+        <w:t xml:space="preserve"> </w:t>
+      </w:r>
+      <w:proofErr w:type="spellStart"/>
+      <w:r>
+        <w:rPr>
+          <w:lang w:val="es-ES"/>
+        </w:rPr>
+        <w:t>the</w:t>
+      </w:r>
+      <w:proofErr w:type="spellEnd"/>
+      <w:r>
+        <w:rPr>
+          <w:lang w:val="es-ES"/>
+        </w:rPr>
+        <w:t xml:space="preserve"> </w:t>
+      </w:r>
+      <w:proofErr w:type="spellStart"/>
+      <w:r>
+        <w:rPr>
+          <w:lang w:val="es-ES"/>
+        </w:rPr>
+        <w:t>price</w:t>
+      </w:r>
+      <w:proofErr w:type="spellEnd"/>
+      <w:r>
+        <w:rPr>
+          <w:lang w:val="es-ES"/>
+        </w:rPr>
+        <w:t xml:space="preserve"> </w:t>
+      </w:r>
+      <w:proofErr w:type="spellStart"/>
+      <w:r>
+        <w:rPr>
+          <w:lang w:val="es-ES"/>
+        </w:rPr>
+        <w:t>is</w:t>
+      </w:r>
+      <w:proofErr w:type="spellEnd"/>
+      <w:r>
+        <w:rPr>
+          <w:lang w:val="es-ES"/>
+        </w:rPr>
+        <w:t xml:space="preserve"> </w:t>
+      </w:r>
+      <w:proofErr w:type="spellStart"/>
+      <w:r>
+        <w:rPr>
+          <w:lang w:val="es-ES"/>
+        </w:rPr>
+        <w:t>directly</w:t>
+      </w:r>
+      <w:proofErr w:type="spellEnd"/>
+      <w:r>
+        <w:rPr>
+          <w:lang w:val="es-ES"/>
+        </w:rPr>
+        <w:t xml:space="preserve"> </w:t>
+      </w:r>
+      <w:proofErr w:type="spellStart"/>
+      <w:r>
+        <w:rPr>
+          <w:lang w:val="es-ES"/>
+        </w:rPr>
+        <w:t>derived</w:t>
+      </w:r>
+      <w:proofErr w:type="spellEnd"/>
+      <w:r>
+        <w:rPr>
+          <w:lang w:val="es-ES"/>
+        </w:rPr>
+        <w:t xml:space="preserve"> </w:t>
+      </w:r>
+      <w:proofErr w:type="spellStart"/>
+      <w:r>
+        <w:rPr>
+          <w:lang w:val="es-ES"/>
+        </w:rPr>
+        <w:t>from</w:t>
+      </w:r>
+      <w:proofErr w:type="spellEnd"/>
+      <w:r>
+        <w:rPr>
+          <w:lang w:val="es-ES"/>
+        </w:rPr>
+        <w:t xml:space="preserve"> </w:t>
+      </w:r>
+      <w:proofErr w:type="spellStart"/>
+      <w:r>
+        <w:rPr>
+          <w:lang w:val="es-ES"/>
+        </w:rPr>
+        <w:t>it</w:t>
+      </w:r>
+      <w:proofErr w:type="spellEnd"/>
+      <w:r>
+        <w:rPr>
+          <w:lang w:val="es-ES"/>
+        </w:rPr>
+        <w:t xml:space="preserve">. </w:t>
+      </w:r>
+      <w:proofErr w:type="spellStart"/>
+      <w:r>
+        <w:rPr>
+          <w:lang w:val="es-ES"/>
+        </w:rPr>
+        <w:t>For</w:t>
+      </w:r>
+      <w:proofErr w:type="spellEnd"/>
+      <w:r>
+        <w:rPr>
+          <w:lang w:val="es-ES"/>
+        </w:rPr>
+        <w:t xml:space="preserve"> </w:t>
+      </w:r>
+      <w:proofErr w:type="spellStart"/>
+      <w:r>
+        <w:rPr>
+          <w:lang w:val="es-ES"/>
+        </w:rPr>
+        <w:t>example</w:t>
+      </w:r>
+      <w:proofErr w:type="spellEnd"/>
+      <w:r>
+        <w:rPr>
+          <w:lang w:val="es-ES"/>
+        </w:rPr>
+        <w:t xml:space="preserve">, </w:t>
+      </w:r>
+      <w:proofErr w:type="spellStart"/>
+      <w:r>
+        <w:rPr>
+          <w:lang w:val="es-ES"/>
+        </w:rPr>
+        <w:t>if</w:t>
+      </w:r>
+      <w:proofErr w:type="spellEnd"/>
+      <w:r>
+        <w:rPr>
+          <w:lang w:val="es-ES"/>
+        </w:rPr>
+        <w:t xml:space="preserve"> </w:t>
+      </w:r>
+      <w:proofErr w:type="spellStart"/>
+      <w:r>
+        <w:rPr>
+          <w:lang w:val="es-ES"/>
+        </w:rPr>
+        <w:t>someone</w:t>
+      </w:r>
+      <w:proofErr w:type="spellEnd"/>
+      <w:r>
+        <w:rPr>
+          <w:lang w:val="es-ES"/>
+        </w:rPr>
+        <w:t xml:space="preserve"> </w:t>
+      </w:r>
+      <w:proofErr w:type="spellStart"/>
+      <w:r>
+        <w:rPr>
+          <w:lang w:val="es-ES"/>
+        </w:rPr>
+        <w:t>hacked</w:t>
+      </w:r>
+      <w:proofErr w:type="spellEnd"/>
+      <w:r>
+        <w:rPr>
+          <w:lang w:val="es-ES"/>
+        </w:rPr>
+        <w:t xml:space="preserve"> </w:t>
+      </w:r>
+      <w:proofErr w:type="spellStart"/>
+      <w:r>
+        <w:rPr>
+          <w:lang w:val="es-ES"/>
+        </w:rPr>
+        <w:t>the</w:t>
+      </w:r>
+      <w:proofErr w:type="spellEnd"/>
+      <w:r>
+        <w:rPr>
+          <w:lang w:val="es-ES"/>
+        </w:rPr>
+        <w:t xml:space="preserve"> </w:t>
+      </w:r>
+      <w:proofErr w:type="spellStart"/>
+      <w:r>
+        <w:rPr>
+          <w:lang w:val="es-ES"/>
+        </w:rPr>
+        <w:t>form</w:t>
+      </w:r>
+      <w:proofErr w:type="spellEnd"/>
+      <w:r>
+        <w:rPr>
+          <w:lang w:val="es-ES"/>
+        </w:rPr>
+        <w:t xml:space="preserve"> </w:t>
+      </w:r>
+      <w:proofErr w:type="spellStart"/>
+      <w:r>
+        <w:rPr>
+          <w:lang w:val="es-ES"/>
+        </w:rPr>
+        <w:t>to</w:t>
+      </w:r>
+      <w:proofErr w:type="spellEnd"/>
+      <w:r>
+        <w:rPr>
+          <w:lang w:val="es-ES"/>
+        </w:rPr>
+        <w:t xml:space="preserve"> set </w:t>
+      </w:r>
+      <w:proofErr w:type="spellStart"/>
+      <w:r>
+        <w:rPr>
+          <w:lang w:val="es-ES"/>
+        </w:rPr>
+        <w:t>the</w:t>
+      </w:r>
+      <w:proofErr w:type="spellEnd"/>
+      <w:r>
+        <w:rPr>
+          <w:lang w:val="es-ES"/>
+        </w:rPr>
+        <w:t xml:space="preserve"> </w:t>
+      </w:r>
+      <w:proofErr w:type="spellStart"/>
+      <w:r>
+        <w:rPr>
+          <w:lang w:val="es-ES"/>
+        </w:rPr>
+        <w:t>flight</w:t>
+      </w:r>
+      <w:proofErr w:type="spellEnd"/>
+      <w:r>
+        <w:rPr>
+          <w:lang w:val="es-ES"/>
+        </w:rPr>
+        <w:t xml:space="preserve"> </w:t>
+      </w:r>
+      <w:proofErr w:type="spellStart"/>
+      <w:r>
+        <w:rPr>
+          <w:lang w:val="es-ES"/>
+        </w:rPr>
+        <w:t>to</w:t>
+      </w:r>
+      <w:proofErr w:type="spellEnd"/>
+      <w:r>
+        <w:rPr>
+          <w:lang w:val="es-ES"/>
+        </w:rPr>
+        <w:t xml:space="preserve"> </w:t>
+      </w:r>
+      <w:proofErr w:type="spellStart"/>
+      <w:r>
+        <w:rPr>
+          <w:lang w:val="es-ES"/>
+        </w:rPr>
+        <w:t>null</w:t>
+      </w:r>
+      <w:proofErr w:type="spellEnd"/>
+      <w:r>
+        <w:rPr>
+          <w:lang w:val="es-ES"/>
+        </w:rPr>
+        <w:t xml:space="preserve">, </w:t>
+      </w:r>
+      <w:proofErr w:type="spellStart"/>
+      <w:r>
+        <w:rPr>
+          <w:lang w:val="es-ES"/>
+        </w:rPr>
+        <w:t>the</w:t>
+      </w:r>
+      <w:proofErr w:type="spellEnd"/>
+      <w:r>
+        <w:rPr>
+          <w:lang w:val="es-ES"/>
+        </w:rPr>
+        <w:t xml:space="preserve"> </w:t>
+      </w:r>
+      <w:proofErr w:type="spellStart"/>
+      <w:r>
+        <w:rPr>
+          <w:lang w:val="es-ES"/>
+        </w:rPr>
+        <w:t>system</w:t>
+      </w:r>
+      <w:proofErr w:type="spellEnd"/>
+      <w:r>
+        <w:rPr>
+          <w:lang w:val="es-ES"/>
+        </w:rPr>
+        <w:t xml:space="preserve"> </w:t>
+      </w:r>
+      <w:proofErr w:type="spellStart"/>
+      <w:r>
+        <w:rPr>
+          <w:lang w:val="es-ES"/>
+        </w:rPr>
+        <w:t>would</w:t>
+      </w:r>
+      <w:proofErr w:type="spellEnd"/>
+      <w:r>
+        <w:rPr>
+          <w:lang w:val="es-ES"/>
+        </w:rPr>
+        <w:t xml:space="preserve"> </w:t>
+      </w:r>
+      <w:proofErr w:type="spellStart"/>
+      <w:r>
+        <w:rPr>
+          <w:lang w:val="es-ES"/>
+        </w:rPr>
+        <w:t>always</w:t>
+      </w:r>
+      <w:proofErr w:type="spellEnd"/>
+      <w:r>
+        <w:rPr>
+          <w:lang w:val="es-ES"/>
+        </w:rPr>
+        <w:t xml:space="preserve"> </w:t>
+      </w:r>
+      <w:proofErr w:type="spellStart"/>
+      <w:r>
+        <w:rPr>
+          <w:lang w:val="es-ES"/>
+        </w:rPr>
+        <w:t>throw</w:t>
+      </w:r>
+      <w:proofErr w:type="spellEnd"/>
+      <w:r>
+        <w:rPr>
+          <w:lang w:val="es-ES"/>
+        </w:rPr>
+        <w:t xml:space="preserve"> </w:t>
+      </w:r>
+      <w:proofErr w:type="spellStart"/>
+      <w:r>
+        <w:rPr>
+          <w:lang w:val="es-ES"/>
+        </w:rPr>
+        <w:t>an</w:t>
+      </w:r>
+      <w:proofErr w:type="spellEnd"/>
+      <w:r>
+        <w:rPr>
+          <w:lang w:val="es-ES"/>
+        </w:rPr>
+        <w:t xml:space="preserve"> </w:t>
+      </w:r>
+      <w:proofErr w:type="spellStart"/>
+      <w:r>
+        <w:rPr>
+          <w:i/>
+          <w:iCs/>
+          <w:lang w:val="es-ES"/>
+        </w:rPr>
+        <w:t>unauthorised</w:t>
+      </w:r>
+      <w:proofErr w:type="spellEnd"/>
+      <w:r>
+        <w:rPr>
+          <w:lang w:val="es-ES"/>
+        </w:rPr>
+        <w:t xml:space="preserve"> error </w:t>
+      </w:r>
+      <w:proofErr w:type="spellStart"/>
+      <w:r>
+        <w:rPr>
+          <w:lang w:val="es-ES"/>
+        </w:rPr>
+        <w:t>because</w:t>
+      </w:r>
+      <w:proofErr w:type="spellEnd"/>
+      <w:r>
+        <w:rPr>
+          <w:lang w:val="es-ES"/>
+        </w:rPr>
+        <w:t xml:space="preserve"> </w:t>
+      </w:r>
+      <w:proofErr w:type="spellStart"/>
+      <w:r>
+        <w:rPr>
+          <w:lang w:val="es-ES"/>
+        </w:rPr>
+        <w:t>it</w:t>
+      </w:r>
+      <w:proofErr w:type="spellEnd"/>
+      <w:r>
+        <w:rPr>
+          <w:lang w:val="es-ES"/>
+        </w:rPr>
+        <w:t xml:space="preserve"> </w:t>
+      </w:r>
+      <w:proofErr w:type="spellStart"/>
+      <w:r>
+        <w:rPr>
+          <w:lang w:val="es-ES"/>
+        </w:rPr>
+        <w:t>detected</w:t>
+      </w:r>
+      <w:proofErr w:type="spellEnd"/>
+      <w:r>
+        <w:rPr>
+          <w:lang w:val="es-ES"/>
+        </w:rPr>
+        <w:t xml:space="preserve"> a </w:t>
+      </w:r>
+      <w:proofErr w:type="spellStart"/>
+      <w:r>
+        <w:rPr>
+          <w:lang w:val="es-ES"/>
+        </w:rPr>
+        <w:t>mismatch</w:t>
+      </w:r>
+      <w:proofErr w:type="spellEnd"/>
+      <w:r>
+        <w:rPr>
+          <w:lang w:val="es-ES"/>
+        </w:rPr>
+        <w:t xml:space="preserve"> in </w:t>
+      </w:r>
+      <w:proofErr w:type="spellStart"/>
+      <w:r>
+        <w:rPr>
+          <w:lang w:val="es-ES"/>
+        </w:rPr>
+        <w:t>the</w:t>
+      </w:r>
+      <w:proofErr w:type="spellEnd"/>
+      <w:r>
+        <w:rPr>
+          <w:lang w:val="es-ES"/>
+        </w:rPr>
+        <w:t xml:space="preserve"> </w:t>
+      </w:r>
+      <w:proofErr w:type="spellStart"/>
+      <w:r>
+        <w:rPr>
+          <w:lang w:val="es-ES"/>
+        </w:rPr>
+        <w:t>calculated</w:t>
+      </w:r>
+      <w:proofErr w:type="spellEnd"/>
+      <w:r>
+        <w:rPr>
+          <w:lang w:val="es-ES"/>
+        </w:rPr>
+        <w:t xml:space="preserve"> </w:t>
+      </w:r>
+      <w:proofErr w:type="spellStart"/>
+      <w:r>
+        <w:rPr>
+          <w:lang w:val="es-ES"/>
+        </w:rPr>
+        <w:t>price</w:t>
+      </w:r>
+      <w:proofErr w:type="spellEnd"/>
+      <w:r>
+        <w:rPr>
+          <w:lang w:val="es-ES"/>
+        </w:rPr>
+        <w:t xml:space="preserve">, </w:t>
+      </w:r>
+      <w:proofErr w:type="spellStart"/>
+      <w:r>
+        <w:rPr>
+          <w:lang w:val="es-ES"/>
+        </w:rPr>
+        <w:t>causing</w:t>
+      </w:r>
+      <w:proofErr w:type="spellEnd"/>
+      <w:r>
+        <w:rPr>
+          <w:lang w:val="es-ES"/>
+        </w:rPr>
+        <w:t xml:space="preserve"> </w:t>
+      </w:r>
+      <w:proofErr w:type="spellStart"/>
+      <w:r>
+        <w:rPr>
+          <w:lang w:val="es-ES"/>
+        </w:rPr>
+        <w:t>the</w:t>
+      </w:r>
+      <w:proofErr w:type="spellEnd"/>
+      <w:r>
+        <w:rPr>
+          <w:lang w:val="es-ES"/>
+        </w:rPr>
+        <w:t xml:space="preserve"> </w:t>
+      </w:r>
+      <w:proofErr w:type="spellStart"/>
+      <w:r>
+        <w:rPr>
+          <w:lang w:val="es-ES"/>
+        </w:rPr>
+        <w:t>process</w:t>
+      </w:r>
+      <w:proofErr w:type="spellEnd"/>
+      <w:r>
+        <w:rPr>
+          <w:lang w:val="es-ES"/>
+        </w:rPr>
+        <w:t xml:space="preserve"> </w:t>
+      </w:r>
+      <w:proofErr w:type="spellStart"/>
+      <w:r>
+        <w:rPr>
+          <w:lang w:val="es-ES"/>
+        </w:rPr>
+        <w:t>to</w:t>
+      </w:r>
+      <w:proofErr w:type="spellEnd"/>
+      <w:r>
+        <w:rPr>
+          <w:lang w:val="es-ES"/>
+        </w:rPr>
+        <w:t xml:space="preserve"> break </w:t>
+      </w:r>
+      <w:proofErr w:type="spellStart"/>
+      <w:r>
+        <w:rPr>
+          <w:lang w:val="es-ES"/>
+        </w:rPr>
+        <w:t>even</w:t>
+      </w:r>
+      <w:proofErr w:type="spellEnd"/>
+      <w:r>
+        <w:rPr>
+          <w:lang w:val="es-ES"/>
+        </w:rPr>
+        <w:t xml:space="preserve"> in </w:t>
+      </w:r>
+      <w:proofErr w:type="spellStart"/>
+      <w:r>
+        <w:rPr>
+          <w:lang w:val="es-ES"/>
+        </w:rPr>
+        <w:t>legitimate</w:t>
+      </w:r>
+      <w:proofErr w:type="spellEnd"/>
+      <w:r>
+        <w:rPr>
+          <w:lang w:val="es-ES"/>
+        </w:rPr>
+        <w:t xml:space="preserve"> </w:t>
+      </w:r>
+      <w:proofErr w:type="spellStart"/>
+      <w:r>
+        <w:rPr>
+          <w:lang w:val="es-ES"/>
+        </w:rPr>
+        <w:t>scenarios</w:t>
+      </w:r>
+      <w:proofErr w:type="spellEnd"/>
+      <w:r>
+        <w:rPr>
+          <w:lang w:val="es-ES"/>
+        </w:rPr>
+        <w:t>.</w:t>
+      </w:r>
+    </w:p>
+    <w:p>
+      <w:pPr>
+        <w:rPr>
+          <w:lang w:val="es-ES"/>
+        </w:rPr>
+      </w:pPr>
+      <w:proofErr w:type="spellStart"/>
+      <w:r>
+        <w:rPr>
+          <w:lang w:val="es-ES"/>
+        </w:rPr>
+        <w:t>Due</w:t>
+      </w:r>
+      <w:proofErr w:type="spellEnd"/>
+      <w:r>
+        <w:rPr>
+          <w:lang w:val="es-ES"/>
+        </w:rPr>
+        <w:t xml:space="preserve"> </w:t>
+      </w:r>
+      <w:proofErr w:type="spellStart"/>
+      <w:r>
+        <w:rPr>
+          <w:lang w:val="es-ES"/>
+        </w:rPr>
+        <w:t>to</w:t>
+      </w:r>
+      <w:proofErr w:type="spellEnd"/>
+      <w:r>
+        <w:rPr>
+          <w:lang w:val="es-ES"/>
+        </w:rPr>
+        <w:t xml:space="preserve"> </w:t>
+      </w:r>
+      <w:proofErr w:type="spellStart"/>
+      <w:r>
+        <w:rPr>
+          <w:lang w:val="es-ES"/>
+        </w:rPr>
+        <w:t>the</w:t>
+      </w:r>
+      <w:proofErr w:type="spellEnd"/>
+      <w:r>
+        <w:rPr>
+          <w:lang w:val="es-ES"/>
+        </w:rPr>
+        <w:t xml:space="preserve"> </w:t>
+      </w:r>
+      <w:proofErr w:type="spellStart"/>
+      <w:r>
+        <w:rPr>
+          <w:lang w:val="es-ES"/>
+        </w:rPr>
+        <w:t>complexity</w:t>
+      </w:r>
+      <w:proofErr w:type="spellEnd"/>
+      <w:r>
+        <w:rPr>
+          <w:lang w:val="es-ES"/>
+        </w:rPr>
+        <w:t xml:space="preserve"> and </w:t>
+      </w:r>
+      <w:proofErr w:type="spellStart"/>
+      <w:r>
+        <w:rPr>
+          <w:lang w:val="es-ES"/>
+        </w:rPr>
+        <w:t>the</w:t>
+      </w:r>
+      <w:proofErr w:type="spellEnd"/>
+      <w:r>
+        <w:rPr>
+          <w:lang w:val="es-ES"/>
+        </w:rPr>
+        <w:t xml:space="preserve"> </w:t>
+      </w:r>
+      <w:proofErr w:type="spellStart"/>
+      <w:r>
+        <w:rPr>
+          <w:lang w:val="es-ES"/>
+        </w:rPr>
+        <w:t>risk</w:t>
+      </w:r>
+      <w:proofErr w:type="spellEnd"/>
+      <w:r>
+        <w:rPr>
+          <w:lang w:val="es-ES"/>
+        </w:rPr>
+        <w:t xml:space="preserve"> </w:t>
+      </w:r>
+      <w:proofErr w:type="spellStart"/>
+      <w:r>
+        <w:rPr>
+          <w:lang w:val="es-ES"/>
+        </w:rPr>
+        <w:t>of</w:t>
+      </w:r>
+      <w:proofErr w:type="spellEnd"/>
+      <w:r>
+        <w:rPr>
+          <w:lang w:val="es-ES"/>
+        </w:rPr>
+        <w:t xml:space="preserve"> false positives, I </w:t>
+      </w:r>
+      <w:proofErr w:type="spellStart"/>
+      <w:r>
+        <w:rPr>
+          <w:lang w:val="es-ES"/>
+        </w:rPr>
+        <w:t>ultimately</w:t>
+      </w:r>
+      <w:proofErr w:type="spellEnd"/>
+      <w:r>
+        <w:rPr>
+          <w:lang w:val="es-ES"/>
+        </w:rPr>
+        <w:t xml:space="preserve"> </w:t>
+      </w:r>
+      <w:proofErr w:type="spellStart"/>
+      <w:r>
+        <w:rPr>
+          <w:lang w:val="es-ES"/>
+        </w:rPr>
+        <w:t>decided</w:t>
+      </w:r>
+      <w:proofErr w:type="spellEnd"/>
+      <w:r>
+        <w:rPr>
+          <w:lang w:val="es-ES"/>
+        </w:rPr>
+        <w:t xml:space="preserve"> </w:t>
+      </w:r>
+      <w:proofErr w:type="spellStart"/>
+      <w:r>
+        <w:rPr>
+          <w:lang w:val="es-ES"/>
+        </w:rPr>
+        <w:t>the</w:t>
+      </w:r>
+      <w:proofErr w:type="spellEnd"/>
+      <w:r>
+        <w:rPr>
+          <w:lang w:val="es-ES"/>
+        </w:rPr>
+        <w:t xml:space="preserve"> </w:t>
+      </w:r>
+      <w:proofErr w:type="spellStart"/>
+      <w:r>
+        <w:rPr>
+          <w:lang w:val="es-ES"/>
+        </w:rPr>
+        <w:t>best</w:t>
+      </w:r>
+      <w:proofErr w:type="spellEnd"/>
+      <w:r>
+        <w:rPr>
+          <w:lang w:val="es-ES"/>
+        </w:rPr>
+        <w:t xml:space="preserve"> </w:t>
+      </w:r>
+      <w:proofErr w:type="spellStart"/>
+      <w:r>
+        <w:rPr>
+          <w:lang w:val="es-ES"/>
+        </w:rPr>
+        <w:t>option</w:t>
+      </w:r>
+      <w:proofErr w:type="spellEnd"/>
+      <w:r>
+        <w:rPr>
+          <w:lang w:val="es-ES"/>
+        </w:rPr>
+        <w:t xml:space="preserve"> </w:t>
+      </w:r>
+      <w:proofErr w:type="spellStart"/>
+      <w:r>
+        <w:rPr>
+          <w:lang w:val="es-ES"/>
+        </w:rPr>
+        <w:t>was</w:t>
+      </w:r>
+      <w:proofErr w:type="spellEnd"/>
+      <w:r>
+        <w:rPr>
+          <w:lang w:val="es-ES"/>
+        </w:rPr>
+        <w:t xml:space="preserve"> </w:t>
+      </w:r>
+      <w:proofErr w:type="spellStart"/>
+      <w:r>
+        <w:rPr>
+          <w:lang w:val="es-ES"/>
+        </w:rPr>
+        <w:t>to</w:t>
+      </w:r>
+      <w:proofErr w:type="spellEnd"/>
+      <w:r>
+        <w:rPr>
+          <w:lang w:val="es-ES"/>
+        </w:rPr>
+        <w:t xml:space="preserve"> </w:t>
+      </w:r>
+      <w:proofErr w:type="spellStart"/>
+      <w:r>
+        <w:rPr>
+          <w:lang w:val="es-ES"/>
+        </w:rPr>
+        <w:t>remove</w:t>
+      </w:r>
+      <w:proofErr w:type="spellEnd"/>
+      <w:r>
+        <w:rPr>
+          <w:lang w:val="es-ES"/>
+        </w:rPr>
+        <w:t xml:space="preserve"> </w:t>
+      </w:r>
+      <w:proofErr w:type="spellStart"/>
+      <w:r>
+        <w:rPr>
+          <w:lang w:val="es-ES"/>
+        </w:rPr>
+        <w:t>that</w:t>
+      </w:r>
+      <w:proofErr w:type="spellEnd"/>
+      <w:r>
+        <w:rPr>
+          <w:lang w:val="es-ES"/>
+        </w:rPr>
+        <w:t xml:space="preserve"> </w:t>
+      </w:r>
+      <w:proofErr w:type="spellStart"/>
+      <w:r>
+        <w:rPr>
+          <w:lang w:val="es-ES"/>
+        </w:rPr>
+        <w:t>specific</w:t>
+      </w:r>
+      <w:proofErr w:type="spellEnd"/>
+      <w:r>
+        <w:rPr>
+          <w:lang w:val="es-ES"/>
+        </w:rPr>
+        <w:t xml:space="preserve"> </w:t>
+      </w:r>
+      <w:proofErr w:type="spellStart"/>
+      <w:r>
+        <w:rPr>
+          <w:lang w:val="es-ES"/>
+        </w:rPr>
+        <w:t>authorisation</w:t>
+      </w:r>
+      <w:proofErr w:type="spellEnd"/>
+      <w:r>
+        <w:rPr>
+          <w:lang w:val="es-ES"/>
+        </w:rPr>
+        <w:t xml:space="preserve"> </w:t>
+      </w:r>
+      <w:proofErr w:type="spellStart"/>
+      <w:r>
+        <w:rPr>
+          <w:lang w:val="es-ES"/>
+        </w:rPr>
+        <w:t>check</w:t>
+      </w:r>
+      <w:proofErr w:type="spellEnd"/>
+      <w:r>
+        <w:rPr>
+          <w:lang w:val="es-ES"/>
+        </w:rPr>
+        <w:t>.</w:t>
+      </w:r>
+    </w:p>
+    <w:p/>
     <w:p>
       <w:pPr>
         <w:pStyle w:val="Ttulo3"/>
@@ -1944,28 +3274,41 @@
           <w:u w:val="single"/>
         </w:rPr>
       </w:pPr>
-      <w:bookmarkStart w:id="32" w:name="_Toc199190137"/>
+      <w:bookmarkStart w:id="15" w:name="_Toc199190120"/>
       <w:r>
         <w:rPr>
           <w:b/>
           <w:bCs/>
           <w:u w:val="single"/>
         </w:rPr>
-        <w:t>Index</w:t>
-      </w:r>
-      <w:bookmarkEnd w:id="32"/>
+        <w:lastRenderedPageBreak/>
+        <w:t>Booking Passenger (</w:t>
+      </w:r>
+      <w:r>
+        <w:rPr>
+          <w:b/>
+          <w:bCs/>
+          <w:u w:val="single"/>
+        </w:rPr>
+        <w:t>intermediate entity</w:t>
+      </w:r>
+      <w:r>
+        <w:rPr>
+          <w:b/>
+          <w:bCs/>
+          <w:u w:val="single"/>
+        </w:rPr>
+        <w:t>)</w:t>
+      </w:r>
+      <w:bookmarkEnd w:id="15"/>
     </w:p>
-    <w:p/>
     <w:p>
       <w:r>
-        <w:rPr>
-          <w:noProof/>
-        </w:rPr>
         <w:drawing>
-          <wp:inline distT="0" distB="0" distL="0" distR="0" wp14:anchorId="12793A57" wp14:editId="159D39A9">
-            <wp:extent cx="5943600" cy="2366010"/>
-            <wp:effectExtent l="0" t="0" r="0" b="0"/>
-            <wp:docPr id="5039492" name="Imagen 1" descr="Gráfico&#10;&#10;El contenido generado por IA puede ser incorrecto."/>
+          <wp:inline distT="0" distB="0" distL="0" distR="0" wp14:anchorId="66888795" wp14:editId="3AC5973E">
+            <wp:extent cx="4201111" cy="1019317"/>
+            <wp:effectExtent l="0" t="0" r="9525" b="9525"/>
+            <wp:docPr id="613493684" name="Imagen 1" descr="Texto, Carta&#10;&#10;El contenido generado por IA puede ser incorrecto."/>
             <wp:cNvGraphicFramePr>
               <a:graphicFrameLocks xmlns:a="http://schemas.openxmlformats.org/drawingml/2006/main" noChangeAspect="1"/>
             </wp:cNvGraphicFramePr>
@@ -1973,7 +3316,7 @@
               <a:graphicData uri="http://schemas.openxmlformats.org/drawingml/2006/picture">
                 <pic:pic xmlns:pic="http://schemas.openxmlformats.org/drawingml/2006/picture">
                   <pic:nvPicPr>
-                    <pic:cNvPr id="5039492" name="Imagen 1" descr="Gráfico&#10;&#10;El contenido generado por IA puede ser incorrecto."/>
+                    <pic:cNvPr id="613493684" name="Imagen 1" descr="Texto, Carta&#10;&#10;El contenido generado por IA puede ser incorrecto."/>
                     <pic:cNvPicPr/>
                   </pic:nvPicPr>
                   <pic:blipFill>
@@ -1985,7 +3328,7 @@
                   <pic:spPr>
                     <a:xfrm>
                       <a:off x="0" y="0"/>
-                      <a:ext cx="5943600" cy="2366010"/>
+                      <a:ext cx="4201111" cy="1019317"/>
                     </a:xfrm>
                     <a:prstGeom prst="rect">
                       <a:avLst/>
@@ -1999,6 +3342,851 @@
       </w:r>
     </w:p>
     <w:p/>
+    <w:p>
+      <w:pPr>
+        <w:pStyle w:val="Ttulo4"/>
+      </w:pPr>
+      <w:bookmarkStart w:id="16" w:name="_Toc199190121"/>
+      <w:r>
+        <w:t>List</w:t>
+      </w:r>
+      <w:bookmarkEnd w:id="16"/>
+    </w:p>
+    <w:p>
+      <w:r>
+        <w:t xml:space="preserve">I achieved 100% coverage. </w:t>
+      </w:r>
+      <w:proofErr w:type="gramStart"/>
+      <w:r>
+        <w:t>The .safe</w:t>
+      </w:r>
+      <w:proofErr w:type="gramEnd"/>
+      <w:r>
+        <w:t xml:space="preserve"> tests check the listing of passengers for both published and unpublished bookings. </w:t>
+      </w:r>
+      <w:proofErr w:type="gramStart"/>
+      <w:r>
+        <w:t>The .hack</w:t>
+      </w:r>
+      <w:proofErr w:type="gramEnd"/>
+      <w:r>
+        <w:t xml:space="preserve"> tests simulate access attempts by unauthenticated users, users with a different role, and users with the same role but who are not the owner of the booking.</w:t>
+      </w:r>
+    </w:p>
+    <w:p>
+      <w:pPr>
+        <w:pStyle w:val="Ttulo4"/>
+      </w:pPr>
+      <w:bookmarkStart w:id="17" w:name="_Toc199190122"/>
+      <w:r>
+        <w:t>Show</w:t>
+      </w:r>
+      <w:bookmarkEnd w:id="17"/>
+    </w:p>
+    <w:p>
+      <w:r>
+        <w:t xml:space="preserve">I also reached 100% coverage here. </w:t>
+      </w:r>
+      <w:proofErr w:type="gramStart"/>
+      <w:r>
+        <w:t>The .safe</w:t>
+      </w:r>
+      <w:proofErr w:type="gramEnd"/>
+      <w:r>
+        <w:t xml:space="preserve"> tests verify access to individual </w:t>
+      </w:r>
+      <w:proofErr w:type="spellStart"/>
+      <w:r>
+        <w:t>BookingPassenger</w:t>
+      </w:r>
+      <w:proofErr w:type="spellEnd"/>
+      <w:r>
+        <w:t xml:space="preserve"> entries, particularly showing the linked passenger through the master </w:t>
+      </w:r>
+      <w:proofErr w:type="spellStart"/>
+      <w:r>
+        <w:t>bookingPassenger.passenger</w:t>
+      </w:r>
+      <w:proofErr w:type="spellEnd"/>
+      <w:r>
+        <w:t xml:space="preserve">. </w:t>
+      </w:r>
+      <w:proofErr w:type="gramStart"/>
+      <w:r>
+        <w:t>The .hack</w:t>
+      </w:r>
+      <w:proofErr w:type="gramEnd"/>
+      <w:r>
+        <w:t xml:space="preserve"> tests cover the usual cases: unauthenticated users, users with a different role, and users with the same role but not the owner.</w:t>
+      </w:r>
+    </w:p>
+    <w:p>
+      <w:pPr>
+        <w:pStyle w:val="Ttulo4"/>
+      </w:pPr>
+      <w:bookmarkStart w:id="18" w:name="_Toc199190123"/>
+      <w:r>
+        <w:t>Create</w:t>
+      </w:r>
+      <w:bookmarkEnd w:id="18"/>
+    </w:p>
+    <w:p>
+      <w:pPr>
+        <w:rPr>
+          <w:lang w:val="es-ES"/>
+        </w:rPr>
+      </w:pPr>
+      <w:r>
+        <w:rPr>
+          <w:lang w:val="es-ES"/>
+        </w:rPr>
+        <w:t xml:space="preserve">Here I </w:t>
+      </w:r>
+      <w:proofErr w:type="spellStart"/>
+      <w:r>
+        <w:rPr>
+          <w:lang w:val="es-ES"/>
+        </w:rPr>
+        <w:t>obtained</w:t>
+      </w:r>
+      <w:proofErr w:type="spellEnd"/>
+      <w:r>
+        <w:rPr>
+          <w:lang w:val="es-ES"/>
+        </w:rPr>
+        <w:t xml:space="preserve"> 9</w:t>
+      </w:r>
+      <w:r>
+        <w:rPr>
+          <w:lang w:val="es-ES"/>
+        </w:rPr>
+        <w:t>8</w:t>
+      </w:r>
+      <w:r>
+        <w:rPr>
+          <w:lang w:val="es-ES"/>
+        </w:rPr>
+        <w:t>.</w:t>
+      </w:r>
+      <w:r>
+        <w:rPr>
+          <w:lang w:val="es-ES"/>
+        </w:rPr>
+        <w:t>7</w:t>
+      </w:r>
+      <w:r>
+        <w:rPr>
+          <w:lang w:val="es-ES"/>
+        </w:rPr>
+        <w:t xml:space="preserve">% </w:t>
+      </w:r>
+      <w:proofErr w:type="spellStart"/>
+      <w:r>
+        <w:rPr>
+          <w:lang w:val="es-ES"/>
+        </w:rPr>
+        <w:t>coverage</w:t>
+      </w:r>
+      <w:proofErr w:type="spellEnd"/>
+      <w:r>
+        <w:rPr>
+          <w:lang w:val="es-ES"/>
+        </w:rPr>
+        <w:t xml:space="preserve">. </w:t>
+      </w:r>
+      <w:proofErr w:type="spellStart"/>
+      <w:proofErr w:type="gramStart"/>
+      <w:r>
+        <w:rPr>
+          <w:lang w:val="es-ES"/>
+        </w:rPr>
+        <w:t>The</w:t>
+      </w:r>
+      <w:proofErr w:type="spellEnd"/>
+      <w:r>
+        <w:rPr>
+          <w:lang w:val="es-ES"/>
+        </w:rPr>
+        <w:t xml:space="preserve"> .</w:t>
+      </w:r>
+      <w:proofErr w:type="spellStart"/>
+      <w:r>
+        <w:rPr>
+          <w:lang w:val="es-ES"/>
+        </w:rPr>
+        <w:t>safe</w:t>
+      </w:r>
+      <w:proofErr w:type="spellEnd"/>
+      <w:proofErr w:type="gramEnd"/>
+      <w:r>
+        <w:rPr>
+          <w:lang w:val="es-ES"/>
+        </w:rPr>
+        <w:t xml:space="preserve"> </w:t>
+      </w:r>
+      <w:proofErr w:type="spellStart"/>
+      <w:r>
+        <w:rPr>
+          <w:lang w:val="es-ES"/>
+        </w:rPr>
+        <w:t>tests</w:t>
+      </w:r>
+      <w:proofErr w:type="spellEnd"/>
+      <w:r>
+        <w:rPr>
+          <w:lang w:val="es-ES"/>
+        </w:rPr>
+        <w:t xml:space="preserve"> </w:t>
+      </w:r>
+      <w:proofErr w:type="spellStart"/>
+      <w:r>
+        <w:rPr>
+          <w:lang w:val="es-ES"/>
+        </w:rPr>
+        <w:t>focus</w:t>
+      </w:r>
+      <w:proofErr w:type="spellEnd"/>
+      <w:r>
+        <w:rPr>
+          <w:lang w:val="es-ES"/>
+        </w:rPr>
+        <w:t xml:space="preserve"> </w:t>
+      </w:r>
+      <w:proofErr w:type="spellStart"/>
+      <w:r>
+        <w:rPr>
+          <w:lang w:val="es-ES"/>
+        </w:rPr>
+        <w:t>on</w:t>
+      </w:r>
+      <w:proofErr w:type="spellEnd"/>
+      <w:r>
+        <w:rPr>
+          <w:lang w:val="es-ES"/>
+        </w:rPr>
+        <w:t xml:space="preserve"> </w:t>
+      </w:r>
+      <w:proofErr w:type="spellStart"/>
+      <w:r>
+        <w:rPr>
+          <w:lang w:val="es-ES"/>
+        </w:rPr>
+        <w:t>adding</w:t>
+      </w:r>
+      <w:proofErr w:type="spellEnd"/>
+      <w:r>
+        <w:rPr>
+          <w:lang w:val="es-ES"/>
+        </w:rPr>
+        <w:t xml:space="preserve"> </w:t>
+      </w:r>
+      <w:proofErr w:type="spellStart"/>
+      <w:r>
+        <w:rPr>
+          <w:lang w:val="es-ES"/>
+        </w:rPr>
+        <w:t>passengers</w:t>
+      </w:r>
+      <w:proofErr w:type="spellEnd"/>
+      <w:r>
+        <w:rPr>
+          <w:lang w:val="es-ES"/>
+        </w:rPr>
+        <w:t xml:space="preserve"> and </w:t>
+      </w:r>
+      <w:proofErr w:type="spellStart"/>
+      <w:r>
+        <w:rPr>
+          <w:lang w:val="es-ES"/>
+        </w:rPr>
+        <w:t>verifying</w:t>
+      </w:r>
+      <w:proofErr w:type="spellEnd"/>
+      <w:r>
+        <w:rPr>
+          <w:lang w:val="es-ES"/>
+        </w:rPr>
+        <w:t xml:space="preserve"> </w:t>
+      </w:r>
+      <w:proofErr w:type="spellStart"/>
+      <w:r>
+        <w:rPr>
+          <w:lang w:val="es-ES"/>
+        </w:rPr>
+        <w:t>that</w:t>
+      </w:r>
+      <w:proofErr w:type="spellEnd"/>
+      <w:r>
+        <w:rPr>
+          <w:lang w:val="es-ES"/>
+        </w:rPr>
+        <w:t xml:space="preserve"> </w:t>
+      </w:r>
+      <w:proofErr w:type="spellStart"/>
+      <w:r>
+        <w:rPr>
+          <w:lang w:val="es-ES"/>
+        </w:rPr>
+        <w:t>the</w:t>
+      </w:r>
+      <w:proofErr w:type="spellEnd"/>
+      <w:r>
+        <w:rPr>
+          <w:lang w:val="es-ES"/>
+        </w:rPr>
+        <w:t xml:space="preserve"> total </w:t>
+      </w:r>
+      <w:proofErr w:type="spellStart"/>
+      <w:r>
+        <w:rPr>
+          <w:lang w:val="es-ES"/>
+        </w:rPr>
+        <w:t>price</w:t>
+      </w:r>
+      <w:proofErr w:type="spellEnd"/>
+      <w:r>
+        <w:rPr>
+          <w:lang w:val="es-ES"/>
+        </w:rPr>
+        <w:t xml:space="preserve"> </w:t>
+      </w:r>
+      <w:proofErr w:type="spellStart"/>
+      <w:r>
+        <w:rPr>
+          <w:lang w:val="es-ES"/>
+        </w:rPr>
+        <w:t>updates</w:t>
+      </w:r>
+      <w:proofErr w:type="spellEnd"/>
+      <w:r>
+        <w:rPr>
+          <w:lang w:val="es-ES"/>
+        </w:rPr>
+        <w:t xml:space="preserve"> </w:t>
+      </w:r>
+      <w:proofErr w:type="spellStart"/>
+      <w:r>
+        <w:rPr>
+          <w:lang w:val="es-ES"/>
+        </w:rPr>
+        <w:t>accordingly</w:t>
+      </w:r>
+      <w:proofErr w:type="spellEnd"/>
+      <w:r>
+        <w:rPr>
+          <w:lang w:val="es-ES"/>
+        </w:rPr>
+        <w:t xml:space="preserve">, as </w:t>
+      </w:r>
+      <w:proofErr w:type="spellStart"/>
+      <w:r>
+        <w:rPr>
+          <w:lang w:val="es-ES"/>
+        </w:rPr>
+        <w:t>well</w:t>
+      </w:r>
+      <w:proofErr w:type="spellEnd"/>
+      <w:r>
+        <w:rPr>
+          <w:lang w:val="es-ES"/>
+        </w:rPr>
+        <w:t xml:space="preserve"> as </w:t>
+      </w:r>
+      <w:proofErr w:type="spellStart"/>
+      <w:r>
+        <w:rPr>
+          <w:lang w:val="es-ES"/>
+        </w:rPr>
+        <w:t>triggering</w:t>
+      </w:r>
+      <w:proofErr w:type="spellEnd"/>
+      <w:r>
+        <w:rPr>
+          <w:lang w:val="es-ES"/>
+        </w:rPr>
+        <w:t xml:space="preserve"> a </w:t>
+      </w:r>
+      <w:proofErr w:type="spellStart"/>
+      <w:r>
+        <w:rPr>
+          <w:lang w:val="es-ES"/>
+        </w:rPr>
+        <w:t>validation</w:t>
+      </w:r>
+      <w:proofErr w:type="spellEnd"/>
+      <w:r>
+        <w:rPr>
+          <w:lang w:val="es-ES"/>
+        </w:rPr>
+        <w:t xml:space="preserve"> error </w:t>
+      </w:r>
+      <w:proofErr w:type="spellStart"/>
+      <w:r>
+        <w:rPr>
+          <w:lang w:val="es-ES"/>
+        </w:rPr>
+        <w:t>if</w:t>
+      </w:r>
+      <w:proofErr w:type="spellEnd"/>
+      <w:r>
+        <w:rPr>
+          <w:lang w:val="es-ES"/>
+        </w:rPr>
+        <w:t xml:space="preserve"> </w:t>
+      </w:r>
+      <w:proofErr w:type="spellStart"/>
+      <w:r>
+        <w:rPr>
+          <w:lang w:val="es-ES"/>
+        </w:rPr>
+        <w:t>the</w:t>
+      </w:r>
+      <w:proofErr w:type="spellEnd"/>
+      <w:r>
+        <w:rPr>
+          <w:lang w:val="es-ES"/>
+        </w:rPr>
+        <w:t xml:space="preserve"> total </w:t>
+      </w:r>
+      <w:proofErr w:type="spellStart"/>
+      <w:r>
+        <w:rPr>
+          <w:lang w:val="es-ES"/>
+        </w:rPr>
+        <w:t>currency</w:t>
+      </w:r>
+      <w:proofErr w:type="spellEnd"/>
+      <w:r>
+        <w:rPr>
+          <w:lang w:val="es-ES"/>
+        </w:rPr>
+        <w:t xml:space="preserve"> </w:t>
+      </w:r>
+      <w:proofErr w:type="spellStart"/>
+      <w:r>
+        <w:rPr>
+          <w:lang w:val="es-ES"/>
+        </w:rPr>
+        <w:t>amount</w:t>
+      </w:r>
+      <w:proofErr w:type="spellEnd"/>
+      <w:r>
+        <w:rPr>
+          <w:lang w:val="es-ES"/>
+        </w:rPr>
+        <w:t xml:space="preserve"> </w:t>
+      </w:r>
+      <w:proofErr w:type="spellStart"/>
+      <w:r>
+        <w:rPr>
+          <w:lang w:val="es-ES"/>
+        </w:rPr>
+        <w:t>reaches</w:t>
+      </w:r>
+      <w:proofErr w:type="spellEnd"/>
+      <w:r>
+        <w:rPr>
+          <w:lang w:val="es-ES"/>
+        </w:rPr>
+        <w:t xml:space="preserve"> </w:t>
+      </w:r>
+      <w:proofErr w:type="spellStart"/>
+      <w:r>
+        <w:rPr>
+          <w:lang w:val="es-ES"/>
+        </w:rPr>
+        <w:t>the</w:t>
+      </w:r>
+      <w:proofErr w:type="spellEnd"/>
+      <w:r>
+        <w:rPr>
+          <w:lang w:val="es-ES"/>
+        </w:rPr>
+        <w:t xml:space="preserve"> </w:t>
+      </w:r>
+      <w:proofErr w:type="spellStart"/>
+      <w:r>
+        <w:rPr>
+          <w:lang w:val="es-ES"/>
+        </w:rPr>
+        <w:t>limit</w:t>
+      </w:r>
+      <w:proofErr w:type="spellEnd"/>
+      <w:r>
+        <w:rPr>
+          <w:lang w:val="es-ES"/>
+        </w:rPr>
+        <w:t xml:space="preserve"> </w:t>
+      </w:r>
+      <w:proofErr w:type="spellStart"/>
+      <w:r>
+        <w:rPr>
+          <w:lang w:val="es-ES"/>
+        </w:rPr>
+        <w:t>of</w:t>
+      </w:r>
+      <w:proofErr w:type="spellEnd"/>
+      <w:r>
+        <w:rPr>
+          <w:lang w:val="es-ES"/>
+        </w:rPr>
+        <w:t xml:space="preserve"> 1,000,000. </w:t>
+      </w:r>
+      <w:proofErr w:type="spellStart"/>
+      <w:proofErr w:type="gramStart"/>
+      <w:r>
+        <w:rPr>
+          <w:lang w:val="es-ES"/>
+        </w:rPr>
+        <w:t>The</w:t>
+      </w:r>
+      <w:proofErr w:type="spellEnd"/>
+      <w:r>
+        <w:rPr>
+          <w:lang w:val="es-ES"/>
+        </w:rPr>
+        <w:t xml:space="preserve"> .</w:t>
+      </w:r>
+      <w:proofErr w:type="spellStart"/>
+      <w:r>
+        <w:rPr>
+          <w:lang w:val="es-ES"/>
+        </w:rPr>
+        <w:t>hack</w:t>
+      </w:r>
+      <w:proofErr w:type="spellEnd"/>
+      <w:proofErr w:type="gramEnd"/>
+      <w:r>
+        <w:rPr>
+          <w:lang w:val="es-ES"/>
+        </w:rPr>
+        <w:t xml:space="preserve"> </w:t>
+      </w:r>
+      <w:proofErr w:type="spellStart"/>
+      <w:r>
+        <w:rPr>
+          <w:lang w:val="es-ES"/>
+        </w:rPr>
+        <w:t>tests</w:t>
+      </w:r>
+      <w:proofErr w:type="spellEnd"/>
+      <w:r>
+        <w:rPr>
+          <w:lang w:val="es-ES"/>
+        </w:rPr>
+        <w:t xml:space="preserve"> </w:t>
+      </w:r>
+      <w:proofErr w:type="spellStart"/>
+      <w:r>
+        <w:rPr>
+          <w:lang w:val="es-ES"/>
+        </w:rPr>
+        <w:t>include</w:t>
+      </w:r>
+      <w:proofErr w:type="spellEnd"/>
+      <w:r>
+        <w:rPr>
+          <w:lang w:val="es-ES"/>
+        </w:rPr>
+        <w:t xml:space="preserve"> </w:t>
+      </w:r>
+      <w:proofErr w:type="spellStart"/>
+      <w:r>
+        <w:rPr>
+          <w:lang w:val="es-ES"/>
+        </w:rPr>
+        <w:t>attempts</w:t>
+      </w:r>
+      <w:proofErr w:type="spellEnd"/>
+      <w:r>
+        <w:rPr>
+          <w:lang w:val="es-ES"/>
+        </w:rPr>
+        <w:t xml:space="preserve"> </w:t>
+      </w:r>
+      <w:proofErr w:type="spellStart"/>
+      <w:r>
+        <w:rPr>
+          <w:lang w:val="es-ES"/>
+        </w:rPr>
+        <w:t>by</w:t>
+      </w:r>
+      <w:proofErr w:type="spellEnd"/>
+      <w:r>
+        <w:rPr>
+          <w:lang w:val="es-ES"/>
+        </w:rPr>
+        <w:t xml:space="preserve"> </w:t>
+      </w:r>
+      <w:proofErr w:type="spellStart"/>
+      <w:r>
+        <w:rPr>
+          <w:lang w:val="es-ES"/>
+        </w:rPr>
+        <w:t>various</w:t>
+      </w:r>
+      <w:proofErr w:type="spellEnd"/>
+      <w:r>
+        <w:rPr>
+          <w:lang w:val="es-ES"/>
+        </w:rPr>
+        <w:t xml:space="preserve"> </w:t>
+      </w:r>
+      <w:proofErr w:type="spellStart"/>
+      <w:r>
+        <w:rPr>
+          <w:lang w:val="es-ES"/>
+        </w:rPr>
+        <w:t>types</w:t>
+      </w:r>
+      <w:proofErr w:type="spellEnd"/>
+      <w:r>
+        <w:rPr>
+          <w:lang w:val="es-ES"/>
+        </w:rPr>
+        <w:t xml:space="preserve"> </w:t>
+      </w:r>
+      <w:proofErr w:type="spellStart"/>
+      <w:r>
+        <w:rPr>
+          <w:lang w:val="es-ES"/>
+        </w:rPr>
+        <w:t>of</w:t>
+      </w:r>
+      <w:proofErr w:type="spellEnd"/>
+      <w:r>
+        <w:rPr>
+          <w:lang w:val="es-ES"/>
+        </w:rPr>
+        <w:t xml:space="preserve"> </w:t>
+      </w:r>
+      <w:proofErr w:type="spellStart"/>
+      <w:r>
+        <w:rPr>
+          <w:lang w:val="es-ES"/>
+        </w:rPr>
+        <w:t>users</w:t>
+      </w:r>
+      <w:proofErr w:type="spellEnd"/>
+      <w:r>
+        <w:rPr>
+          <w:lang w:val="es-ES"/>
+        </w:rPr>
+        <w:t xml:space="preserve"> (</w:t>
+      </w:r>
+      <w:proofErr w:type="spellStart"/>
+      <w:r>
+        <w:rPr>
+          <w:lang w:val="es-ES"/>
+        </w:rPr>
+        <w:t>different</w:t>
+      </w:r>
+      <w:proofErr w:type="spellEnd"/>
+      <w:r>
+        <w:rPr>
+          <w:lang w:val="es-ES"/>
+        </w:rPr>
+        <w:t xml:space="preserve"> role, </w:t>
+      </w:r>
+      <w:proofErr w:type="spellStart"/>
+      <w:r>
+        <w:rPr>
+          <w:lang w:val="es-ES"/>
+        </w:rPr>
+        <w:t>unauthenticated</w:t>
+      </w:r>
+      <w:proofErr w:type="spellEnd"/>
+      <w:r>
+        <w:rPr>
+          <w:lang w:val="es-ES"/>
+        </w:rPr>
+        <w:t xml:space="preserve">, </w:t>
+      </w:r>
+      <w:proofErr w:type="spellStart"/>
+      <w:r>
+        <w:rPr>
+          <w:lang w:val="es-ES"/>
+        </w:rPr>
+        <w:t>same</w:t>
+      </w:r>
+      <w:proofErr w:type="spellEnd"/>
+      <w:r>
+        <w:rPr>
+          <w:lang w:val="es-ES"/>
+        </w:rPr>
+        <w:t xml:space="preserve"> role </w:t>
+      </w:r>
+      <w:proofErr w:type="spellStart"/>
+      <w:r>
+        <w:rPr>
+          <w:lang w:val="es-ES"/>
+        </w:rPr>
+        <w:t>but</w:t>
+      </w:r>
+      <w:proofErr w:type="spellEnd"/>
+      <w:r>
+        <w:rPr>
+          <w:lang w:val="es-ES"/>
+        </w:rPr>
+        <w:t xml:space="preserve"> </w:t>
+      </w:r>
+      <w:proofErr w:type="spellStart"/>
+      <w:r>
+        <w:rPr>
+          <w:lang w:val="es-ES"/>
+        </w:rPr>
+        <w:t>different</w:t>
+      </w:r>
+      <w:proofErr w:type="spellEnd"/>
+      <w:r>
+        <w:rPr>
+          <w:lang w:val="es-ES"/>
+        </w:rPr>
+        <w:t xml:space="preserve"> </w:t>
+      </w:r>
+      <w:proofErr w:type="spellStart"/>
+      <w:r>
+        <w:rPr>
+          <w:lang w:val="es-ES"/>
+        </w:rPr>
+        <w:t>customer</w:t>
+      </w:r>
+      <w:proofErr w:type="spellEnd"/>
+      <w:r>
+        <w:rPr>
+          <w:lang w:val="es-ES"/>
+        </w:rPr>
+        <w:t xml:space="preserve">) and </w:t>
+      </w:r>
+      <w:proofErr w:type="spellStart"/>
+      <w:r>
+        <w:rPr>
+          <w:lang w:val="es-ES"/>
+        </w:rPr>
+        <w:t>cover</w:t>
+      </w:r>
+      <w:proofErr w:type="spellEnd"/>
+      <w:r>
+        <w:rPr>
+          <w:lang w:val="es-ES"/>
+        </w:rPr>
+        <w:t xml:space="preserve"> </w:t>
+      </w:r>
+      <w:proofErr w:type="spellStart"/>
+      <w:r>
+        <w:rPr>
+          <w:lang w:val="es-ES"/>
+        </w:rPr>
+        <w:t>both</w:t>
+      </w:r>
+      <w:proofErr w:type="spellEnd"/>
+      <w:r>
+        <w:rPr>
+          <w:lang w:val="es-ES"/>
+        </w:rPr>
+        <w:t xml:space="preserve"> </w:t>
+      </w:r>
+      <w:proofErr w:type="spellStart"/>
+      <w:r>
+        <w:rPr>
+          <w:lang w:val="es-ES"/>
+        </w:rPr>
+        <w:t>published</w:t>
+      </w:r>
+      <w:proofErr w:type="spellEnd"/>
+      <w:r>
+        <w:rPr>
+          <w:lang w:val="es-ES"/>
+        </w:rPr>
+        <w:t xml:space="preserve"> and </w:t>
+      </w:r>
+      <w:proofErr w:type="spellStart"/>
+      <w:r>
+        <w:rPr>
+          <w:lang w:val="es-ES"/>
+        </w:rPr>
+        <w:t>unpublished</w:t>
+      </w:r>
+      <w:proofErr w:type="spellEnd"/>
+      <w:r>
+        <w:rPr>
+          <w:lang w:val="es-ES"/>
+        </w:rPr>
+        <w:t xml:space="preserve"> </w:t>
+      </w:r>
+      <w:proofErr w:type="spellStart"/>
+      <w:r>
+        <w:rPr>
+          <w:lang w:val="es-ES"/>
+        </w:rPr>
+        <w:t>scenarios</w:t>
+      </w:r>
+      <w:proofErr w:type="spellEnd"/>
+      <w:r>
+        <w:rPr>
+          <w:lang w:val="es-ES"/>
+        </w:rPr>
+        <w:t>.</w:t>
+      </w:r>
+      <w:r>
+        <w:rPr>
+          <w:lang w:val="es-ES"/>
+        </w:rPr>
+        <w:t xml:space="preserve"> </w:t>
+      </w:r>
+      <w:r>
+        <w:rPr>
+          <w:lang w:val="es-ES"/>
+        </w:rPr>
+        <w:br/>
+      </w:r>
+      <w:r>
+        <w:t>I also tested by modifying the fields via F12, using various invalid passengers — including unpublished ones, null values (e.g., id = 0 or an arbitrary id like 121331), passengers belonging to a different customer, or those already assigned to the same booking.</w:t>
+      </w:r>
+    </w:p>
+    <w:p>
+      <w:pPr>
+        <w:pStyle w:val="Ttulo4"/>
+      </w:pPr>
+      <w:bookmarkStart w:id="19" w:name="_Toc199190124"/>
+      <w:r>
+        <w:t>Delete</w:t>
+      </w:r>
+      <w:bookmarkEnd w:id="19"/>
+    </w:p>
+    <w:p>
+      <w:r>
+        <w:t>Here I achieved 9</w:t>
+      </w:r>
+      <w:r>
+        <w:t>6</w:t>
+      </w:r>
+      <w:r>
+        <w:t>.</w:t>
+      </w:r>
+      <w:r>
+        <w:t>6</w:t>
+      </w:r>
+      <w:r>
+        <w:t xml:space="preserve">% coverage, even though everything appears green in the coverage report, so I’m not entirely sure why it didn’t reach 100%. </w:t>
+      </w:r>
+      <w:proofErr w:type="gramStart"/>
+      <w:r>
+        <w:t>The .safe</w:t>
+      </w:r>
+      <w:proofErr w:type="gramEnd"/>
+      <w:r>
+        <w:t xml:space="preserve"> test deletes an existing connection, while </w:t>
+      </w:r>
+      <w:proofErr w:type="gramStart"/>
+      <w:r>
+        <w:t>the .hack</w:t>
+      </w:r>
+      <w:proofErr w:type="gramEnd"/>
+      <w:r>
+        <w:t xml:space="preserve"> tests attempt to perform the deletion using unauthenticated users, users with a different role, and users with the same role but not the owner.</w:t>
+      </w:r>
+    </w:p>
     <w:p/>
     <w:p>
       <w:pPr>
@@ -2009,28 +4197,25 @@
           <w:u w:val="single"/>
         </w:rPr>
       </w:pPr>
-      <w:bookmarkStart w:id="33" w:name="_Toc199190138"/>
+      <w:bookmarkStart w:id="20" w:name="_Toc199190125"/>
       <w:r>
         <w:rPr>
           <w:b/>
           <w:bCs/>
           <w:u w:val="single"/>
         </w:rPr>
-        <w:t>Before vs After</w:t>
-      </w:r>
-      <w:bookmarkEnd w:id="33"/>
+        <w:lastRenderedPageBreak/>
+        <w:t>Passenger</w:t>
+      </w:r>
+      <w:bookmarkEnd w:id="20"/>
     </w:p>
-    <w:p/>
     <w:p>
       <w:r>
-        <w:rPr>
-          <w:noProof/>
-        </w:rPr>
         <w:drawing>
-          <wp:inline distT="0" distB="0" distL="0" distR="0" wp14:anchorId="33B20FDC" wp14:editId="03798CBE">
-            <wp:extent cx="5391902" cy="3467584"/>
+          <wp:inline distT="0" distB="0" distL="0" distR="0" wp14:anchorId="6BBBB556" wp14:editId="7F8D2E80">
+            <wp:extent cx="4172532" cy="1352739"/>
             <wp:effectExtent l="0" t="0" r="0" b="0"/>
-            <wp:docPr id="309525766" name="Imagen 1" descr="Tabla&#10;&#10;El contenido generado por IA puede ser incorrecto."/>
+            <wp:docPr id="868200956" name="Imagen 1" descr="Interfaz de usuario gráfica, Texto, Aplicación&#10;&#10;El contenido generado por IA puede ser incorrecto."/>
             <wp:cNvGraphicFramePr>
               <a:graphicFrameLocks xmlns:a="http://schemas.openxmlformats.org/drawingml/2006/main" noChangeAspect="1"/>
             </wp:cNvGraphicFramePr>
@@ -2038,7 +4223,7 @@
               <a:graphicData uri="http://schemas.openxmlformats.org/drawingml/2006/picture">
                 <pic:pic xmlns:pic="http://schemas.openxmlformats.org/drawingml/2006/picture">
                   <pic:nvPicPr>
-                    <pic:cNvPr id="309525766" name="Imagen 1" descr="Tabla&#10;&#10;El contenido generado por IA puede ser incorrecto."/>
+                    <pic:cNvPr id="868200956" name="Imagen 1" descr="Interfaz de usuario gráfica, Texto, Aplicación&#10;&#10;El contenido generado por IA puede ser incorrecto."/>
                     <pic:cNvPicPr/>
                   </pic:nvPicPr>
                   <pic:blipFill>
@@ -2050,7 +4235,7 @@
                   <pic:spPr>
                     <a:xfrm>
                       <a:off x="0" y="0"/>
-                      <a:ext cx="5391902" cy="3467584"/>
+                      <a:ext cx="4172532" cy="1352739"/>
                     </a:xfrm>
                     <a:prstGeom prst="rect">
                       <a:avLst/>
@@ -2063,72 +4248,520 @@
         </w:drawing>
       </w:r>
     </w:p>
-    <w:p/>
     <w:p>
-      <w:r>
-        <w:t>We observe through the mean that there is an improvement in time. We also see that the interval time for "</w:t>
-      </w:r>
-      <w:r>
-        <w:t>No Index</w:t>
-      </w:r>
-      <w:r>
-        <w:t xml:space="preserve">" is </w:t>
-      </w:r>
-      <w:r>
-        <w:t>[0.0</w:t>
-      </w:r>
-      <w:r>
-        <w:t>1</w:t>
-      </w:r>
-      <w:r>
-        <w:t>, 0.0</w:t>
-      </w:r>
-      <w:r>
-        <w:t>1</w:t>
-      </w:r>
-      <w:r>
-        <w:t>]</w:t>
-      </w:r>
-      <w:r>
-        <w:t xml:space="preserve"> </w:t>
-      </w:r>
-      <w:r>
-        <w:t>and for "</w:t>
-      </w:r>
-      <w:r>
-        <w:t>Index</w:t>
-      </w:r>
-      <w:r>
-        <w:t xml:space="preserve">" is </w:t>
-      </w:r>
-      <w:r>
-        <w:t>[0.0</w:t>
-      </w:r>
-      <w:r>
-        <w:t>2</w:t>
-      </w:r>
-      <w:r>
-        <w:t>, 0.0</w:t>
-      </w:r>
-      <w:r>
-        <w:t>2</w:t>
-      </w:r>
-      <w:r>
-        <w:t>],</w:t>
+      <w:pPr>
+        <w:pStyle w:val="Ttulo4"/>
+      </w:pPr>
+      <w:bookmarkStart w:id="21" w:name="_Toc199190126"/>
+      <w:r>
+        <w:t>List</w:t>
+      </w:r>
+      <w:bookmarkEnd w:id="21"/>
+    </w:p>
+    <w:p>
+      <w:r>
+        <w:t xml:space="preserve">The tests here were simple, so I achieved 100% coverage. I </w:t>
+      </w:r>
+      <w:proofErr w:type="gramStart"/>
+      <w:r>
+        <w:t>created .safe</w:t>
+      </w:r>
+      <w:proofErr w:type="gramEnd"/>
+      <w:r>
+        <w:t xml:space="preserve"> tests to access and view the listing, including pagination and related functionality. </w:t>
+      </w:r>
+      <w:proofErr w:type="gramStart"/>
+      <w:r>
+        <w:t>The .hack</w:t>
+      </w:r>
+      <w:proofErr w:type="gramEnd"/>
+      <w:r>
+        <w:t xml:space="preserve"> tests simulate access attempts by users with different roles, unauthenticated users, and users with the same role accessing their own list.</w:t>
+      </w:r>
+    </w:p>
+    <w:p>
+      <w:pPr>
+        <w:pStyle w:val="Ttulo4"/>
+      </w:pPr>
+      <w:bookmarkStart w:id="22" w:name="_Toc199190127"/>
+      <w:r>
+        <w:t>Show</w:t>
+      </w:r>
+      <w:bookmarkEnd w:id="22"/>
+    </w:p>
+    <w:p>
+      <w:pPr>
+        <w:pStyle w:val="Ttulo4"/>
+        <w:rPr>
+          <w:rFonts w:eastAsiaTheme="minorEastAsia" w:cstheme="minorBidi"/>
+          <w:i w:val="0"/>
+          <w:iCs w:val="0"/>
+          <w:color w:val="auto"/>
+        </w:rPr>
+      </w:pPr>
+      <w:bookmarkStart w:id="23" w:name="_Toc199190128"/>
+      <w:r>
+        <w:rPr>
+          <w:rFonts w:eastAsiaTheme="minorEastAsia" w:cstheme="minorBidi"/>
+          <w:i w:val="0"/>
+          <w:iCs w:val="0"/>
+          <w:color w:val="auto"/>
+        </w:rPr>
+        <w:t xml:space="preserve">I also achieved 100% coverage here. </w:t>
+      </w:r>
+      <w:proofErr w:type="gramStart"/>
+      <w:r>
+        <w:rPr>
+          <w:rFonts w:eastAsiaTheme="minorEastAsia" w:cstheme="minorBidi"/>
+          <w:i w:val="0"/>
+          <w:iCs w:val="0"/>
+          <w:color w:val="auto"/>
+        </w:rPr>
+        <w:t>The .safe</w:t>
+      </w:r>
+      <w:proofErr w:type="gramEnd"/>
+      <w:r>
+        <w:rPr>
+          <w:rFonts w:eastAsiaTheme="minorEastAsia" w:cstheme="minorBidi"/>
+          <w:i w:val="0"/>
+          <w:iCs w:val="0"/>
+          <w:color w:val="auto"/>
+        </w:rPr>
+        <w:t xml:space="preserve"> tests check access to both published and unpublished bookings. </w:t>
+      </w:r>
+      <w:proofErr w:type="gramStart"/>
+      <w:r>
+        <w:rPr>
+          <w:rFonts w:eastAsiaTheme="minorEastAsia" w:cstheme="minorBidi"/>
+          <w:i w:val="0"/>
+          <w:iCs w:val="0"/>
+          <w:color w:val="auto"/>
+        </w:rPr>
+        <w:t>The .hack</w:t>
+      </w:r>
+      <w:proofErr w:type="gramEnd"/>
+      <w:r>
+        <w:rPr>
+          <w:rFonts w:eastAsiaTheme="minorEastAsia" w:cstheme="minorBidi"/>
+          <w:i w:val="0"/>
+          <w:iCs w:val="0"/>
+          <w:color w:val="auto"/>
+        </w:rPr>
+        <w:t xml:space="preserve"> tests include attempts by users with different roles, unauthenticated users, users with the same role but not the creator, </w:t>
+      </w:r>
+      <w:proofErr w:type="gramStart"/>
+      <w:r>
+        <w:rPr>
+          <w:rFonts w:eastAsiaTheme="minorEastAsia" w:cstheme="minorBidi"/>
+          <w:i w:val="0"/>
+          <w:iCs w:val="0"/>
+          <w:color w:val="auto"/>
+        </w:rPr>
+        <w:t>and also</w:t>
+      </w:r>
+      <w:proofErr w:type="gramEnd"/>
+      <w:r>
+        <w:rPr>
+          <w:rFonts w:eastAsiaTheme="minorEastAsia" w:cstheme="minorBidi"/>
+          <w:i w:val="0"/>
+          <w:iCs w:val="0"/>
+          <w:color w:val="auto"/>
+        </w:rPr>
+        <w:t xml:space="preserve"> attempts to access a null booking. All cases were tested for both published and unpublished bookings.</w:t>
+      </w:r>
+      <w:bookmarkEnd w:id="23"/>
+    </w:p>
+    <w:p>
+      <w:pPr>
+        <w:pStyle w:val="Ttulo4"/>
+      </w:pPr>
+      <w:bookmarkStart w:id="24" w:name="_Toc199190129"/>
+      <w:r>
+        <w:t>Create</w:t>
+      </w:r>
+      <w:bookmarkEnd w:id="24"/>
+    </w:p>
+    <w:p>
+      <w:r>
+        <w:t>Here I reached 9</w:t>
+      </w:r>
+      <w:r>
+        <w:t>6.5</w:t>
+      </w:r>
+      <w:r>
+        <w:t xml:space="preserve">% coverage. </w:t>
+      </w:r>
+      <w:proofErr w:type="gramStart"/>
+      <w:r>
+        <w:t>The .safe</w:t>
+      </w:r>
+      <w:proofErr w:type="gramEnd"/>
+      <w:r>
+        <w:t xml:space="preserve"> tests involve executing the operation with different parameters to validate all types of constraints. </w:t>
+      </w:r>
+      <w:proofErr w:type="gramStart"/>
+      <w:r>
+        <w:t>The .hack</w:t>
+      </w:r>
+      <w:proofErr w:type="gramEnd"/>
+      <w:r>
+        <w:t xml:space="preserve"> tests simulate a </w:t>
+      </w:r>
+      <w:proofErr w:type="gramStart"/>
+      <w:r>
+        <w:t>create</w:t>
+      </w:r>
+      <w:proofErr w:type="gramEnd"/>
+      <w:r>
+        <w:t xml:space="preserve"> attempt by a user with a different role, an unauthenticated user, and a user with the same role accessing their own </w:t>
+      </w:r>
+      <w:proofErr w:type="gramStart"/>
+      <w:r>
+        <w:t>create</w:t>
+      </w:r>
+      <w:proofErr w:type="gramEnd"/>
+      <w:r>
+        <w:t>.</w:t>
+      </w:r>
+    </w:p>
+    <w:p>
+      <w:pPr>
+        <w:pStyle w:val="Ttulo4"/>
+      </w:pPr>
+      <w:bookmarkStart w:id="25" w:name="_Toc199190130"/>
+      <w:r>
+        <w:t>Delete</w:t>
+      </w:r>
+      <w:bookmarkEnd w:id="25"/>
+    </w:p>
+    <w:p>
+      <w:r>
+        <w:t>For delete, I obtained 9</w:t>
+      </w:r>
+      <w:r>
+        <w:t>6</w:t>
+      </w:r>
+      <w:r>
+        <w:t xml:space="preserve">.9% coverage. </w:t>
+      </w:r>
+      <w:proofErr w:type="gramStart"/>
+      <w:r>
+        <w:t>The .safe</w:t>
+      </w:r>
+      <w:proofErr w:type="gramEnd"/>
+      <w:r>
+        <w:t xml:space="preserve"> tests verify </w:t>
+      </w:r>
+      <w:proofErr w:type="gramStart"/>
+      <w:r>
+        <w:t>deletion</w:t>
+      </w:r>
+      <w:proofErr w:type="gramEnd"/>
+      <w:r>
+        <w:t xml:space="preserve"> of an unpublished booking. </w:t>
+      </w:r>
+      <w:proofErr w:type="gramStart"/>
+      <w:r>
+        <w:t>The .hack</w:t>
+      </w:r>
+      <w:proofErr w:type="gramEnd"/>
+      <w:r>
+        <w:t xml:space="preserve"> tests cover access attempts by unauthenticated users, users with a different role, users with the same role but not the creator, and attempts to delete a published </w:t>
+      </w:r>
+      <w:r>
+        <w:t>passenger</w:t>
+      </w:r>
+      <w:r>
+        <w:t>.</w:t>
+      </w:r>
+    </w:p>
+    <w:p>
+      <w:pPr>
+        <w:pStyle w:val="Ttulo4"/>
+      </w:pPr>
+      <w:bookmarkStart w:id="26" w:name="_Toc199190131"/>
+      <w:r>
+        <w:t>Update</w:t>
+      </w:r>
+      <w:bookmarkEnd w:id="26"/>
+    </w:p>
+    <w:p>
+      <w:pPr>
+        <w:pStyle w:val="Ttulo4"/>
+        <w:rPr>
+          <w:rFonts w:eastAsiaTheme="minorEastAsia" w:cstheme="minorBidi"/>
+          <w:i w:val="0"/>
+          <w:iCs w:val="0"/>
+          <w:color w:val="auto"/>
+        </w:rPr>
+      </w:pPr>
+      <w:bookmarkStart w:id="27" w:name="_Toc199190132"/>
+      <w:r>
+        <w:rPr>
+          <w:rFonts w:eastAsiaTheme="minorEastAsia" w:cstheme="minorBidi"/>
+          <w:i w:val="0"/>
+          <w:iCs w:val="0"/>
+          <w:color w:val="auto"/>
+        </w:rPr>
+        <w:t>Here I achieved 9</w:t>
+      </w:r>
+      <w:r>
+        <w:rPr>
+          <w:rFonts w:eastAsiaTheme="minorEastAsia" w:cstheme="minorBidi"/>
+          <w:i w:val="0"/>
+          <w:iCs w:val="0"/>
+          <w:color w:val="auto"/>
+        </w:rPr>
+        <w:t>6</w:t>
+      </w:r>
+      <w:r>
+        <w:rPr>
+          <w:rFonts w:eastAsiaTheme="minorEastAsia" w:cstheme="minorBidi"/>
+          <w:i w:val="0"/>
+          <w:iCs w:val="0"/>
+          <w:color w:val="auto"/>
+        </w:rPr>
+        <w:t>.</w:t>
+      </w:r>
+      <w:r>
+        <w:rPr>
+          <w:rFonts w:eastAsiaTheme="minorEastAsia" w:cstheme="minorBidi"/>
+          <w:i w:val="0"/>
+          <w:iCs w:val="0"/>
+          <w:color w:val="auto"/>
+        </w:rPr>
+        <w:t>9</w:t>
+      </w:r>
+      <w:r>
+        <w:rPr>
+          <w:rFonts w:eastAsiaTheme="minorEastAsia" w:cstheme="minorBidi"/>
+          <w:i w:val="0"/>
+          <w:iCs w:val="0"/>
+          <w:color w:val="auto"/>
+        </w:rPr>
+        <w:t xml:space="preserve">% coverage. </w:t>
+      </w:r>
+      <w:proofErr w:type="gramStart"/>
+      <w:r>
+        <w:rPr>
+          <w:rFonts w:eastAsiaTheme="minorEastAsia" w:cstheme="minorBidi"/>
+          <w:i w:val="0"/>
+          <w:iCs w:val="0"/>
+          <w:color w:val="auto"/>
+        </w:rPr>
+        <w:t>The .safe</w:t>
+      </w:r>
+      <w:proofErr w:type="gramEnd"/>
+      <w:r>
+        <w:rPr>
+          <w:rFonts w:eastAsiaTheme="minorEastAsia" w:cstheme="minorBidi"/>
+          <w:i w:val="0"/>
+          <w:iCs w:val="0"/>
+          <w:color w:val="auto"/>
+        </w:rPr>
+        <w:t xml:space="preserve"> tests include multiple parameter combinations to trigger all validation paths. </w:t>
+      </w:r>
+      <w:proofErr w:type="gramStart"/>
+      <w:r>
+        <w:rPr>
+          <w:rFonts w:eastAsiaTheme="minorEastAsia" w:cstheme="minorBidi"/>
+          <w:i w:val="0"/>
+          <w:iCs w:val="0"/>
+          <w:color w:val="auto"/>
+        </w:rPr>
+        <w:t>The .hack</w:t>
+      </w:r>
+      <w:proofErr w:type="gramEnd"/>
+      <w:r>
+        <w:rPr>
+          <w:rFonts w:eastAsiaTheme="minorEastAsia" w:cstheme="minorBidi"/>
+          <w:i w:val="0"/>
+          <w:iCs w:val="0"/>
+          <w:color w:val="auto"/>
+        </w:rPr>
+        <w:t xml:space="preserve"> tests involve an authenticated user with a different role, an unauthenticated user, a user with the same role but not the creator, and a published booking.</w:t>
+      </w:r>
+      <w:bookmarkEnd w:id="27"/>
+      <w:r>
+        <w:rPr>
+          <w:rFonts w:eastAsiaTheme="minorEastAsia" w:cstheme="minorBidi"/>
+          <w:i w:val="0"/>
+          <w:iCs w:val="0"/>
+          <w:color w:val="auto"/>
+        </w:rPr>
+        <w:t xml:space="preserve"> </w:t>
       </w:r>
     </w:p>
     <w:p/>
     <w:p>
-      <w:r>
-        <w:rPr>
-          <w:noProof/>
-        </w:rPr>
+      <w:pPr>
+        <w:pStyle w:val="Ttulo4"/>
+      </w:pPr>
+      <w:bookmarkStart w:id="28" w:name="_Toc199190133"/>
+      <w:r>
         <w:lastRenderedPageBreak/>
+        <w:t>Publish</w:t>
+      </w:r>
+      <w:bookmarkEnd w:id="28"/>
+    </w:p>
+    <w:p>
+      <w:pPr>
+        <w:pStyle w:val="Ttulo3"/>
+        <w:rPr>
+          <w:rFonts w:eastAsiaTheme="minorEastAsia" w:cstheme="minorBidi"/>
+          <w:color w:val="auto"/>
+          <w:sz w:val="24"/>
+          <w:szCs w:val="24"/>
+        </w:rPr>
+      </w:pPr>
+      <w:bookmarkStart w:id="29" w:name="_Toc199190134"/>
+      <w:r>
+        <w:rPr>
+          <w:rFonts w:eastAsiaTheme="minorEastAsia" w:cstheme="minorBidi"/>
+          <w:color w:val="auto"/>
+          <w:sz w:val="24"/>
+          <w:szCs w:val="24"/>
+        </w:rPr>
+        <w:t>I obtained 97.</w:t>
+      </w:r>
+      <w:r>
+        <w:rPr>
+          <w:rFonts w:eastAsiaTheme="minorEastAsia" w:cstheme="minorBidi"/>
+          <w:color w:val="auto"/>
+          <w:sz w:val="24"/>
+          <w:szCs w:val="24"/>
+        </w:rPr>
+        <w:t>0</w:t>
+      </w:r>
+      <w:r>
+        <w:rPr>
+          <w:rFonts w:eastAsiaTheme="minorEastAsia" w:cstheme="minorBidi"/>
+          <w:color w:val="auto"/>
+          <w:sz w:val="24"/>
+          <w:szCs w:val="24"/>
+        </w:rPr>
+        <w:t xml:space="preserve">% coverage for the </w:t>
+      </w:r>
+      <w:proofErr w:type="gramStart"/>
+      <w:r>
+        <w:rPr>
+          <w:rFonts w:eastAsiaTheme="minorEastAsia" w:cstheme="minorBidi"/>
+          <w:color w:val="auto"/>
+          <w:sz w:val="24"/>
+          <w:szCs w:val="24"/>
+        </w:rPr>
+        <w:t>publish</w:t>
+      </w:r>
+      <w:proofErr w:type="gramEnd"/>
+      <w:r>
+        <w:rPr>
+          <w:rFonts w:eastAsiaTheme="minorEastAsia" w:cstheme="minorBidi"/>
+          <w:color w:val="auto"/>
+          <w:sz w:val="24"/>
+          <w:szCs w:val="24"/>
+        </w:rPr>
+        <w:t xml:space="preserve"> operation. </w:t>
+      </w:r>
+      <w:proofErr w:type="gramStart"/>
+      <w:r>
+        <w:rPr>
+          <w:rFonts w:eastAsiaTheme="minorEastAsia" w:cstheme="minorBidi"/>
+          <w:color w:val="auto"/>
+          <w:sz w:val="24"/>
+          <w:szCs w:val="24"/>
+        </w:rPr>
+        <w:t>The .safe</w:t>
+      </w:r>
+      <w:proofErr w:type="gramEnd"/>
+      <w:r>
+        <w:rPr>
+          <w:rFonts w:eastAsiaTheme="minorEastAsia" w:cstheme="minorBidi"/>
+          <w:color w:val="auto"/>
+          <w:sz w:val="24"/>
+          <w:szCs w:val="24"/>
+        </w:rPr>
+        <w:t xml:space="preserve"> tests focus on different parameter combinations to validate all constraints. </w:t>
+      </w:r>
+      <w:proofErr w:type="gramStart"/>
+      <w:r>
+        <w:rPr>
+          <w:rFonts w:eastAsiaTheme="minorEastAsia" w:cstheme="minorBidi"/>
+          <w:color w:val="auto"/>
+          <w:sz w:val="24"/>
+          <w:szCs w:val="24"/>
+        </w:rPr>
+        <w:t>The .hack</w:t>
+      </w:r>
+      <w:proofErr w:type="gramEnd"/>
+      <w:r>
+        <w:rPr>
+          <w:rFonts w:eastAsiaTheme="minorEastAsia" w:cstheme="minorBidi"/>
+          <w:color w:val="auto"/>
+          <w:sz w:val="24"/>
+          <w:szCs w:val="24"/>
+        </w:rPr>
+        <w:t xml:space="preserve"> tests include access attempts by an authenticated user with a different role, an unauthenticated user, a user with the same role but not the creator, and a published booking.</w:t>
+      </w:r>
+      <w:bookmarkEnd w:id="29"/>
+      <w:r>
+        <w:rPr>
+          <w:rFonts w:eastAsiaTheme="minorEastAsia" w:cstheme="minorBidi"/>
+          <w:color w:val="auto"/>
+          <w:sz w:val="24"/>
+          <w:szCs w:val="24"/>
+        </w:rPr>
+        <w:t xml:space="preserve"> </w:t>
+      </w:r>
+    </w:p>
+    <w:p/>
+    <w:p>
+      <w:pPr>
+        <w:pStyle w:val="Ttulo2"/>
+        <w:numPr>
+          <w:ilvl w:val="0"/>
+          <w:numId w:val="6"/>
+        </w:numPr>
+      </w:pPr>
+      <w:bookmarkStart w:id="30" w:name="_Toc199190135"/>
+      <w:r>
+        <w:t>Performance Test</w:t>
+      </w:r>
+      <w:bookmarkEnd w:id="30"/>
+    </w:p>
+    <w:p>
+      <w:r>
+        <w:t>The performance has been analyzed before and after the application of the indices, where we see a considerable improvement in performance.</w:t>
+      </w:r>
+    </w:p>
+    <w:p/>
+    <w:p>
+      <w:pPr>
+        <w:pStyle w:val="Ttulo3"/>
+        <w:rPr>
+          <w:b/>
+          <w:bCs/>
+          <w:u w:val="single"/>
+        </w:rPr>
+      </w:pPr>
+      <w:bookmarkStart w:id="31" w:name="_Toc199190136"/>
+      <w:r>
+        <w:rPr>
+          <w:b/>
+          <w:bCs/>
+          <w:u w:val="single"/>
+        </w:rPr>
+        <w:t>No Index</w:t>
+      </w:r>
+      <w:bookmarkEnd w:id="31"/>
+    </w:p>
+    <w:p/>
+    <w:p>
+      <w:r>
         <w:drawing>
-          <wp:inline distT="0" distB="0" distL="0" distR="0" wp14:anchorId="55FC6991" wp14:editId="4EDFB1A8">
-            <wp:extent cx="5896798" cy="2467319"/>
-            <wp:effectExtent l="0" t="0" r="8890" b="9525"/>
-            <wp:docPr id="1171600737" name="Imagen 1" descr="Aplicación&#10;&#10;El contenido generado por IA puede ser incorrecto."/>
+          <wp:inline distT="0" distB="0" distL="0" distR="0" wp14:anchorId="206A7763" wp14:editId="1AE0A960">
+            <wp:extent cx="5943600" cy="2571115"/>
+            <wp:effectExtent l="0" t="0" r="0" b="635"/>
+            <wp:docPr id="854184137" name="Imagen 1" descr="Gráfico&#10;&#10;El contenido generado por IA puede ser incorrecto."/>
             <wp:cNvGraphicFramePr>
               <a:graphicFrameLocks xmlns:a="http://schemas.openxmlformats.org/drawingml/2006/main" noChangeAspect="1"/>
             </wp:cNvGraphicFramePr>
@@ -2136,7 +4769,7 @@
               <a:graphicData uri="http://schemas.openxmlformats.org/drawingml/2006/picture">
                 <pic:pic xmlns:pic="http://schemas.openxmlformats.org/drawingml/2006/picture">
                   <pic:nvPicPr>
-                    <pic:cNvPr id="1171600737" name="Imagen 1" descr="Aplicación&#10;&#10;El contenido generado por IA puede ser incorrecto."/>
+                    <pic:cNvPr id="854184137" name="Imagen 1" descr="Gráfico&#10;&#10;El contenido generado por IA puede ser incorrecto."/>
                     <pic:cNvPicPr/>
                   </pic:nvPicPr>
                   <pic:blipFill>
@@ -2148,7 +4781,7 @@
                   <pic:spPr>
                     <a:xfrm>
                       <a:off x="0" y="0"/>
-                      <a:ext cx="5896798" cy="2467319"/>
+                      <a:ext cx="5943600" cy="2571115"/>
                     </a:xfrm>
                     <a:prstGeom prst="rect">
                       <a:avLst/>
@@ -2161,24 +4794,208 @@
         </w:drawing>
       </w:r>
     </w:p>
+    <w:p>
+      <w:r>
+        <w:t xml:space="preserve">The graph allows us to intuitively observe that the average response time of the different instructions is </w:t>
+      </w:r>
+      <w:proofErr w:type="gramStart"/>
+      <w:r>
+        <w:t>more or less homogeneous</w:t>
+      </w:r>
+      <w:proofErr w:type="gramEnd"/>
+      <w:r>
+        <w:t>, highlighting those operations that need to write to the database and therefore have a considerably longer time.</w:t>
+      </w:r>
+    </w:p>
+    <w:p>
+      <w:pPr>
+        <w:pStyle w:val="Ttulo3"/>
+        <w:rPr>
+          <w:b/>
+          <w:bCs/>
+          <w:u w:val="single"/>
+        </w:rPr>
+      </w:pPr>
+      <w:bookmarkStart w:id="32" w:name="_Toc199190137"/>
+      <w:r>
+        <w:rPr>
+          <w:b/>
+          <w:bCs/>
+          <w:u w:val="single"/>
+        </w:rPr>
+        <w:t>Index</w:t>
+      </w:r>
+      <w:bookmarkEnd w:id="32"/>
+    </w:p>
     <w:p/>
     <w:p>
-      <w:pPr>
-        <w:rPr>
-          <w:u w:val="single"/>
-        </w:rPr>
-      </w:pPr>
-      <w:r>
-        <w:t>We conducted a Z-Test between both, receiving a p-value of 0.0</w:t>
-      </w:r>
-      <w:r>
-        <w:t>08</w:t>
-      </w:r>
-      <w:r>
-        <w:t>. Therefore, we can affirm that we have improved performance.</w:t>
+      <w:r>
+        <w:lastRenderedPageBreak/>
+        <w:drawing>
+          <wp:inline distT="0" distB="0" distL="0" distR="0" wp14:anchorId="07D9E198" wp14:editId="6012DA53">
+            <wp:extent cx="5943600" cy="2667000"/>
+            <wp:effectExtent l="0" t="0" r="0" b="0"/>
+            <wp:docPr id="1648007458" name="Imagen 1" descr="Gráfico&#10;&#10;El contenido generado por IA puede ser incorrecto."/>
+            <wp:cNvGraphicFramePr>
+              <a:graphicFrameLocks xmlns:a="http://schemas.openxmlformats.org/drawingml/2006/main" noChangeAspect="1"/>
+            </wp:cNvGraphicFramePr>
+            <a:graphic xmlns:a="http://schemas.openxmlformats.org/drawingml/2006/main">
+              <a:graphicData uri="http://schemas.openxmlformats.org/drawingml/2006/picture">
+                <pic:pic xmlns:pic="http://schemas.openxmlformats.org/drawingml/2006/picture">
+                  <pic:nvPicPr>
+                    <pic:cNvPr id="1648007458" name="Imagen 1" descr="Gráfico&#10;&#10;El contenido generado por IA puede ser incorrecto."/>
+                    <pic:cNvPicPr/>
+                  </pic:nvPicPr>
+                  <pic:blipFill>
+                    <a:blip r:embed="rId15"/>
+                    <a:stretch>
+                      <a:fillRect/>
+                    </a:stretch>
+                  </pic:blipFill>
+                  <pic:spPr>
+                    <a:xfrm>
+                      <a:off x="0" y="0"/>
+                      <a:ext cx="5943600" cy="2667000"/>
+                    </a:xfrm>
+                    <a:prstGeom prst="rect">
+                      <a:avLst/>
+                    </a:prstGeom>
+                  </pic:spPr>
+                </pic:pic>
+              </a:graphicData>
+            </a:graphic>
+          </wp:inline>
+        </w:drawing>
       </w:r>
     </w:p>
     <w:p/>
+    <w:p/>
+    <w:p>
+      <w:pPr>
+        <w:pStyle w:val="Ttulo3"/>
+        <w:rPr>
+          <w:b/>
+          <w:bCs/>
+          <w:u w:val="single"/>
+        </w:rPr>
+      </w:pPr>
+      <w:bookmarkStart w:id="33" w:name="_Toc199190138"/>
+      <w:r>
+        <w:rPr>
+          <w:b/>
+          <w:bCs/>
+          <w:u w:val="single"/>
+        </w:rPr>
+        <w:t>Before vs After</w:t>
+      </w:r>
+      <w:bookmarkEnd w:id="33"/>
+    </w:p>
+    <w:p/>
+    <w:p>
+      <w:r>
+        <w:drawing>
+          <wp:inline distT="0" distB="0" distL="0" distR="0" wp14:anchorId="4AA0B4B2" wp14:editId="597AA6FC">
+            <wp:extent cx="5943600" cy="2536825"/>
+            <wp:effectExtent l="0" t="0" r="0" b="0"/>
+            <wp:docPr id="31109789" name="Imagen 1" descr="Tabla&#10;&#10;El contenido generado por IA puede ser incorrecto."/>
+            <wp:cNvGraphicFramePr>
+              <a:graphicFrameLocks xmlns:a="http://schemas.openxmlformats.org/drawingml/2006/main" noChangeAspect="1"/>
+            </wp:cNvGraphicFramePr>
+            <a:graphic xmlns:a="http://schemas.openxmlformats.org/drawingml/2006/main">
+              <a:graphicData uri="http://schemas.openxmlformats.org/drawingml/2006/picture">
+                <pic:pic xmlns:pic="http://schemas.openxmlformats.org/drawingml/2006/picture">
+                  <pic:nvPicPr>
+                    <pic:cNvPr id="31109789" name="Imagen 1" descr="Tabla&#10;&#10;El contenido generado por IA puede ser incorrecto."/>
+                    <pic:cNvPicPr/>
+                  </pic:nvPicPr>
+                  <pic:blipFill>
+                    <a:blip r:embed="rId16"/>
+                    <a:stretch>
+                      <a:fillRect/>
+                    </a:stretch>
+                  </pic:blipFill>
+                  <pic:spPr>
+                    <a:xfrm>
+                      <a:off x="0" y="0"/>
+                      <a:ext cx="5943600" cy="2536825"/>
+                    </a:xfrm>
+                    <a:prstGeom prst="rect">
+                      <a:avLst/>
+                    </a:prstGeom>
+                  </pic:spPr>
+                </pic:pic>
+              </a:graphicData>
+            </a:graphic>
+          </wp:inline>
+        </w:drawing>
+      </w:r>
+    </w:p>
+    <w:p/>
+    <w:p>
+      <w:r>
+        <w:lastRenderedPageBreak/>
+        <w:drawing>
+          <wp:inline distT="0" distB="0" distL="0" distR="0" wp14:anchorId="3A991213" wp14:editId="36211DF0">
+            <wp:extent cx="4029637" cy="1886213"/>
+            <wp:effectExtent l="0" t="0" r="9525" b="0"/>
+            <wp:docPr id="147782508" name="Imagen 1" descr="Aplicación, Tabla&#10;&#10;El contenido generado por IA puede ser incorrecto."/>
+            <wp:cNvGraphicFramePr>
+              <a:graphicFrameLocks xmlns:a="http://schemas.openxmlformats.org/drawingml/2006/main" noChangeAspect="1"/>
+            </wp:cNvGraphicFramePr>
+            <a:graphic xmlns:a="http://schemas.openxmlformats.org/drawingml/2006/main">
+              <a:graphicData uri="http://schemas.openxmlformats.org/drawingml/2006/picture">
+                <pic:pic xmlns:pic="http://schemas.openxmlformats.org/drawingml/2006/picture">
+                  <pic:nvPicPr>
+                    <pic:cNvPr id="147782508" name="Imagen 1" descr="Aplicación, Tabla&#10;&#10;El contenido generado por IA puede ser incorrecto."/>
+                    <pic:cNvPicPr/>
+                  </pic:nvPicPr>
+                  <pic:blipFill>
+                    <a:blip r:embed="rId17"/>
+                    <a:stretch>
+                      <a:fillRect/>
+                    </a:stretch>
+                  </pic:blipFill>
+                  <pic:spPr>
+                    <a:xfrm>
+                      <a:off x="0" y="0"/>
+                      <a:ext cx="4029637" cy="1886213"/>
+                    </a:xfrm>
+                    <a:prstGeom prst="rect">
+                      <a:avLst/>
+                    </a:prstGeom>
+                  </pic:spPr>
+                </pic:pic>
+              </a:graphicData>
+            </a:graphic>
+          </wp:inline>
+        </w:drawing>
+      </w:r>
+    </w:p>
+    <w:p>
+      <w:r>
+        <w:t xml:space="preserve">A z-score of 1.3907 was obtained, with a </w:t>
+      </w:r>
+      <w:r>
+        <w:rPr>
+          <w:b/>
+          <w:bCs/>
+        </w:rPr>
+        <w:t>two-tailed p-value of 0.16</w:t>
+      </w:r>
+      <w:r>
+        <w:t xml:space="preserve">. Since this value is greater than the standard significance level (α = 0.05), </w:t>
+      </w:r>
+      <w:r>
+        <w:rPr>
+          <w:b/>
+          <w:bCs/>
+        </w:rPr>
+        <w:t>the differences in execution times with and without indexes are not considered statistically significant</w:t>
+      </w:r>
+      <w:r>
+        <w:t>.</w:t>
+      </w:r>
+    </w:p>
     <w:p>
       <w:pPr>
         <w:pStyle w:val="Ttulo1"/>
@@ -4472,7 +7289,6 @@
   <w:style w:type="character" w:default="1" w:styleId="Fuentedeprrafopredeter">
     <w:name w:val="Default Paragraph Font"/>
     <w:uiPriority w:val="1"/>
-    <w:semiHidden/>
     <w:unhideWhenUsed/>
   </w:style>
   <w:style w:type="table" w:default="1" w:styleId="Tablanormal">
@@ -4837,6 +7653,17 @@
       <w:u w:val="single"/>
     </w:rPr>
   </w:style>
+  <w:style w:type="paragraph" w:styleId="NormalWeb">
+    <w:name w:val="Normal (Web)"/>
+    <w:basedOn w:val="Normal"/>
+    <w:uiPriority w:val="99"/>
+    <w:semiHidden/>
+    <w:unhideWhenUsed/>
+    <w:rsid w:val="007956B8"/>
+    <w:rPr>
+      <w:rFonts w:ascii="Times New Roman" w:hAnsi="Times New Roman" w:cs="Times New Roman"/>
+    </w:rPr>
+  </w:style>
 </w:styles>
 </file>
 

</xml_diff>

<commit_message>
fix: mejora draftMode entidad
</commit_message>
<xml_diff>
--- a/reports/Student #2/C2/Testing Report Student #2.docx
+++ b/reports/Student #2/C2/Testing Report Student #2.docx
@@ -322,19 +322,11 @@
                 <w:rFonts w:ascii="Aptos" w:eastAsia="Aptos" w:hAnsi="Aptos" w:cs="Aptos"/>
               </w:rPr>
             </w:pPr>
-            <w:proofErr w:type="spellStart"/>
             <w:r>
               <w:rPr>
                 <w:lang w:val="es-ES"/>
               </w:rPr>
-              <w:t>Group</w:t>
-            </w:r>
-            <w:proofErr w:type="spellEnd"/>
-            <w:r>
-              <w:rPr>
-                <w:lang w:val="es-ES"/>
-              </w:rPr>
-              <w:t xml:space="preserve">: </w:t>
+              <w:t xml:space="preserve">Group: </w:t>
             </w:r>
             <w:r>
               <w:t>C1.053</w:t>
@@ -362,14 +354,12 @@
                 <w:rFonts w:ascii="Aptos" w:eastAsia="Aptos" w:hAnsi="Aptos" w:cs="Aptos"/>
               </w:rPr>
             </w:pPr>
-            <w:proofErr w:type="spellStart"/>
             <w:r>
               <w:rPr>
                 <w:lang w:val="es-ES"/>
               </w:rPr>
               <w:t>Members</w:t>
             </w:r>
-            <w:proofErr w:type="spellEnd"/>
           </w:p>
         </w:tc>
         <w:tc>
@@ -650,19 +640,11 @@
                 <w:rFonts w:ascii="Aptos" w:eastAsia="Aptos" w:hAnsi="Aptos" w:cs="Aptos"/>
               </w:rPr>
             </w:pPr>
-            <w:proofErr w:type="spellStart"/>
             <w:r>
               <w:rPr>
                 <w:lang w:val="es-ES"/>
               </w:rPr>
-              <w:t>Periáñez</w:t>
-            </w:r>
-            <w:proofErr w:type="spellEnd"/>
-            <w:r>
-              <w:rPr>
-                <w:lang w:val="es-ES"/>
-              </w:rPr>
-              <w:t xml:space="preserve"> Franco, Luis Javier</w:t>
+              <w:t>Periáñez Franco, Luis Javier</w:t>
             </w:r>
           </w:p>
         </w:tc>
@@ -1178,6 +1160,9 @@
     </w:p>
     <w:p>
       <w:r>
+        <w:rPr>
+          <w:noProof/>
+        </w:rPr>
         <w:drawing>
           <wp:inline distT="0" distB="0" distL="0" distR="0" wp14:anchorId="1365FB9E" wp14:editId="279EDAB4">
             <wp:extent cx="4163006" cy="1314633"/>
@@ -1228,23 +1213,7 @@
     </w:p>
     <w:p>
       <w:r>
-        <w:t xml:space="preserve">The tests here were simple, so I achieved 100% coverage. I </w:t>
-      </w:r>
-      <w:proofErr w:type="gramStart"/>
-      <w:r>
-        <w:t>created .safe</w:t>
-      </w:r>
-      <w:proofErr w:type="gramEnd"/>
-      <w:r>
-        <w:t xml:space="preserve"> tests to access and view the listing, including pagination and related functionality. </w:t>
-      </w:r>
-      <w:proofErr w:type="gramStart"/>
-      <w:r>
-        <w:t>The .hack</w:t>
-      </w:r>
-      <w:proofErr w:type="gramEnd"/>
-      <w:r>
-        <w:t xml:space="preserve"> tests simulate access attempts by users with different roles, unauthenticated users, and users with the same role accessing their own list.</w:t>
+        <w:t>The tests here were simple, so I achieved 100% coverage. I created .safe tests to access and view the listing, including pagination and related functionality. The .hack tests simulate access attempts by users with different roles, unauthenticated users, and users with the same role accessing their own list.</w:t>
       </w:r>
     </w:p>
     <w:p>
@@ -1275,19 +1244,62 @@
           <w:iCs w:val="0"/>
           <w:color w:val="auto"/>
         </w:rPr>
-        <w:t xml:space="preserve">I also achieved 100% coverage here. </w:t>
-      </w:r>
-      <w:proofErr w:type="gramStart"/>
-      <w:r>
+        <w:t>I also achieved 100% coverage here. The .safe tests check access to both published and unpublished bookings. The .hack tests include attempts by users with different roles, unauthenticated users, users with the same role but not the creator, and also attempts to access a null booking. All cases were tested for both published and unpublished bookings.</w:t>
+      </w:r>
+      <w:bookmarkEnd w:id="8"/>
+    </w:p>
+    <w:p>
+      <w:pPr>
+        <w:pStyle w:val="Ttulo4"/>
+      </w:pPr>
+      <w:bookmarkStart w:id="9" w:name="_Toc199190114"/>
+      <w:r>
+        <w:t>Create</w:t>
+      </w:r>
+      <w:bookmarkEnd w:id="9"/>
+    </w:p>
+    <w:p>
+      <w:r>
+        <w:t>Here I reached 98% coverage. The .safe tests involve executing the operation with different parameters to validate all types of constraints. The .hack tests simulate a create attempt by a user with a different role, an unauthenticated user, and a user with the same role accessing their own create. I also tested possible client-side manipulations via F12 by tampering with flight-related data.</w:t>
+      </w:r>
+    </w:p>
+    <w:p>
+      <w:pPr>
+        <w:pStyle w:val="Ttulo4"/>
+      </w:pPr>
+      <w:bookmarkStart w:id="10" w:name="_Toc199190115"/>
+      <w:r>
+        <w:t>Delete</w:t>
+      </w:r>
+      <w:bookmarkEnd w:id="10"/>
+    </w:p>
+    <w:p>
+      <w:r>
+        <w:t>For delete, I obtained 97.9% coverage. The .safe tests verify deletion of an unpublished booking. The .hack tests cover access attempts by unauthenticated users, users with a different role, users with the same role but not the creator, and attempts to delete a published booking.</w:t>
+      </w:r>
+    </w:p>
+    <w:p>
+      <w:pPr>
+        <w:pStyle w:val="Ttulo4"/>
+      </w:pPr>
+      <w:bookmarkStart w:id="11" w:name="_Toc199190116"/>
+      <w:r>
+        <w:lastRenderedPageBreak/>
+        <w:t>Update</w:t>
+      </w:r>
+      <w:bookmarkEnd w:id="11"/>
+    </w:p>
+    <w:p>
+      <w:pPr>
+        <w:pStyle w:val="Ttulo4"/>
         <w:rPr>
           <w:rFonts w:eastAsiaTheme="minorEastAsia" w:cstheme="minorBidi"/>
           <w:i w:val="0"/>
           <w:iCs w:val="0"/>
           <w:color w:val="auto"/>
         </w:rPr>
-        <w:t>The .safe</w:t>
-      </w:r>
-      <w:proofErr w:type="gramEnd"/>
+      </w:pPr>
+      <w:bookmarkStart w:id="12" w:name="_Toc199190117"/>
       <w:r>
         <w:rPr>
           <w:rFonts w:eastAsiaTheme="minorEastAsia" w:cstheme="minorBidi"/>
@@ -1295,228 +1307,13 @@
           <w:iCs w:val="0"/>
           <w:color w:val="auto"/>
         </w:rPr>
-        <w:t xml:space="preserve"> tests check access to both published and unpublished bookings. </w:t>
-      </w:r>
-      <w:proofErr w:type="gramStart"/>
-      <w:r>
-        <w:rPr>
-          <w:rFonts w:eastAsiaTheme="minorEastAsia" w:cstheme="minorBidi"/>
-          <w:i w:val="0"/>
-          <w:iCs w:val="0"/>
-          <w:color w:val="auto"/>
-        </w:rPr>
-        <w:t>The .hack</w:t>
-      </w:r>
-      <w:proofErr w:type="gramEnd"/>
-      <w:r>
-        <w:rPr>
-          <w:rFonts w:eastAsiaTheme="minorEastAsia" w:cstheme="minorBidi"/>
-          <w:i w:val="0"/>
-          <w:iCs w:val="0"/>
-          <w:color w:val="auto"/>
-        </w:rPr>
-        <w:t xml:space="preserve"> tests include attempts by users with different roles, unauthenticated users, users with the same role but not the creator, </w:t>
-      </w:r>
-      <w:proofErr w:type="gramStart"/>
-      <w:r>
-        <w:rPr>
-          <w:rFonts w:eastAsiaTheme="minorEastAsia" w:cstheme="minorBidi"/>
-          <w:i w:val="0"/>
-          <w:iCs w:val="0"/>
-          <w:color w:val="auto"/>
-        </w:rPr>
-        <w:t>and also</w:t>
-      </w:r>
-      <w:proofErr w:type="gramEnd"/>
-      <w:r>
-        <w:rPr>
-          <w:rFonts w:eastAsiaTheme="minorEastAsia" w:cstheme="minorBidi"/>
-          <w:i w:val="0"/>
-          <w:iCs w:val="0"/>
-          <w:color w:val="auto"/>
-        </w:rPr>
-        <w:t xml:space="preserve"> attempts to access a null booking. All cases were tested for both published and unpublished bookings.</w:t>
-      </w:r>
-      <w:bookmarkEnd w:id="8"/>
-    </w:p>
-    <w:p>
-      <w:pPr>
-        <w:pStyle w:val="Ttulo4"/>
-      </w:pPr>
-      <w:bookmarkStart w:id="9" w:name="_Toc199190114"/>
-      <w:r>
-        <w:t>Create</w:t>
-      </w:r>
-      <w:bookmarkEnd w:id="9"/>
-    </w:p>
-    <w:p>
-      <w:r>
-        <w:t xml:space="preserve">Here I reached 98% coverage. </w:t>
-      </w:r>
-      <w:proofErr w:type="gramStart"/>
-      <w:r>
-        <w:t>The .safe</w:t>
-      </w:r>
-      <w:proofErr w:type="gramEnd"/>
-      <w:r>
-        <w:t xml:space="preserve"> tests involve executing the operation with different parameters to validate all types of constraints. </w:t>
-      </w:r>
-      <w:proofErr w:type="gramStart"/>
-      <w:r>
-        <w:t>The .hack</w:t>
-      </w:r>
-      <w:proofErr w:type="gramEnd"/>
-      <w:r>
-        <w:t xml:space="preserve"> tests simulate a </w:t>
-      </w:r>
-      <w:proofErr w:type="gramStart"/>
-      <w:r>
-        <w:t>create</w:t>
-      </w:r>
-      <w:proofErr w:type="gramEnd"/>
-      <w:r>
-        <w:t xml:space="preserve"> attempt by a user with a different role, an unauthenticated user, and a user with the same role accessing their own </w:t>
-      </w:r>
-      <w:proofErr w:type="gramStart"/>
-      <w:r>
-        <w:t>create</w:t>
-      </w:r>
-      <w:proofErr w:type="gramEnd"/>
-      <w:r>
-        <w:t>. I also tested possible client-side manipulations via F12 by tampering with flight-related data.</w:t>
-      </w:r>
-    </w:p>
-    <w:p>
-      <w:pPr>
-        <w:pStyle w:val="Ttulo4"/>
-      </w:pPr>
-      <w:bookmarkStart w:id="10" w:name="_Toc199190115"/>
-      <w:r>
-        <w:t>Delete</w:t>
-      </w:r>
-      <w:bookmarkEnd w:id="10"/>
-    </w:p>
-    <w:p>
-      <w:r>
-        <w:t xml:space="preserve">For delete, I obtained 97.9% coverage. </w:t>
-      </w:r>
-      <w:proofErr w:type="gramStart"/>
-      <w:r>
-        <w:t>The .safe</w:t>
-      </w:r>
-      <w:proofErr w:type="gramEnd"/>
-      <w:r>
-        <w:t xml:space="preserve"> tests verify </w:t>
-      </w:r>
-      <w:proofErr w:type="gramStart"/>
-      <w:r>
-        <w:t>deletion</w:t>
-      </w:r>
-      <w:proofErr w:type="gramEnd"/>
-      <w:r>
-        <w:t xml:space="preserve"> of an unpublished booking. </w:t>
-      </w:r>
-      <w:proofErr w:type="gramStart"/>
-      <w:r>
-        <w:t>The .hack</w:t>
-      </w:r>
-      <w:proofErr w:type="gramEnd"/>
-      <w:r>
-        <w:t xml:space="preserve"> tests cover access attempts by unauthenticated users, users with a different role, users with the same role but not the creator, and </w:t>
-      </w:r>
-      <w:proofErr w:type="gramStart"/>
-      <w:r>
-        <w:t>attempts</w:t>
-      </w:r>
-      <w:proofErr w:type="gramEnd"/>
-      <w:r>
-        <w:t xml:space="preserve"> to delete a published booking.</w:t>
-      </w:r>
-    </w:p>
-    <w:p>
-      <w:pPr>
-        <w:pStyle w:val="Ttulo4"/>
-      </w:pPr>
-      <w:bookmarkStart w:id="11" w:name="_Toc199190116"/>
-      <w:r>
-        <w:lastRenderedPageBreak/>
-        <w:t>Update</w:t>
-      </w:r>
-      <w:bookmarkEnd w:id="11"/>
-    </w:p>
-    <w:p>
-      <w:pPr>
-        <w:pStyle w:val="Ttulo4"/>
-        <w:rPr>
-          <w:rFonts w:eastAsiaTheme="minorEastAsia" w:cstheme="minorBidi"/>
-          <w:i w:val="0"/>
-          <w:iCs w:val="0"/>
-          <w:color w:val="auto"/>
-        </w:rPr>
-      </w:pPr>
-      <w:bookmarkStart w:id="12" w:name="_Toc199190117"/>
-      <w:r>
-        <w:rPr>
-          <w:rFonts w:eastAsiaTheme="minorEastAsia" w:cstheme="minorBidi"/>
-          <w:i w:val="0"/>
-          <w:iCs w:val="0"/>
-          <w:color w:val="auto"/>
-        </w:rPr>
-        <w:t xml:space="preserve">Here I achieved 97.3% coverage. </w:t>
-      </w:r>
-      <w:proofErr w:type="gramStart"/>
-      <w:r>
-        <w:rPr>
-          <w:rFonts w:eastAsiaTheme="minorEastAsia" w:cstheme="minorBidi"/>
-          <w:i w:val="0"/>
-          <w:iCs w:val="0"/>
-          <w:color w:val="auto"/>
-        </w:rPr>
-        <w:t>The .safe</w:t>
-      </w:r>
-      <w:proofErr w:type="gramEnd"/>
-      <w:r>
-        <w:rPr>
-          <w:rFonts w:eastAsiaTheme="minorEastAsia" w:cstheme="minorBidi"/>
-          <w:i w:val="0"/>
-          <w:iCs w:val="0"/>
-          <w:color w:val="auto"/>
-        </w:rPr>
-        <w:t xml:space="preserve"> tests include multiple parameter combinations to trigger all validation paths. </w:t>
-      </w:r>
-      <w:proofErr w:type="gramStart"/>
-      <w:r>
-        <w:rPr>
-          <w:rFonts w:eastAsiaTheme="minorEastAsia" w:cstheme="minorBidi"/>
-          <w:i w:val="0"/>
-          <w:iCs w:val="0"/>
-          <w:color w:val="auto"/>
-        </w:rPr>
-        <w:t>The .hack</w:t>
-      </w:r>
-      <w:proofErr w:type="gramEnd"/>
-      <w:r>
-        <w:rPr>
-          <w:rFonts w:eastAsiaTheme="minorEastAsia" w:cstheme="minorBidi"/>
-          <w:i w:val="0"/>
-          <w:iCs w:val="0"/>
-          <w:color w:val="auto"/>
-        </w:rPr>
-        <w:t xml:space="preserve"> tests involve an authenticated user with a different role, an unauthenticated user, a user with the same role but not the creator, and a published booking. Some conditional branches (if statements) couldn’t be fully covered, but I believe they are necessary and justified.</w:t>
+        <w:t>Here I achieved 97.3% coverage. The .safe tests include multiple parameter combinations to trigger all validation paths. The .hack tests involve an authenticated user with a different role, an unauthenticated user, a user with the same role but not the creator, and a published booking. Some conditional branches (if statements) couldn’t be fully covered, but I believe they are necessary and justified.</w:t>
       </w:r>
       <w:bookmarkEnd w:id="12"/>
     </w:p>
     <w:p>
       <w:r>
-        <w:t xml:space="preserve">I also tested by manipulating the fields using F12, altering the Flight field (with an unpublished flight, a null value, and a flight that has already taken place) and the </w:t>
-      </w:r>
-      <w:proofErr w:type="spellStart"/>
-      <w:r>
-        <w:t>PurchaseMoment</w:t>
-      </w:r>
-      <w:proofErr w:type="spellEnd"/>
-      <w:r>
-        <w:t>, to verify that no uncontrolled actions are performed.</w:t>
+        <w:t>I also tested by manipulating the fields using F12, altering the Flight field (with an unpublished flight, a null value, and a flight that has already taken place) and the PurchaseMoment, to verify that no uncontrolled actions are performed.</w:t>
       </w:r>
     </w:p>
     <w:p>
@@ -1547,81 +1344,13 @@
           <w:sz w:val="24"/>
           <w:szCs w:val="24"/>
         </w:rPr>
-        <w:t xml:space="preserve">I obtained 97.6% coverage for the </w:t>
-      </w:r>
-      <w:proofErr w:type="gramStart"/>
-      <w:r>
-        <w:rPr>
-          <w:rFonts w:eastAsiaTheme="minorEastAsia" w:cstheme="minorBidi"/>
-          <w:color w:val="auto"/>
-          <w:sz w:val="24"/>
-          <w:szCs w:val="24"/>
-        </w:rPr>
-        <w:t>publish</w:t>
-      </w:r>
-      <w:proofErr w:type="gramEnd"/>
-      <w:r>
-        <w:rPr>
-          <w:rFonts w:eastAsiaTheme="minorEastAsia" w:cstheme="minorBidi"/>
-          <w:color w:val="auto"/>
-          <w:sz w:val="24"/>
-          <w:szCs w:val="24"/>
-        </w:rPr>
-        <w:t xml:space="preserve"> operation. </w:t>
-      </w:r>
-      <w:proofErr w:type="gramStart"/>
-      <w:r>
-        <w:rPr>
-          <w:rFonts w:eastAsiaTheme="minorEastAsia" w:cstheme="minorBidi"/>
-          <w:color w:val="auto"/>
-          <w:sz w:val="24"/>
-          <w:szCs w:val="24"/>
-        </w:rPr>
-        <w:t>The .safe</w:t>
-      </w:r>
-      <w:proofErr w:type="gramEnd"/>
-      <w:r>
-        <w:rPr>
-          <w:rFonts w:eastAsiaTheme="minorEastAsia" w:cstheme="minorBidi"/>
-          <w:color w:val="auto"/>
-          <w:sz w:val="24"/>
-          <w:szCs w:val="24"/>
-        </w:rPr>
-        <w:t xml:space="preserve"> tests focus on different parameter combinations to validate all constraints. </w:t>
-      </w:r>
-      <w:proofErr w:type="gramStart"/>
-      <w:r>
-        <w:rPr>
-          <w:rFonts w:eastAsiaTheme="minorEastAsia" w:cstheme="minorBidi"/>
-          <w:color w:val="auto"/>
-          <w:sz w:val="24"/>
-          <w:szCs w:val="24"/>
-        </w:rPr>
-        <w:t>The .hack</w:t>
-      </w:r>
-      <w:proofErr w:type="gramEnd"/>
-      <w:r>
-        <w:rPr>
-          <w:rFonts w:eastAsiaTheme="minorEastAsia" w:cstheme="minorBidi"/>
-          <w:color w:val="auto"/>
-          <w:sz w:val="24"/>
-          <w:szCs w:val="24"/>
-        </w:rPr>
-        <w:t xml:space="preserve"> tests include access attempts by an authenticated user with a different role, an unauthenticated user, a user with the same role but not the creator, and a published booking. As with update, there are some conditional clauses I couldn’t fully cover, but I consider them necessary for security and consistency.</w:t>
+        <w:t>I obtained 97.6% coverage for the publish operation. The .safe tests focus on different parameter combinations to validate all constraints. The .hack tests include access attempts by an authenticated user with a different role, an unauthenticated user, a user with the same role but not the creator, and a published booking. As with update, there are some conditional clauses I couldn’t fully cover, but I consider them necessary for security and consistency.</w:t>
       </w:r>
       <w:bookmarkEnd w:id="14"/>
     </w:p>
     <w:p>
       <w:r>
-        <w:t xml:space="preserve">I also tested by manipulating the fields using F12, altering the Flight field (with an unpublished flight, a null value, and a flight that has already taken place) and the </w:t>
-      </w:r>
-      <w:proofErr w:type="spellStart"/>
-      <w:r>
-        <w:t>PurchaseMoment</w:t>
-      </w:r>
-      <w:proofErr w:type="spellEnd"/>
-      <w:r>
-        <w:t>, to verify that no uncontrolled actions are performed.</w:t>
+        <w:t>I also tested by manipulating the fields using F12, altering the Flight field (with an unpublished flight, a null value, and a flight that has already taken place) and the PurchaseMoment, to verify that no uncontrolled actions are performed.</w:t>
       </w:r>
     </w:p>
     <w:p/>
@@ -1635,37 +1364,8 @@
         <w:rPr>
           <w:lang w:val="es-ES"/>
         </w:rPr>
-        <w:t xml:space="preserve">In </w:t>
-      </w:r>
-      <w:proofErr w:type="spellStart"/>
-      <w:r>
-        <w:rPr>
-          <w:lang w:val="es-ES"/>
-        </w:rPr>
-        <w:t>both</w:t>
-      </w:r>
-      <w:proofErr w:type="spellEnd"/>
-      <w:r>
-        <w:rPr>
-          <w:lang w:val="es-ES"/>
-        </w:rPr>
-        <w:t xml:space="preserve"> </w:t>
-      </w:r>
-      <w:proofErr w:type="spellStart"/>
-      <w:r>
-        <w:rPr>
-          <w:lang w:val="es-ES"/>
-        </w:rPr>
-        <w:t>the</w:t>
-      </w:r>
-      <w:proofErr w:type="spellEnd"/>
-      <w:r>
-        <w:rPr>
-          <w:lang w:val="es-ES"/>
-        </w:rPr>
-        <w:t xml:space="preserve"> </w:t>
-      </w:r>
-      <w:proofErr w:type="spellStart"/>
+        <w:t xml:space="preserve">In both the </w:t>
+      </w:r>
       <w:r>
         <w:rPr>
           <w:b/>
@@ -1674,14 +1374,12 @@
         </w:rPr>
         <w:t>Update</w:t>
       </w:r>
-      <w:proofErr w:type="spellEnd"/>
       <w:r>
         <w:rPr>
           <w:lang w:val="es-ES"/>
         </w:rPr>
         <w:t xml:space="preserve"> and </w:t>
       </w:r>
-      <w:proofErr w:type="spellStart"/>
       <w:r>
         <w:rPr>
           <w:b/>
@@ -1690,512 +1388,12 @@
         </w:rPr>
         <w:t>Publish</w:t>
       </w:r>
-      <w:proofErr w:type="spellEnd"/>
       <w:r>
         <w:rPr>
           <w:lang w:val="es-ES"/>
         </w:rPr>
-        <w:t xml:space="preserve"> </w:t>
-      </w:r>
-      <w:proofErr w:type="spellStart"/>
-      <w:r>
-        <w:rPr>
-          <w:lang w:val="es-ES"/>
-        </w:rPr>
-        <w:t>operations</w:t>
-      </w:r>
-      <w:proofErr w:type="spellEnd"/>
-      <w:r>
-        <w:rPr>
-          <w:lang w:val="es-ES"/>
-        </w:rPr>
-        <w:t xml:space="preserve">, </w:t>
-      </w:r>
-      <w:proofErr w:type="spellStart"/>
-      <w:r>
-        <w:rPr>
-          <w:lang w:val="es-ES"/>
-        </w:rPr>
-        <w:t>it</w:t>
-      </w:r>
-      <w:proofErr w:type="spellEnd"/>
-      <w:r>
-        <w:rPr>
-          <w:lang w:val="es-ES"/>
-        </w:rPr>
-        <w:t xml:space="preserve"> </w:t>
-      </w:r>
-      <w:proofErr w:type="spellStart"/>
-      <w:r>
-        <w:rPr>
-          <w:lang w:val="es-ES"/>
-        </w:rPr>
-        <w:t>is</w:t>
-      </w:r>
-      <w:proofErr w:type="spellEnd"/>
-      <w:r>
-        <w:rPr>
-          <w:lang w:val="es-ES"/>
-        </w:rPr>
-        <w:t xml:space="preserve"> </w:t>
-      </w:r>
-      <w:proofErr w:type="spellStart"/>
-      <w:r>
-        <w:rPr>
-          <w:lang w:val="es-ES"/>
-        </w:rPr>
-        <w:t>possible</w:t>
-      </w:r>
-      <w:proofErr w:type="spellEnd"/>
-      <w:r>
-        <w:rPr>
-          <w:lang w:val="es-ES"/>
-        </w:rPr>
-        <w:t xml:space="preserve"> </w:t>
-      </w:r>
-      <w:proofErr w:type="spellStart"/>
-      <w:r>
-        <w:rPr>
-          <w:lang w:val="es-ES"/>
-        </w:rPr>
-        <w:t>to</w:t>
-      </w:r>
-      <w:proofErr w:type="spellEnd"/>
-      <w:r>
-        <w:rPr>
-          <w:lang w:val="es-ES"/>
-        </w:rPr>
-        <w:t xml:space="preserve"> </w:t>
-      </w:r>
-      <w:proofErr w:type="spellStart"/>
-      <w:r>
-        <w:rPr>
-          <w:lang w:val="es-ES"/>
-        </w:rPr>
-        <w:t>modify</w:t>
-      </w:r>
-      <w:proofErr w:type="spellEnd"/>
-      <w:r>
-        <w:rPr>
-          <w:lang w:val="es-ES"/>
-        </w:rPr>
-        <w:t xml:space="preserve"> </w:t>
-      </w:r>
-      <w:proofErr w:type="spellStart"/>
-      <w:r>
-        <w:rPr>
-          <w:lang w:val="es-ES"/>
-        </w:rPr>
-        <w:t>the</w:t>
-      </w:r>
-      <w:proofErr w:type="spellEnd"/>
-      <w:r>
-        <w:rPr>
-          <w:lang w:val="es-ES"/>
-        </w:rPr>
-        <w:t xml:space="preserve"> </w:t>
-      </w:r>
-      <w:proofErr w:type="spellStart"/>
-      <w:r>
-        <w:rPr>
-          <w:lang w:val="es-ES"/>
-        </w:rPr>
-        <w:t>price</w:t>
-      </w:r>
-      <w:proofErr w:type="spellEnd"/>
-      <w:r>
-        <w:rPr>
-          <w:lang w:val="es-ES"/>
-        </w:rPr>
-        <w:t xml:space="preserve"> </w:t>
-      </w:r>
-      <w:proofErr w:type="spellStart"/>
-      <w:r>
-        <w:rPr>
-          <w:lang w:val="es-ES"/>
-        </w:rPr>
-        <w:t>field</w:t>
-      </w:r>
-      <w:proofErr w:type="spellEnd"/>
-      <w:r>
-        <w:rPr>
-          <w:lang w:val="es-ES"/>
-        </w:rPr>
-        <w:t xml:space="preserve"> </w:t>
-      </w:r>
-      <w:proofErr w:type="spellStart"/>
-      <w:r>
-        <w:rPr>
-          <w:lang w:val="es-ES"/>
-        </w:rPr>
-        <w:t>via</w:t>
-      </w:r>
-      <w:proofErr w:type="spellEnd"/>
-      <w:r>
-        <w:rPr>
-          <w:lang w:val="es-ES"/>
-        </w:rPr>
-        <w:t xml:space="preserve"> </w:t>
-      </w:r>
-      <w:proofErr w:type="spellStart"/>
-      <w:r>
-        <w:rPr>
-          <w:lang w:val="es-ES"/>
-        </w:rPr>
-        <w:t>the</w:t>
-      </w:r>
-      <w:proofErr w:type="spellEnd"/>
-      <w:r>
-        <w:rPr>
-          <w:lang w:val="es-ES"/>
-        </w:rPr>
-        <w:t xml:space="preserve"> </w:t>
-      </w:r>
-      <w:proofErr w:type="spellStart"/>
-      <w:r>
-        <w:rPr>
-          <w:lang w:val="es-ES"/>
-        </w:rPr>
-        <w:t>browser’s</w:t>
-      </w:r>
-      <w:proofErr w:type="spellEnd"/>
-      <w:r>
-        <w:rPr>
-          <w:lang w:val="es-ES"/>
-        </w:rPr>
-        <w:t xml:space="preserve"> </w:t>
-      </w:r>
-      <w:proofErr w:type="spellStart"/>
-      <w:r>
-        <w:rPr>
-          <w:lang w:val="es-ES"/>
-        </w:rPr>
-        <w:t>developer</w:t>
-      </w:r>
-      <w:proofErr w:type="spellEnd"/>
-      <w:r>
-        <w:rPr>
-          <w:lang w:val="es-ES"/>
-        </w:rPr>
-        <w:t xml:space="preserve"> </w:t>
-      </w:r>
-      <w:proofErr w:type="spellStart"/>
-      <w:r>
-        <w:rPr>
-          <w:lang w:val="es-ES"/>
-        </w:rPr>
-        <w:t>tools</w:t>
-      </w:r>
-      <w:proofErr w:type="spellEnd"/>
-      <w:r>
-        <w:rPr>
-          <w:lang w:val="es-ES"/>
-        </w:rPr>
-        <w:t xml:space="preserve"> (F12) and </w:t>
-      </w:r>
-      <w:proofErr w:type="spellStart"/>
-      <w:r>
-        <w:rPr>
-          <w:lang w:val="es-ES"/>
-        </w:rPr>
-        <w:t>submit</w:t>
-      </w:r>
-      <w:proofErr w:type="spellEnd"/>
-      <w:r>
-        <w:rPr>
-          <w:lang w:val="es-ES"/>
-        </w:rPr>
-        <w:t xml:space="preserve"> </w:t>
-      </w:r>
-      <w:proofErr w:type="spellStart"/>
-      <w:r>
-        <w:rPr>
-          <w:lang w:val="es-ES"/>
-        </w:rPr>
-        <w:t>the</w:t>
-      </w:r>
-      <w:proofErr w:type="spellEnd"/>
-      <w:r>
-        <w:rPr>
-          <w:lang w:val="es-ES"/>
-        </w:rPr>
-        <w:t xml:space="preserve"> </w:t>
-      </w:r>
-      <w:proofErr w:type="spellStart"/>
-      <w:r>
-        <w:rPr>
-          <w:lang w:val="es-ES"/>
-        </w:rPr>
-        <w:t>form</w:t>
-      </w:r>
-      <w:proofErr w:type="spellEnd"/>
-      <w:r>
-        <w:rPr>
-          <w:lang w:val="es-ES"/>
-        </w:rPr>
-        <w:t xml:space="preserve"> </w:t>
-      </w:r>
-      <w:proofErr w:type="spellStart"/>
-      <w:r>
-        <w:rPr>
-          <w:lang w:val="es-ES"/>
-        </w:rPr>
-        <w:t>without</w:t>
-      </w:r>
-      <w:proofErr w:type="spellEnd"/>
-      <w:r>
-        <w:rPr>
-          <w:lang w:val="es-ES"/>
-        </w:rPr>
-        <w:t xml:space="preserve"> </w:t>
-      </w:r>
-      <w:proofErr w:type="spellStart"/>
-      <w:r>
-        <w:rPr>
-          <w:lang w:val="es-ES"/>
-        </w:rPr>
-        <w:t>triggering</w:t>
-      </w:r>
-      <w:proofErr w:type="spellEnd"/>
-      <w:r>
-        <w:rPr>
-          <w:lang w:val="es-ES"/>
-        </w:rPr>
-        <w:t xml:space="preserve"> </w:t>
-      </w:r>
-      <w:proofErr w:type="spellStart"/>
-      <w:proofErr w:type="gramStart"/>
-      <w:r>
-        <w:rPr>
-          <w:lang w:val="es-ES"/>
-        </w:rPr>
-        <w:t>an</w:t>
-      </w:r>
-      <w:proofErr w:type="spellEnd"/>
-      <w:r>
-        <w:rPr>
-          <w:lang w:val="es-ES"/>
-        </w:rPr>
-        <w:t xml:space="preserve"> error</w:t>
-      </w:r>
-      <w:proofErr w:type="gramEnd"/>
-      <w:r>
-        <w:rPr>
-          <w:lang w:val="es-ES"/>
-        </w:rPr>
-        <w:t xml:space="preserve"> — </w:t>
-      </w:r>
-      <w:proofErr w:type="spellStart"/>
-      <w:r>
-        <w:rPr>
-          <w:lang w:val="es-ES"/>
-        </w:rPr>
-        <w:t>although</w:t>
-      </w:r>
-      <w:proofErr w:type="spellEnd"/>
-      <w:r>
-        <w:rPr>
-          <w:lang w:val="es-ES"/>
-        </w:rPr>
-        <w:t xml:space="preserve"> </w:t>
-      </w:r>
-      <w:proofErr w:type="spellStart"/>
-      <w:r>
-        <w:rPr>
-          <w:lang w:val="es-ES"/>
-        </w:rPr>
-        <w:t>the</w:t>
-      </w:r>
-      <w:proofErr w:type="spellEnd"/>
-      <w:r>
-        <w:rPr>
-          <w:lang w:val="es-ES"/>
-        </w:rPr>
-        <w:t xml:space="preserve"> </w:t>
-      </w:r>
-      <w:proofErr w:type="spellStart"/>
-      <w:r>
-        <w:rPr>
-          <w:lang w:val="es-ES"/>
-        </w:rPr>
-        <w:t>value</w:t>
-      </w:r>
-      <w:proofErr w:type="spellEnd"/>
-      <w:r>
-        <w:rPr>
-          <w:lang w:val="es-ES"/>
-        </w:rPr>
-        <w:t xml:space="preserve"> </w:t>
-      </w:r>
-      <w:proofErr w:type="spellStart"/>
-      <w:r>
-        <w:rPr>
-          <w:lang w:val="es-ES"/>
-        </w:rPr>
-        <w:t>is</w:t>
-      </w:r>
-      <w:proofErr w:type="spellEnd"/>
-      <w:r>
-        <w:rPr>
-          <w:lang w:val="es-ES"/>
-        </w:rPr>
-        <w:t xml:space="preserve"> </w:t>
-      </w:r>
-      <w:proofErr w:type="spellStart"/>
-      <w:r>
-        <w:rPr>
-          <w:lang w:val="es-ES"/>
-        </w:rPr>
-        <w:t>not</w:t>
-      </w:r>
-      <w:proofErr w:type="spellEnd"/>
-      <w:r>
-        <w:rPr>
-          <w:lang w:val="es-ES"/>
-        </w:rPr>
-        <w:t xml:space="preserve"> </w:t>
-      </w:r>
-      <w:proofErr w:type="spellStart"/>
-      <w:r>
-        <w:rPr>
-          <w:lang w:val="es-ES"/>
-        </w:rPr>
-        <w:t>actually</w:t>
-      </w:r>
-      <w:proofErr w:type="spellEnd"/>
-      <w:r>
-        <w:rPr>
-          <w:lang w:val="es-ES"/>
-        </w:rPr>
-        <w:t xml:space="preserve"> </w:t>
-      </w:r>
-      <w:proofErr w:type="spellStart"/>
-      <w:r>
-        <w:rPr>
-          <w:lang w:val="es-ES"/>
-        </w:rPr>
-        <w:t>updated</w:t>
-      </w:r>
-      <w:proofErr w:type="spellEnd"/>
-      <w:r>
-        <w:rPr>
-          <w:lang w:val="es-ES"/>
-        </w:rPr>
-        <w:t xml:space="preserve">. </w:t>
-      </w:r>
-      <w:proofErr w:type="spellStart"/>
-      <w:r>
-        <w:rPr>
-          <w:lang w:val="es-ES"/>
-        </w:rPr>
-        <w:t>Initially</w:t>
-      </w:r>
-      <w:proofErr w:type="spellEnd"/>
-      <w:r>
-        <w:rPr>
-          <w:lang w:val="es-ES"/>
-        </w:rPr>
-        <w:t xml:space="preserve">, I </w:t>
-      </w:r>
-      <w:proofErr w:type="spellStart"/>
-      <w:r>
-        <w:rPr>
-          <w:lang w:val="es-ES"/>
-        </w:rPr>
-        <w:t>had</w:t>
-      </w:r>
-      <w:proofErr w:type="spellEnd"/>
-      <w:r>
-        <w:rPr>
-          <w:lang w:val="es-ES"/>
-        </w:rPr>
-        <w:t xml:space="preserve"> </w:t>
-      </w:r>
-      <w:proofErr w:type="spellStart"/>
-      <w:r>
-        <w:rPr>
-          <w:lang w:val="es-ES"/>
-        </w:rPr>
-        <w:t>designed</w:t>
-      </w:r>
-      <w:proofErr w:type="spellEnd"/>
-      <w:r>
-        <w:rPr>
-          <w:lang w:val="es-ES"/>
-        </w:rPr>
-        <w:t xml:space="preserve"> </w:t>
-      </w:r>
-      <w:proofErr w:type="spellStart"/>
-      <w:r>
-        <w:rPr>
-          <w:lang w:val="es-ES"/>
-        </w:rPr>
-        <w:t>the</w:t>
-      </w:r>
-      <w:proofErr w:type="spellEnd"/>
-      <w:r>
-        <w:rPr>
-          <w:lang w:val="es-ES"/>
-        </w:rPr>
-        <w:t xml:space="preserve"> </w:t>
-      </w:r>
-      <w:proofErr w:type="spellStart"/>
-      <w:r>
-        <w:rPr>
-          <w:lang w:val="es-ES"/>
-        </w:rPr>
-        <w:t>system</w:t>
-      </w:r>
-      <w:proofErr w:type="spellEnd"/>
-      <w:r>
-        <w:rPr>
-          <w:lang w:val="es-ES"/>
-        </w:rPr>
-        <w:t xml:space="preserve"> </w:t>
-      </w:r>
-      <w:proofErr w:type="spellStart"/>
-      <w:r>
-        <w:rPr>
-          <w:lang w:val="es-ES"/>
-        </w:rPr>
-        <w:t>to</w:t>
-      </w:r>
-      <w:proofErr w:type="spellEnd"/>
-      <w:r>
-        <w:rPr>
-          <w:lang w:val="es-ES"/>
-        </w:rPr>
-        <w:t xml:space="preserve"> </w:t>
-      </w:r>
-      <w:proofErr w:type="spellStart"/>
-      <w:r>
-        <w:rPr>
-          <w:lang w:val="es-ES"/>
-        </w:rPr>
-        <w:t>throw</w:t>
-      </w:r>
-      <w:proofErr w:type="spellEnd"/>
-      <w:r>
-        <w:rPr>
-          <w:lang w:val="es-ES"/>
-        </w:rPr>
-        <w:t xml:space="preserve"> </w:t>
-      </w:r>
-      <w:proofErr w:type="spellStart"/>
-      <w:r>
-        <w:rPr>
-          <w:lang w:val="es-ES"/>
-        </w:rPr>
-        <w:t>an</w:t>
-      </w:r>
-      <w:proofErr w:type="spellEnd"/>
-      <w:r>
-        <w:rPr>
-          <w:lang w:val="es-ES"/>
-        </w:rPr>
-        <w:t xml:space="preserve"> </w:t>
-      </w:r>
-      <w:proofErr w:type="spellStart"/>
+        <w:t xml:space="preserve"> operations, it is possible to modify the price field via the browser’s developer tools (F12) and submit the form without triggering an error — although the value is not actually updated. Initially, I had designed the system to throw an </w:t>
+      </w:r>
       <w:r>
         <w:rPr>
           <w:i/>
@@ -2204,581 +1402,25 @@
         </w:rPr>
         <w:t>unauthorised</w:t>
       </w:r>
-      <w:proofErr w:type="spellEnd"/>
       <w:r>
         <w:rPr>
           <w:lang w:val="es-ES"/>
         </w:rPr>
-        <w:t xml:space="preserve"> error in </w:t>
-      </w:r>
-      <w:proofErr w:type="spellStart"/>
-      <w:r>
+        <w:t xml:space="preserve"> error in such cases, to detect and block any tampering.</w:t>
+      </w:r>
+    </w:p>
+    <w:p>
+      <w:pPr>
         <w:rPr>
           <w:lang w:val="es-ES"/>
         </w:rPr>
-        <w:t>such</w:t>
-      </w:r>
-      <w:proofErr w:type="spellEnd"/>
+      </w:pPr>
       <w:r>
         <w:rPr>
           <w:lang w:val="es-ES"/>
         </w:rPr>
-        <w:t xml:space="preserve"> cases, </w:t>
-      </w:r>
-      <w:proofErr w:type="spellStart"/>
-      <w:r>
-        <w:rPr>
-          <w:lang w:val="es-ES"/>
-        </w:rPr>
-        <w:t>to</w:t>
-      </w:r>
-      <w:proofErr w:type="spellEnd"/>
-      <w:r>
-        <w:rPr>
-          <w:lang w:val="es-ES"/>
-        </w:rPr>
-        <w:t xml:space="preserve"> </w:t>
-      </w:r>
-      <w:proofErr w:type="spellStart"/>
-      <w:r>
-        <w:rPr>
-          <w:lang w:val="es-ES"/>
-        </w:rPr>
-        <w:t>detect</w:t>
-      </w:r>
-      <w:proofErr w:type="spellEnd"/>
-      <w:r>
-        <w:rPr>
-          <w:lang w:val="es-ES"/>
-        </w:rPr>
-        <w:t xml:space="preserve"> and block </w:t>
-      </w:r>
-      <w:proofErr w:type="spellStart"/>
-      <w:r>
-        <w:rPr>
-          <w:lang w:val="es-ES"/>
-        </w:rPr>
-        <w:t>any</w:t>
-      </w:r>
-      <w:proofErr w:type="spellEnd"/>
-      <w:r>
-        <w:rPr>
-          <w:lang w:val="es-ES"/>
-        </w:rPr>
-        <w:t xml:space="preserve"> </w:t>
-      </w:r>
-      <w:proofErr w:type="spellStart"/>
-      <w:r>
-        <w:rPr>
-          <w:lang w:val="es-ES"/>
-        </w:rPr>
-        <w:t>tampering</w:t>
-      </w:r>
-      <w:proofErr w:type="spellEnd"/>
-      <w:r>
-        <w:rPr>
-          <w:lang w:val="es-ES"/>
-        </w:rPr>
-        <w:t>.</w:t>
-      </w:r>
-    </w:p>
-    <w:p>
-      <w:pPr>
-        <w:rPr>
-          <w:lang w:val="es-ES"/>
-        </w:rPr>
-      </w:pPr>
-      <w:proofErr w:type="spellStart"/>
-      <w:r>
-        <w:rPr>
-          <w:lang w:val="es-ES"/>
-        </w:rPr>
-        <w:t>However</w:t>
-      </w:r>
-      <w:proofErr w:type="spellEnd"/>
-      <w:r>
-        <w:rPr>
-          <w:lang w:val="es-ES"/>
-        </w:rPr>
-        <w:t xml:space="preserve">, </w:t>
-      </w:r>
-      <w:proofErr w:type="spellStart"/>
-      <w:r>
-        <w:rPr>
-          <w:lang w:val="es-ES"/>
-        </w:rPr>
-        <w:t>this</w:t>
-      </w:r>
-      <w:proofErr w:type="spellEnd"/>
-      <w:r>
-        <w:rPr>
-          <w:lang w:val="es-ES"/>
-        </w:rPr>
-        <w:t xml:space="preserve"> led </w:t>
-      </w:r>
-      <w:proofErr w:type="spellStart"/>
-      <w:r>
-        <w:rPr>
-          <w:lang w:val="es-ES"/>
-        </w:rPr>
-        <w:t>to</w:t>
-      </w:r>
-      <w:proofErr w:type="spellEnd"/>
-      <w:r>
-        <w:rPr>
-          <w:lang w:val="es-ES"/>
-        </w:rPr>
-        <w:t xml:space="preserve"> </w:t>
-      </w:r>
-      <w:proofErr w:type="spellStart"/>
-      <w:r>
-        <w:rPr>
-          <w:lang w:val="es-ES"/>
-        </w:rPr>
-        <w:t>significant</w:t>
-      </w:r>
-      <w:proofErr w:type="spellEnd"/>
-      <w:r>
-        <w:rPr>
-          <w:lang w:val="es-ES"/>
-        </w:rPr>
-        <w:t xml:space="preserve"> </w:t>
-      </w:r>
-      <w:proofErr w:type="spellStart"/>
-      <w:r>
-        <w:rPr>
-          <w:lang w:val="es-ES"/>
-        </w:rPr>
-        <w:t>issues</w:t>
-      </w:r>
-      <w:proofErr w:type="spellEnd"/>
-      <w:r>
-        <w:rPr>
-          <w:lang w:val="es-ES"/>
-        </w:rPr>
-        <w:t xml:space="preserve"> </w:t>
-      </w:r>
-      <w:proofErr w:type="spellStart"/>
-      <w:r>
-        <w:rPr>
-          <w:lang w:val="es-ES"/>
-        </w:rPr>
-        <w:t>related</w:t>
-      </w:r>
-      <w:proofErr w:type="spellEnd"/>
-      <w:r>
-        <w:rPr>
-          <w:lang w:val="es-ES"/>
-        </w:rPr>
-        <w:t xml:space="preserve"> </w:t>
-      </w:r>
-      <w:proofErr w:type="spellStart"/>
-      <w:r>
-        <w:rPr>
-          <w:lang w:val="es-ES"/>
-        </w:rPr>
-        <w:t>to</w:t>
-      </w:r>
-      <w:proofErr w:type="spellEnd"/>
-      <w:r>
-        <w:rPr>
-          <w:lang w:val="es-ES"/>
-        </w:rPr>
-        <w:t xml:space="preserve"> </w:t>
-      </w:r>
-      <w:proofErr w:type="spellStart"/>
-      <w:r>
-        <w:rPr>
-          <w:lang w:val="es-ES"/>
-        </w:rPr>
-        <w:t>the</w:t>
-      </w:r>
-      <w:proofErr w:type="spellEnd"/>
-      <w:r>
-        <w:rPr>
-          <w:lang w:val="es-ES"/>
-        </w:rPr>
-        <w:t xml:space="preserve"> </w:t>
-      </w:r>
-      <w:proofErr w:type="spellStart"/>
-      <w:r>
-        <w:rPr>
-          <w:lang w:val="es-ES"/>
-        </w:rPr>
-        <w:t>flight</w:t>
-      </w:r>
-      <w:proofErr w:type="spellEnd"/>
-      <w:r>
-        <w:rPr>
-          <w:lang w:val="es-ES"/>
-        </w:rPr>
-        <w:t xml:space="preserve">, </w:t>
-      </w:r>
-      <w:proofErr w:type="spellStart"/>
-      <w:r>
-        <w:rPr>
-          <w:lang w:val="es-ES"/>
-        </w:rPr>
-        <w:t>since</w:t>
-      </w:r>
-      <w:proofErr w:type="spellEnd"/>
-      <w:r>
-        <w:rPr>
-          <w:lang w:val="es-ES"/>
-        </w:rPr>
-        <w:t xml:space="preserve"> </w:t>
-      </w:r>
-      <w:proofErr w:type="spellStart"/>
-      <w:r>
-        <w:rPr>
-          <w:lang w:val="es-ES"/>
-        </w:rPr>
-        <w:t>the</w:t>
-      </w:r>
-      <w:proofErr w:type="spellEnd"/>
-      <w:r>
-        <w:rPr>
-          <w:lang w:val="es-ES"/>
-        </w:rPr>
-        <w:t xml:space="preserve"> </w:t>
-      </w:r>
-      <w:proofErr w:type="spellStart"/>
-      <w:r>
-        <w:rPr>
-          <w:lang w:val="es-ES"/>
-        </w:rPr>
-        <w:t>price</w:t>
-      </w:r>
-      <w:proofErr w:type="spellEnd"/>
-      <w:r>
-        <w:rPr>
-          <w:lang w:val="es-ES"/>
-        </w:rPr>
-        <w:t xml:space="preserve"> </w:t>
-      </w:r>
-      <w:proofErr w:type="spellStart"/>
-      <w:r>
-        <w:rPr>
-          <w:lang w:val="es-ES"/>
-        </w:rPr>
-        <w:t>is</w:t>
-      </w:r>
-      <w:proofErr w:type="spellEnd"/>
-      <w:r>
-        <w:rPr>
-          <w:lang w:val="es-ES"/>
-        </w:rPr>
-        <w:t xml:space="preserve"> </w:t>
-      </w:r>
-      <w:proofErr w:type="spellStart"/>
-      <w:r>
-        <w:rPr>
-          <w:lang w:val="es-ES"/>
-        </w:rPr>
-        <w:t>directly</w:t>
-      </w:r>
-      <w:proofErr w:type="spellEnd"/>
-      <w:r>
-        <w:rPr>
-          <w:lang w:val="es-ES"/>
-        </w:rPr>
-        <w:t xml:space="preserve"> </w:t>
-      </w:r>
-      <w:proofErr w:type="spellStart"/>
-      <w:r>
-        <w:rPr>
-          <w:lang w:val="es-ES"/>
-        </w:rPr>
-        <w:t>derived</w:t>
-      </w:r>
-      <w:proofErr w:type="spellEnd"/>
-      <w:r>
-        <w:rPr>
-          <w:lang w:val="es-ES"/>
-        </w:rPr>
-        <w:t xml:space="preserve"> </w:t>
-      </w:r>
-      <w:proofErr w:type="spellStart"/>
-      <w:r>
-        <w:rPr>
-          <w:lang w:val="es-ES"/>
-        </w:rPr>
-        <w:t>from</w:t>
-      </w:r>
-      <w:proofErr w:type="spellEnd"/>
-      <w:r>
-        <w:rPr>
-          <w:lang w:val="es-ES"/>
-        </w:rPr>
-        <w:t xml:space="preserve"> </w:t>
-      </w:r>
-      <w:proofErr w:type="spellStart"/>
-      <w:r>
-        <w:rPr>
-          <w:lang w:val="es-ES"/>
-        </w:rPr>
-        <w:t>it</w:t>
-      </w:r>
-      <w:proofErr w:type="spellEnd"/>
-      <w:r>
-        <w:rPr>
-          <w:lang w:val="es-ES"/>
-        </w:rPr>
-        <w:t xml:space="preserve">. </w:t>
-      </w:r>
-      <w:proofErr w:type="spellStart"/>
-      <w:r>
-        <w:rPr>
-          <w:lang w:val="es-ES"/>
-        </w:rPr>
-        <w:t>For</w:t>
-      </w:r>
-      <w:proofErr w:type="spellEnd"/>
-      <w:r>
-        <w:rPr>
-          <w:lang w:val="es-ES"/>
-        </w:rPr>
-        <w:t xml:space="preserve"> </w:t>
-      </w:r>
-      <w:proofErr w:type="spellStart"/>
-      <w:r>
-        <w:rPr>
-          <w:lang w:val="es-ES"/>
-        </w:rPr>
-        <w:t>example</w:t>
-      </w:r>
-      <w:proofErr w:type="spellEnd"/>
-      <w:r>
-        <w:rPr>
-          <w:lang w:val="es-ES"/>
-        </w:rPr>
-        <w:t xml:space="preserve">, </w:t>
-      </w:r>
-      <w:proofErr w:type="spellStart"/>
-      <w:r>
-        <w:rPr>
-          <w:lang w:val="es-ES"/>
-        </w:rPr>
-        <w:t>if</w:t>
-      </w:r>
-      <w:proofErr w:type="spellEnd"/>
-      <w:r>
-        <w:rPr>
-          <w:lang w:val="es-ES"/>
-        </w:rPr>
-        <w:t xml:space="preserve"> </w:t>
-      </w:r>
-      <w:proofErr w:type="spellStart"/>
-      <w:r>
-        <w:rPr>
-          <w:lang w:val="es-ES"/>
-        </w:rPr>
-        <w:t>someone</w:t>
-      </w:r>
-      <w:proofErr w:type="spellEnd"/>
-      <w:r>
-        <w:rPr>
-          <w:lang w:val="es-ES"/>
-        </w:rPr>
-        <w:t xml:space="preserve"> </w:t>
-      </w:r>
-      <w:proofErr w:type="spellStart"/>
-      <w:r>
-        <w:rPr>
-          <w:lang w:val="es-ES"/>
-        </w:rPr>
-        <w:t>hacked</w:t>
-      </w:r>
-      <w:proofErr w:type="spellEnd"/>
-      <w:r>
-        <w:rPr>
-          <w:lang w:val="es-ES"/>
-        </w:rPr>
-        <w:t xml:space="preserve"> </w:t>
-      </w:r>
-      <w:proofErr w:type="spellStart"/>
-      <w:r>
-        <w:rPr>
-          <w:lang w:val="es-ES"/>
-        </w:rPr>
-        <w:t>the</w:t>
-      </w:r>
-      <w:proofErr w:type="spellEnd"/>
-      <w:r>
-        <w:rPr>
-          <w:lang w:val="es-ES"/>
-        </w:rPr>
-        <w:t xml:space="preserve"> </w:t>
-      </w:r>
-      <w:proofErr w:type="spellStart"/>
-      <w:r>
-        <w:rPr>
-          <w:lang w:val="es-ES"/>
-        </w:rPr>
-        <w:t>form</w:t>
-      </w:r>
-      <w:proofErr w:type="spellEnd"/>
-      <w:r>
-        <w:rPr>
-          <w:lang w:val="es-ES"/>
-        </w:rPr>
-        <w:t xml:space="preserve"> </w:t>
-      </w:r>
-      <w:proofErr w:type="spellStart"/>
-      <w:r>
-        <w:rPr>
-          <w:lang w:val="es-ES"/>
-        </w:rPr>
-        <w:t>to</w:t>
-      </w:r>
-      <w:proofErr w:type="spellEnd"/>
-      <w:r>
-        <w:rPr>
-          <w:lang w:val="es-ES"/>
-        </w:rPr>
-        <w:t xml:space="preserve"> set </w:t>
-      </w:r>
-      <w:proofErr w:type="spellStart"/>
-      <w:r>
-        <w:rPr>
-          <w:lang w:val="es-ES"/>
-        </w:rPr>
-        <w:t>the</w:t>
-      </w:r>
-      <w:proofErr w:type="spellEnd"/>
-      <w:r>
-        <w:rPr>
-          <w:lang w:val="es-ES"/>
-        </w:rPr>
-        <w:t xml:space="preserve"> </w:t>
-      </w:r>
-      <w:proofErr w:type="spellStart"/>
-      <w:r>
-        <w:rPr>
-          <w:lang w:val="es-ES"/>
-        </w:rPr>
-        <w:t>flight</w:t>
-      </w:r>
-      <w:proofErr w:type="spellEnd"/>
-      <w:r>
-        <w:rPr>
-          <w:lang w:val="es-ES"/>
-        </w:rPr>
-        <w:t xml:space="preserve"> </w:t>
-      </w:r>
-      <w:proofErr w:type="spellStart"/>
-      <w:r>
-        <w:rPr>
-          <w:lang w:val="es-ES"/>
-        </w:rPr>
-        <w:t>to</w:t>
-      </w:r>
-      <w:proofErr w:type="spellEnd"/>
-      <w:r>
-        <w:rPr>
-          <w:lang w:val="es-ES"/>
-        </w:rPr>
-        <w:t xml:space="preserve"> </w:t>
-      </w:r>
-      <w:proofErr w:type="spellStart"/>
-      <w:r>
-        <w:rPr>
-          <w:lang w:val="es-ES"/>
-        </w:rPr>
-        <w:t>null</w:t>
-      </w:r>
-      <w:proofErr w:type="spellEnd"/>
-      <w:r>
-        <w:rPr>
-          <w:lang w:val="es-ES"/>
-        </w:rPr>
-        <w:t xml:space="preserve">, </w:t>
-      </w:r>
-      <w:proofErr w:type="spellStart"/>
-      <w:r>
-        <w:rPr>
-          <w:lang w:val="es-ES"/>
-        </w:rPr>
-        <w:t>the</w:t>
-      </w:r>
-      <w:proofErr w:type="spellEnd"/>
-      <w:r>
-        <w:rPr>
-          <w:lang w:val="es-ES"/>
-        </w:rPr>
-        <w:t xml:space="preserve"> </w:t>
-      </w:r>
-      <w:proofErr w:type="spellStart"/>
-      <w:r>
-        <w:rPr>
-          <w:lang w:val="es-ES"/>
-        </w:rPr>
-        <w:t>system</w:t>
-      </w:r>
-      <w:proofErr w:type="spellEnd"/>
-      <w:r>
-        <w:rPr>
-          <w:lang w:val="es-ES"/>
-        </w:rPr>
-        <w:t xml:space="preserve"> </w:t>
-      </w:r>
-      <w:proofErr w:type="spellStart"/>
-      <w:r>
-        <w:rPr>
-          <w:lang w:val="es-ES"/>
-        </w:rPr>
-        <w:t>would</w:t>
-      </w:r>
-      <w:proofErr w:type="spellEnd"/>
-      <w:r>
-        <w:rPr>
-          <w:lang w:val="es-ES"/>
-        </w:rPr>
-        <w:t xml:space="preserve"> </w:t>
-      </w:r>
-      <w:proofErr w:type="spellStart"/>
-      <w:r>
-        <w:rPr>
-          <w:lang w:val="es-ES"/>
-        </w:rPr>
-        <w:t>always</w:t>
-      </w:r>
-      <w:proofErr w:type="spellEnd"/>
-      <w:r>
-        <w:rPr>
-          <w:lang w:val="es-ES"/>
-        </w:rPr>
-        <w:t xml:space="preserve"> </w:t>
-      </w:r>
-      <w:proofErr w:type="spellStart"/>
-      <w:r>
-        <w:rPr>
-          <w:lang w:val="es-ES"/>
-        </w:rPr>
-        <w:t>throw</w:t>
-      </w:r>
-      <w:proofErr w:type="spellEnd"/>
-      <w:r>
-        <w:rPr>
-          <w:lang w:val="es-ES"/>
-        </w:rPr>
-        <w:t xml:space="preserve"> </w:t>
-      </w:r>
-      <w:proofErr w:type="spellStart"/>
-      <w:r>
-        <w:rPr>
-          <w:lang w:val="es-ES"/>
-        </w:rPr>
-        <w:t>an</w:t>
-      </w:r>
-      <w:proofErr w:type="spellEnd"/>
-      <w:r>
-        <w:rPr>
-          <w:lang w:val="es-ES"/>
-        </w:rPr>
-        <w:t xml:space="preserve"> </w:t>
-      </w:r>
-      <w:proofErr w:type="spellStart"/>
+        <w:t xml:space="preserve">However, this led to significant issues related to the flight, since the price is directly derived from it. For example, if someone hacked the form to set the flight to null, the system would always throw an </w:t>
+      </w:r>
       <w:r>
         <w:rPr>
           <w:i/>
@@ -2787,481 +1429,24 @@
         </w:rPr>
         <w:t>unauthorised</w:t>
       </w:r>
-      <w:proofErr w:type="spellEnd"/>
       <w:r>
         <w:rPr>
           <w:lang w:val="es-ES"/>
         </w:rPr>
-        <w:t xml:space="preserve"> error </w:t>
-      </w:r>
-      <w:proofErr w:type="spellStart"/>
-      <w:r>
+        <w:t xml:space="preserve"> error because it detected a mismatch in the calculated price, causing the process to break even in legitimate scenarios.</w:t>
+      </w:r>
+    </w:p>
+    <w:p>
+      <w:pPr>
         <w:rPr>
           <w:lang w:val="es-ES"/>
         </w:rPr>
-        <w:t>because</w:t>
-      </w:r>
-      <w:proofErr w:type="spellEnd"/>
+      </w:pPr>
       <w:r>
         <w:rPr>
           <w:lang w:val="es-ES"/>
         </w:rPr>
-        <w:t xml:space="preserve"> </w:t>
-      </w:r>
-      <w:proofErr w:type="spellStart"/>
-      <w:r>
-        <w:rPr>
-          <w:lang w:val="es-ES"/>
-        </w:rPr>
-        <w:t>it</w:t>
-      </w:r>
-      <w:proofErr w:type="spellEnd"/>
-      <w:r>
-        <w:rPr>
-          <w:lang w:val="es-ES"/>
-        </w:rPr>
-        <w:t xml:space="preserve"> </w:t>
-      </w:r>
-      <w:proofErr w:type="spellStart"/>
-      <w:r>
-        <w:rPr>
-          <w:lang w:val="es-ES"/>
-        </w:rPr>
-        <w:t>detected</w:t>
-      </w:r>
-      <w:proofErr w:type="spellEnd"/>
-      <w:r>
-        <w:rPr>
-          <w:lang w:val="es-ES"/>
-        </w:rPr>
-        <w:t xml:space="preserve"> a </w:t>
-      </w:r>
-      <w:proofErr w:type="spellStart"/>
-      <w:r>
-        <w:rPr>
-          <w:lang w:val="es-ES"/>
-        </w:rPr>
-        <w:t>mismatch</w:t>
-      </w:r>
-      <w:proofErr w:type="spellEnd"/>
-      <w:r>
-        <w:rPr>
-          <w:lang w:val="es-ES"/>
-        </w:rPr>
-        <w:t xml:space="preserve"> in </w:t>
-      </w:r>
-      <w:proofErr w:type="spellStart"/>
-      <w:r>
-        <w:rPr>
-          <w:lang w:val="es-ES"/>
-        </w:rPr>
-        <w:t>the</w:t>
-      </w:r>
-      <w:proofErr w:type="spellEnd"/>
-      <w:r>
-        <w:rPr>
-          <w:lang w:val="es-ES"/>
-        </w:rPr>
-        <w:t xml:space="preserve"> </w:t>
-      </w:r>
-      <w:proofErr w:type="spellStart"/>
-      <w:r>
-        <w:rPr>
-          <w:lang w:val="es-ES"/>
-        </w:rPr>
-        <w:t>calculated</w:t>
-      </w:r>
-      <w:proofErr w:type="spellEnd"/>
-      <w:r>
-        <w:rPr>
-          <w:lang w:val="es-ES"/>
-        </w:rPr>
-        <w:t xml:space="preserve"> </w:t>
-      </w:r>
-      <w:proofErr w:type="spellStart"/>
-      <w:r>
-        <w:rPr>
-          <w:lang w:val="es-ES"/>
-        </w:rPr>
-        <w:t>price</w:t>
-      </w:r>
-      <w:proofErr w:type="spellEnd"/>
-      <w:r>
-        <w:rPr>
-          <w:lang w:val="es-ES"/>
-        </w:rPr>
-        <w:t xml:space="preserve">, </w:t>
-      </w:r>
-      <w:proofErr w:type="spellStart"/>
-      <w:r>
-        <w:rPr>
-          <w:lang w:val="es-ES"/>
-        </w:rPr>
-        <w:t>causing</w:t>
-      </w:r>
-      <w:proofErr w:type="spellEnd"/>
-      <w:r>
-        <w:rPr>
-          <w:lang w:val="es-ES"/>
-        </w:rPr>
-        <w:t xml:space="preserve"> </w:t>
-      </w:r>
-      <w:proofErr w:type="spellStart"/>
-      <w:r>
-        <w:rPr>
-          <w:lang w:val="es-ES"/>
-        </w:rPr>
-        <w:t>the</w:t>
-      </w:r>
-      <w:proofErr w:type="spellEnd"/>
-      <w:r>
-        <w:rPr>
-          <w:lang w:val="es-ES"/>
-        </w:rPr>
-        <w:t xml:space="preserve"> </w:t>
-      </w:r>
-      <w:proofErr w:type="spellStart"/>
-      <w:r>
-        <w:rPr>
-          <w:lang w:val="es-ES"/>
-        </w:rPr>
-        <w:t>process</w:t>
-      </w:r>
-      <w:proofErr w:type="spellEnd"/>
-      <w:r>
-        <w:rPr>
-          <w:lang w:val="es-ES"/>
-        </w:rPr>
-        <w:t xml:space="preserve"> </w:t>
-      </w:r>
-      <w:proofErr w:type="spellStart"/>
-      <w:r>
-        <w:rPr>
-          <w:lang w:val="es-ES"/>
-        </w:rPr>
-        <w:t>to</w:t>
-      </w:r>
-      <w:proofErr w:type="spellEnd"/>
-      <w:r>
-        <w:rPr>
-          <w:lang w:val="es-ES"/>
-        </w:rPr>
-        <w:t xml:space="preserve"> break </w:t>
-      </w:r>
-      <w:proofErr w:type="spellStart"/>
-      <w:r>
-        <w:rPr>
-          <w:lang w:val="es-ES"/>
-        </w:rPr>
-        <w:t>even</w:t>
-      </w:r>
-      <w:proofErr w:type="spellEnd"/>
-      <w:r>
-        <w:rPr>
-          <w:lang w:val="es-ES"/>
-        </w:rPr>
-        <w:t xml:space="preserve"> in </w:t>
-      </w:r>
-      <w:proofErr w:type="spellStart"/>
-      <w:r>
-        <w:rPr>
-          <w:lang w:val="es-ES"/>
-        </w:rPr>
-        <w:t>legitimate</w:t>
-      </w:r>
-      <w:proofErr w:type="spellEnd"/>
-      <w:r>
-        <w:rPr>
-          <w:lang w:val="es-ES"/>
-        </w:rPr>
-        <w:t xml:space="preserve"> </w:t>
-      </w:r>
-      <w:proofErr w:type="spellStart"/>
-      <w:r>
-        <w:rPr>
-          <w:lang w:val="es-ES"/>
-        </w:rPr>
-        <w:t>scenarios</w:t>
-      </w:r>
-      <w:proofErr w:type="spellEnd"/>
-      <w:r>
-        <w:rPr>
-          <w:lang w:val="es-ES"/>
-        </w:rPr>
-        <w:t>.</w:t>
-      </w:r>
-    </w:p>
-    <w:p>
-      <w:pPr>
-        <w:rPr>
-          <w:lang w:val="es-ES"/>
-        </w:rPr>
-      </w:pPr>
-      <w:proofErr w:type="spellStart"/>
-      <w:r>
-        <w:rPr>
-          <w:lang w:val="es-ES"/>
-        </w:rPr>
-        <w:t>Due</w:t>
-      </w:r>
-      <w:proofErr w:type="spellEnd"/>
-      <w:r>
-        <w:rPr>
-          <w:lang w:val="es-ES"/>
-        </w:rPr>
-        <w:t xml:space="preserve"> </w:t>
-      </w:r>
-      <w:proofErr w:type="spellStart"/>
-      <w:r>
-        <w:rPr>
-          <w:lang w:val="es-ES"/>
-        </w:rPr>
-        <w:t>to</w:t>
-      </w:r>
-      <w:proofErr w:type="spellEnd"/>
-      <w:r>
-        <w:rPr>
-          <w:lang w:val="es-ES"/>
-        </w:rPr>
-        <w:t xml:space="preserve"> </w:t>
-      </w:r>
-      <w:proofErr w:type="spellStart"/>
-      <w:r>
-        <w:rPr>
-          <w:lang w:val="es-ES"/>
-        </w:rPr>
-        <w:t>the</w:t>
-      </w:r>
-      <w:proofErr w:type="spellEnd"/>
-      <w:r>
-        <w:rPr>
-          <w:lang w:val="es-ES"/>
-        </w:rPr>
-        <w:t xml:space="preserve"> </w:t>
-      </w:r>
-      <w:proofErr w:type="spellStart"/>
-      <w:r>
-        <w:rPr>
-          <w:lang w:val="es-ES"/>
-        </w:rPr>
-        <w:t>complexity</w:t>
-      </w:r>
-      <w:proofErr w:type="spellEnd"/>
-      <w:r>
-        <w:rPr>
-          <w:lang w:val="es-ES"/>
-        </w:rPr>
-        <w:t xml:space="preserve"> and </w:t>
-      </w:r>
-      <w:proofErr w:type="spellStart"/>
-      <w:r>
-        <w:rPr>
-          <w:lang w:val="es-ES"/>
-        </w:rPr>
-        <w:t>the</w:t>
-      </w:r>
-      <w:proofErr w:type="spellEnd"/>
-      <w:r>
-        <w:rPr>
-          <w:lang w:val="es-ES"/>
-        </w:rPr>
-        <w:t xml:space="preserve"> </w:t>
-      </w:r>
-      <w:proofErr w:type="spellStart"/>
-      <w:r>
-        <w:rPr>
-          <w:lang w:val="es-ES"/>
-        </w:rPr>
-        <w:t>risk</w:t>
-      </w:r>
-      <w:proofErr w:type="spellEnd"/>
-      <w:r>
-        <w:rPr>
-          <w:lang w:val="es-ES"/>
-        </w:rPr>
-        <w:t xml:space="preserve"> </w:t>
-      </w:r>
-      <w:proofErr w:type="spellStart"/>
-      <w:r>
-        <w:rPr>
-          <w:lang w:val="es-ES"/>
-        </w:rPr>
-        <w:t>of</w:t>
-      </w:r>
-      <w:proofErr w:type="spellEnd"/>
-      <w:r>
-        <w:rPr>
-          <w:lang w:val="es-ES"/>
-        </w:rPr>
-        <w:t xml:space="preserve"> false positives, I </w:t>
-      </w:r>
-      <w:proofErr w:type="spellStart"/>
-      <w:r>
-        <w:rPr>
-          <w:lang w:val="es-ES"/>
-        </w:rPr>
-        <w:t>ultimately</w:t>
-      </w:r>
-      <w:proofErr w:type="spellEnd"/>
-      <w:r>
-        <w:rPr>
-          <w:lang w:val="es-ES"/>
-        </w:rPr>
-        <w:t xml:space="preserve"> </w:t>
-      </w:r>
-      <w:proofErr w:type="spellStart"/>
-      <w:r>
-        <w:rPr>
-          <w:lang w:val="es-ES"/>
-        </w:rPr>
-        <w:t>decided</w:t>
-      </w:r>
-      <w:proofErr w:type="spellEnd"/>
-      <w:r>
-        <w:rPr>
-          <w:lang w:val="es-ES"/>
-        </w:rPr>
-        <w:t xml:space="preserve"> </w:t>
-      </w:r>
-      <w:proofErr w:type="spellStart"/>
-      <w:r>
-        <w:rPr>
-          <w:lang w:val="es-ES"/>
-        </w:rPr>
-        <w:t>the</w:t>
-      </w:r>
-      <w:proofErr w:type="spellEnd"/>
-      <w:r>
-        <w:rPr>
-          <w:lang w:val="es-ES"/>
-        </w:rPr>
-        <w:t xml:space="preserve"> </w:t>
-      </w:r>
-      <w:proofErr w:type="spellStart"/>
-      <w:r>
-        <w:rPr>
-          <w:lang w:val="es-ES"/>
-        </w:rPr>
-        <w:t>best</w:t>
-      </w:r>
-      <w:proofErr w:type="spellEnd"/>
-      <w:r>
-        <w:rPr>
-          <w:lang w:val="es-ES"/>
-        </w:rPr>
-        <w:t xml:space="preserve"> </w:t>
-      </w:r>
-      <w:proofErr w:type="spellStart"/>
-      <w:r>
-        <w:rPr>
-          <w:lang w:val="es-ES"/>
-        </w:rPr>
-        <w:t>option</w:t>
-      </w:r>
-      <w:proofErr w:type="spellEnd"/>
-      <w:r>
-        <w:rPr>
-          <w:lang w:val="es-ES"/>
-        </w:rPr>
-        <w:t xml:space="preserve"> </w:t>
-      </w:r>
-      <w:proofErr w:type="spellStart"/>
-      <w:r>
-        <w:rPr>
-          <w:lang w:val="es-ES"/>
-        </w:rPr>
-        <w:t>was</w:t>
-      </w:r>
-      <w:proofErr w:type="spellEnd"/>
-      <w:r>
-        <w:rPr>
-          <w:lang w:val="es-ES"/>
-        </w:rPr>
-        <w:t xml:space="preserve"> </w:t>
-      </w:r>
-      <w:proofErr w:type="spellStart"/>
-      <w:r>
-        <w:rPr>
-          <w:lang w:val="es-ES"/>
-        </w:rPr>
-        <w:t>to</w:t>
-      </w:r>
-      <w:proofErr w:type="spellEnd"/>
-      <w:r>
-        <w:rPr>
-          <w:lang w:val="es-ES"/>
-        </w:rPr>
-        <w:t xml:space="preserve"> </w:t>
-      </w:r>
-      <w:proofErr w:type="spellStart"/>
-      <w:r>
-        <w:rPr>
-          <w:lang w:val="es-ES"/>
-        </w:rPr>
-        <w:t>remove</w:t>
-      </w:r>
-      <w:proofErr w:type="spellEnd"/>
-      <w:r>
-        <w:rPr>
-          <w:lang w:val="es-ES"/>
-        </w:rPr>
-        <w:t xml:space="preserve"> </w:t>
-      </w:r>
-      <w:proofErr w:type="spellStart"/>
-      <w:r>
-        <w:rPr>
-          <w:lang w:val="es-ES"/>
-        </w:rPr>
-        <w:t>that</w:t>
-      </w:r>
-      <w:proofErr w:type="spellEnd"/>
-      <w:r>
-        <w:rPr>
-          <w:lang w:val="es-ES"/>
-        </w:rPr>
-        <w:t xml:space="preserve"> </w:t>
-      </w:r>
-      <w:proofErr w:type="spellStart"/>
-      <w:r>
-        <w:rPr>
-          <w:lang w:val="es-ES"/>
-        </w:rPr>
-        <w:t>specific</w:t>
-      </w:r>
-      <w:proofErr w:type="spellEnd"/>
-      <w:r>
-        <w:rPr>
-          <w:lang w:val="es-ES"/>
-        </w:rPr>
-        <w:t xml:space="preserve"> </w:t>
-      </w:r>
-      <w:proofErr w:type="spellStart"/>
-      <w:r>
-        <w:rPr>
-          <w:lang w:val="es-ES"/>
-        </w:rPr>
-        <w:t>authorisation</w:t>
-      </w:r>
-      <w:proofErr w:type="spellEnd"/>
-      <w:r>
-        <w:rPr>
-          <w:lang w:val="es-ES"/>
-        </w:rPr>
-        <w:t xml:space="preserve"> </w:t>
-      </w:r>
-      <w:proofErr w:type="spellStart"/>
-      <w:r>
-        <w:rPr>
-          <w:lang w:val="es-ES"/>
-        </w:rPr>
-        <w:t>check</w:t>
-      </w:r>
-      <w:proofErr w:type="spellEnd"/>
-      <w:r>
-        <w:rPr>
-          <w:lang w:val="es-ES"/>
-        </w:rPr>
-        <w:t>.</w:t>
+        <w:t>Due to the complexity and the risk of false positives, I ultimately decided the best option was to remove that specific authorisation check.</w:t>
       </w:r>
     </w:p>
     <w:p/>
@@ -3304,6 +1489,9 @@
     </w:p>
     <w:p>
       <w:r>
+        <w:rPr>
+          <w:noProof/>
+        </w:rPr>
         <w:drawing>
           <wp:inline distT="0" distB="0" distL="0" distR="0" wp14:anchorId="66888795" wp14:editId="3AC5973E">
             <wp:extent cx="4201111" cy="1019317"/>
@@ -3354,23 +1542,7 @@
     </w:p>
     <w:p>
       <w:r>
-        <w:t xml:space="preserve">I achieved 100% coverage. </w:t>
-      </w:r>
-      <w:proofErr w:type="gramStart"/>
-      <w:r>
-        <w:t>The .safe</w:t>
-      </w:r>
-      <w:proofErr w:type="gramEnd"/>
-      <w:r>
-        <w:t xml:space="preserve"> tests check the listing of passengers for both published and unpublished bookings. </w:t>
-      </w:r>
-      <w:proofErr w:type="gramStart"/>
-      <w:r>
-        <w:t>The .hack</w:t>
-      </w:r>
-      <w:proofErr w:type="gramEnd"/>
-      <w:r>
-        <w:t xml:space="preserve"> tests simulate access attempts by unauthenticated users, users with a different role, and users with the same role but who are not the owner of the booking.</w:t>
+        <w:t>I achieved 100% coverage. The .safe tests check the listing of passengers for both published and unpublished bookings. The .hack tests simulate access attempts by unauthenticated users, users with a different role, and users with the same role but who are not the owner of the booking.</w:t>
       </w:r>
     </w:p>
     <w:p>
@@ -3385,39 +1557,7 @@
     </w:p>
     <w:p>
       <w:r>
-        <w:t xml:space="preserve">I also reached 100% coverage here. </w:t>
-      </w:r>
-      <w:proofErr w:type="gramStart"/>
-      <w:r>
-        <w:t>The .safe</w:t>
-      </w:r>
-      <w:proofErr w:type="gramEnd"/>
-      <w:r>
-        <w:t xml:space="preserve"> tests verify access to individual </w:t>
-      </w:r>
-      <w:proofErr w:type="spellStart"/>
-      <w:r>
-        <w:t>BookingPassenger</w:t>
-      </w:r>
-      <w:proofErr w:type="spellEnd"/>
-      <w:r>
-        <w:t xml:space="preserve"> entries, particularly showing the linked passenger through the master </w:t>
-      </w:r>
-      <w:proofErr w:type="spellStart"/>
-      <w:r>
-        <w:t>bookingPassenger.passenger</w:t>
-      </w:r>
-      <w:proofErr w:type="spellEnd"/>
-      <w:r>
-        <w:t xml:space="preserve">. </w:t>
-      </w:r>
-      <w:proofErr w:type="gramStart"/>
-      <w:r>
-        <w:t>The .hack</w:t>
-      </w:r>
-      <w:proofErr w:type="gramEnd"/>
-      <w:r>
-        <w:t xml:space="preserve"> tests cover the usual cases: unauthenticated users, users with a different role, and users with the same role but not the owner.</w:t>
+        <w:t>I also reached 100% coverage here. The .safe tests verify access to individual BookingPassenger entries, particularly showing the linked passenger through the master bookingPassenger.passenger. The .hack tests cover the usual cases: unauthenticated users, users with a different role, and users with the same role but not the owner.</w:t>
       </w:r>
     </w:p>
     <w:p>
@@ -3440,751 +1580,73 @@
         <w:rPr>
           <w:lang w:val="es-ES"/>
         </w:rPr>
-        <w:t xml:space="preserve">Here I </w:t>
-      </w:r>
-      <w:proofErr w:type="spellStart"/>
+        <w:t>Here I obtained 9</w:t>
+      </w:r>
       <w:r>
         <w:rPr>
           <w:lang w:val="es-ES"/>
         </w:rPr>
-        <w:t>obtained</w:t>
-      </w:r>
-      <w:proofErr w:type="spellEnd"/>
+        <w:t>8</w:t>
+      </w:r>
       <w:r>
         <w:rPr>
           <w:lang w:val="es-ES"/>
         </w:rPr>
-        <w:t xml:space="preserve"> 9</w:t>
+        <w:t>.</w:t>
       </w:r>
       <w:r>
         <w:rPr>
           <w:lang w:val="es-ES"/>
         </w:rPr>
-        <w:t>8</w:t>
+        <w:t>7</w:t>
       </w:r>
       <w:r>
         <w:rPr>
           <w:lang w:val="es-ES"/>
         </w:rPr>
+        <w:t>% coverage. The .safe tests focus on adding passengers and verifying that the total price updates accordingly, as well as triggering a validation error if the total currency amount reaches the limit of 1,000,000. The .hack tests include attempts by various types of users (different role, unauthenticated, same role but different customer) and cover both published and unpublished scenarios.</w:t>
+      </w:r>
+      <w:r>
+        <w:rPr>
+          <w:lang w:val="es-ES"/>
+        </w:rPr>
+        <w:t xml:space="preserve"> </w:t>
+      </w:r>
+      <w:r>
+        <w:rPr>
+          <w:lang w:val="es-ES"/>
+        </w:rPr>
+        <w:br/>
+      </w:r>
+      <w:r>
+        <w:t>I also tested by modifying the fields via F12, using various invalid passengers — including unpublished ones, null values (e.g., id = 0 or an arbitrary id like 121331), passengers belonging to a different customer, or those already assigned to the same booking.</w:t>
+      </w:r>
+    </w:p>
+    <w:p>
+      <w:pPr>
+        <w:pStyle w:val="Ttulo4"/>
+      </w:pPr>
+      <w:bookmarkStart w:id="19" w:name="_Toc199190124"/>
+      <w:r>
+        <w:t>Delete</w:t>
+      </w:r>
+      <w:bookmarkEnd w:id="19"/>
+    </w:p>
+    <w:p>
+      <w:r>
+        <w:t>Here I achieved 9</w:t>
+      </w:r>
+      <w:r>
+        <w:t>6</w:t>
+      </w:r>
+      <w:r>
         <w:t>.</w:t>
       </w:r>
       <w:r>
-        <w:rPr>
-          <w:lang w:val="es-ES"/>
-        </w:rPr>
-        <w:t>7</w:t>
-      </w:r>
-      <w:r>
-        <w:rPr>
-          <w:lang w:val="es-ES"/>
-        </w:rPr>
-        <w:t xml:space="preserve">% </w:t>
-      </w:r>
-      <w:proofErr w:type="spellStart"/>
-      <w:r>
-        <w:rPr>
-          <w:lang w:val="es-ES"/>
-        </w:rPr>
-        <w:t>coverage</w:t>
-      </w:r>
-      <w:proofErr w:type="spellEnd"/>
-      <w:r>
-        <w:rPr>
-          <w:lang w:val="es-ES"/>
-        </w:rPr>
-        <w:t xml:space="preserve">. </w:t>
-      </w:r>
-      <w:proofErr w:type="spellStart"/>
-      <w:proofErr w:type="gramStart"/>
-      <w:r>
-        <w:rPr>
-          <w:lang w:val="es-ES"/>
-        </w:rPr>
-        <w:t>The</w:t>
-      </w:r>
-      <w:proofErr w:type="spellEnd"/>
-      <w:r>
-        <w:rPr>
-          <w:lang w:val="es-ES"/>
-        </w:rPr>
-        <w:t xml:space="preserve"> .</w:t>
-      </w:r>
-      <w:proofErr w:type="spellStart"/>
-      <w:r>
-        <w:rPr>
-          <w:lang w:val="es-ES"/>
-        </w:rPr>
-        <w:t>safe</w:t>
-      </w:r>
-      <w:proofErr w:type="spellEnd"/>
-      <w:proofErr w:type="gramEnd"/>
-      <w:r>
-        <w:rPr>
-          <w:lang w:val="es-ES"/>
-        </w:rPr>
-        <w:t xml:space="preserve"> </w:t>
-      </w:r>
-      <w:proofErr w:type="spellStart"/>
-      <w:r>
-        <w:rPr>
-          <w:lang w:val="es-ES"/>
-        </w:rPr>
-        <w:t>tests</w:t>
-      </w:r>
-      <w:proofErr w:type="spellEnd"/>
-      <w:r>
-        <w:rPr>
-          <w:lang w:val="es-ES"/>
-        </w:rPr>
-        <w:t xml:space="preserve"> </w:t>
-      </w:r>
-      <w:proofErr w:type="spellStart"/>
-      <w:r>
-        <w:rPr>
-          <w:lang w:val="es-ES"/>
-        </w:rPr>
-        <w:t>focus</w:t>
-      </w:r>
-      <w:proofErr w:type="spellEnd"/>
-      <w:r>
-        <w:rPr>
-          <w:lang w:val="es-ES"/>
-        </w:rPr>
-        <w:t xml:space="preserve"> </w:t>
-      </w:r>
-      <w:proofErr w:type="spellStart"/>
-      <w:r>
-        <w:rPr>
-          <w:lang w:val="es-ES"/>
-        </w:rPr>
-        <w:t>on</w:t>
-      </w:r>
-      <w:proofErr w:type="spellEnd"/>
-      <w:r>
-        <w:rPr>
-          <w:lang w:val="es-ES"/>
-        </w:rPr>
-        <w:t xml:space="preserve"> </w:t>
-      </w:r>
-      <w:proofErr w:type="spellStart"/>
-      <w:r>
-        <w:rPr>
-          <w:lang w:val="es-ES"/>
-        </w:rPr>
-        <w:t>adding</w:t>
-      </w:r>
-      <w:proofErr w:type="spellEnd"/>
-      <w:r>
-        <w:rPr>
-          <w:lang w:val="es-ES"/>
-        </w:rPr>
-        <w:t xml:space="preserve"> </w:t>
-      </w:r>
-      <w:proofErr w:type="spellStart"/>
-      <w:r>
-        <w:rPr>
-          <w:lang w:val="es-ES"/>
-        </w:rPr>
-        <w:t>passengers</w:t>
-      </w:r>
-      <w:proofErr w:type="spellEnd"/>
-      <w:r>
-        <w:rPr>
-          <w:lang w:val="es-ES"/>
-        </w:rPr>
-        <w:t xml:space="preserve"> and </w:t>
-      </w:r>
-      <w:proofErr w:type="spellStart"/>
-      <w:r>
-        <w:rPr>
-          <w:lang w:val="es-ES"/>
-        </w:rPr>
-        <w:t>verifying</w:t>
-      </w:r>
-      <w:proofErr w:type="spellEnd"/>
-      <w:r>
-        <w:rPr>
-          <w:lang w:val="es-ES"/>
-        </w:rPr>
-        <w:t xml:space="preserve"> </w:t>
-      </w:r>
-      <w:proofErr w:type="spellStart"/>
-      <w:r>
-        <w:rPr>
-          <w:lang w:val="es-ES"/>
-        </w:rPr>
-        <w:t>that</w:t>
-      </w:r>
-      <w:proofErr w:type="spellEnd"/>
-      <w:r>
-        <w:rPr>
-          <w:lang w:val="es-ES"/>
-        </w:rPr>
-        <w:t xml:space="preserve"> </w:t>
-      </w:r>
-      <w:proofErr w:type="spellStart"/>
-      <w:r>
-        <w:rPr>
-          <w:lang w:val="es-ES"/>
-        </w:rPr>
-        <w:t>the</w:t>
-      </w:r>
-      <w:proofErr w:type="spellEnd"/>
-      <w:r>
-        <w:rPr>
-          <w:lang w:val="es-ES"/>
-        </w:rPr>
-        <w:t xml:space="preserve"> total </w:t>
-      </w:r>
-      <w:proofErr w:type="spellStart"/>
-      <w:r>
-        <w:rPr>
-          <w:lang w:val="es-ES"/>
-        </w:rPr>
-        <w:t>price</w:t>
-      </w:r>
-      <w:proofErr w:type="spellEnd"/>
-      <w:r>
-        <w:rPr>
-          <w:lang w:val="es-ES"/>
-        </w:rPr>
-        <w:t xml:space="preserve"> </w:t>
-      </w:r>
-      <w:proofErr w:type="spellStart"/>
-      <w:r>
-        <w:rPr>
-          <w:lang w:val="es-ES"/>
-        </w:rPr>
-        <w:t>updates</w:t>
-      </w:r>
-      <w:proofErr w:type="spellEnd"/>
-      <w:r>
-        <w:rPr>
-          <w:lang w:val="es-ES"/>
-        </w:rPr>
-        <w:t xml:space="preserve"> </w:t>
-      </w:r>
-      <w:proofErr w:type="spellStart"/>
-      <w:r>
-        <w:rPr>
-          <w:lang w:val="es-ES"/>
-        </w:rPr>
-        <w:t>accordingly</w:t>
-      </w:r>
-      <w:proofErr w:type="spellEnd"/>
-      <w:r>
-        <w:rPr>
-          <w:lang w:val="es-ES"/>
-        </w:rPr>
-        <w:t xml:space="preserve">, as </w:t>
-      </w:r>
-      <w:proofErr w:type="spellStart"/>
-      <w:r>
-        <w:rPr>
-          <w:lang w:val="es-ES"/>
-        </w:rPr>
-        <w:t>well</w:t>
-      </w:r>
-      <w:proofErr w:type="spellEnd"/>
-      <w:r>
-        <w:rPr>
-          <w:lang w:val="es-ES"/>
-        </w:rPr>
-        <w:t xml:space="preserve"> as </w:t>
-      </w:r>
-      <w:proofErr w:type="spellStart"/>
-      <w:r>
-        <w:rPr>
-          <w:lang w:val="es-ES"/>
-        </w:rPr>
-        <w:t>triggering</w:t>
-      </w:r>
-      <w:proofErr w:type="spellEnd"/>
-      <w:r>
-        <w:rPr>
-          <w:lang w:val="es-ES"/>
-        </w:rPr>
-        <w:t xml:space="preserve"> a </w:t>
-      </w:r>
-      <w:proofErr w:type="spellStart"/>
-      <w:r>
-        <w:rPr>
-          <w:lang w:val="es-ES"/>
-        </w:rPr>
-        <w:t>validation</w:t>
-      </w:r>
-      <w:proofErr w:type="spellEnd"/>
-      <w:r>
-        <w:rPr>
-          <w:lang w:val="es-ES"/>
-        </w:rPr>
-        <w:t xml:space="preserve"> error </w:t>
-      </w:r>
-      <w:proofErr w:type="spellStart"/>
-      <w:r>
-        <w:rPr>
-          <w:lang w:val="es-ES"/>
-        </w:rPr>
-        <w:t>if</w:t>
-      </w:r>
-      <w:proofErr w:type="spellEnd"/>
-      <w:r>
-        <w:rPr>
-          <w:lang w:val="es-ES"/>
-        </w:rPr>
-        <w:t xml:space="preserve"> </w:t>
-      </w:r>
-      <w:proofErr w:type="spellStart"/>
-      <w:r>
-        <w:rPr>
-          <w:lang w:val="es-ES"/>
-        </w:rPr>
-        <w:t>the</w:t>
-      </w:r>
-      <w:proofErr w:type="spellEnd"/>
-      <w:r>
-        <w:rPr>
-          <w:lang w:val="es-ES"/>
-        </w:rPr>
-        <w:t xml:space="preserve"> total </w:t>
-      </w:r>
-      <w:proofErr w:type="spellStart"/>
-      <w:r>
-        <w:rPr>
-          <w:lang w:val="es-ES"/>
-        </w:rPr>
-        <w:t>currency</w:t>
-      </w:r>
-      <w:proofErr w:type="spellEnd"/>
-      <w:r>
-        <w:rPr>
-          <w:lang w:val="es-ES"/>
-        </w:rPr>
-        <w:t xml:space="preserve"> </w:t>
-      </w:r>
-      <w:proofErr w:type="spellStart"/>
-      <w:r>
-        <w:rPr>
-          <w:lang w:val="es-ES"/>
-        </w:rPr>
-        <w:t>amount</w:t>
-      </w:r>
-      <w:proofErr w:type="spellEnd"/>
-      <w:r>
-        <w:rPr>
-          <w:lang w:val="es-ES"/>
-        </w:rPr>
-        <w:t xml:space="preserve"> </w:t>
-      </w:r>
-      <w:proofErr w:type="spellStart"/>
-      <w:r>
-        <w:rPr>
-          <w:lang w:val="es-ES"/>
-        </w:rPr>
-        <w:t>reaches</w:t>
-      </w:r>
-      <w:proofErr w:type="spellEnd"/>
-      <w:r>
-        <w:rPr>
-          <w:lang w:val="es-ES"/>
-        </w:rPr>
-        <w:t xml:space="preserve"> </w:t>
-      </w:r>
-      <w:proofErr w:type="spellStart"/>
-      <w:r>
-        <w:rPr>
-          <w:lang w:val="es-ES"/>
-        </w:rPr>
-        <w:t>the</w:t>
-      </w:r>
-      <w:proofErr w:type="spellEnd"/>
-      <w:r>
-        <w:rPr>
-          <w:lang w:val="es-ES"/>
-        </w:rPr>
-        <w:t xml:space="preserve"> </w:t>
-      </w:r>
-      <w:proofErr w:type="spellStart"/>
-      <w:r>
-        <w:rPr>
-          <w:lang w:val="es-ES"/>
-        </w:rPr>
-        <w:t>limit</w:t>
-      </w:r>
-      <w:proofErr w:type="spellEnd"/>
-      <w:r>
-        <w:rPr>
-          <w:lang w:val="es-ES"/>
-        </w:rPr>
-        <w:t xml:space="preserve"> </w:t>
-      </w:r>
-      <w:proofErr w:type="spellStart"/>
-      <w:r>
-        <w:rPr>
-          <w:lang w:val="es-ES"/>
-        </w:rPr>
-        <w:t>of</w:t>
-      </w:r>
-      <w:proofErr w:type="spellEnd"/>
-      <w:r>
-        <w:rPr>
-          <w:lang w:val="es-ES"/>
-        </w:rPr>
-        <w:t xml:space="preserve"> 1,000,000. </w:t>
-      </w:r>
-      <w:proofErr w:type="spellStart"/>
-      <w:proofErr w:type="gramStart"/>
-      <w:r>
-        <w:rPr>
-          <w:lang w:val="es-ES"/>
-        </w:rPr>
-        <w:t>The</w:t>
-      </w:r>
-      <w:proofErr w:type="spellEnd"/>
-      <w:r>
-        <w:rPr>
-          <w:lang w:val="es-ES"/>
-        </w:rPr>
-        <w:t xml:space="preserve"> .</w:t>
-      </w:r>
-      <w:proofErr w:type="spellStart"/>
-      <w:r>
-        <w:rPr>
-          <w:lang w:val="es-ES"/>
-        </w:rPr>
-        <w:t>hack</w:t>
-      </w:r>
-      <w:proofErr w:type="spellEnd"/>
-      <w:proofErr w:type="gramEnd"/>
-      <w:r>
-        <w:rPr>
-          <w:lang w:val="es-ES"/>
-        </w:rPr>
-        <w:t xml:space="preserve"> </w:t>
-      </w:r>
-      <w:proofErr w:type="spellStart"/>
-      <w:r>
-        <w:rPr>
-          <w:lang w:val="es-ES"/>
-        </w:rPr>
-        <w:t>tests</w:t>
-      </w:r>
-      <w:proofErr w:type="spellEnd"/>
-      <w:r>
-        <w:rPr>
-          <w:lang w:val="es-ES"/>
-        </w:rPr>
-        <w:t xml:space="preserve"> </w:t>
-      </w:r>
-      <w:proofErr w:type="spellStart"/>
-      <w:r>
-        <w:rPr>
-          <w:lang w:val="es-ES"/>
-        </w:rPr>
-        <w:t>include</w:t>
-      </w:r>
-      <w:proofErr w:type="spellEnd"/>
-      <w:r>
-        <w:rPr>
-          <w:lang w:val="es-ES"/>
-        </w:rPr>
-        <w:t xml:space="preserve"> </w:t>
-      </w:r>
-      <w:proofErr w:type="spellStart"/>
-      <w:r>
-        <w:rPr>
-          <w:lang w:val="es-ES"/>
-        </w:rPr>
-        <w:t>attempts</w:t>
-      </w:r>
-      <w:proofErr w:type="spellEnd"/>
-      <w:r>
-        <w:rPr>
-          <w:lang w:val="es-ES"/>
-        </w:rPr>
-        <w:t xml:space="preserve"> </w:t>
-      </w:r>
-      <w:proofErr w:type="spellStart"/>
-      <w:r>
-        <w:rPr>
-          <w:lang w:val="es-ES"/>
-        </w:rPr>
-        <w:t>by</w:t>
-      </w:r>
-      <w:proofErr w:type="spellEnd"/>
-      <w:r>
-        <w:rPr>
-          <w:lang w:val="es-ES"/>
-        </w:rPr>
-        <w:t xml:space="preserve"> </w:t>
-      </w:r>
-      <w:proofErr w:type="spellStart"/>
-      <w:r>
-        <w:rPr>
-          <w:lang w:val="es-ES"/>
-        </w:rPr>
-        <w:t>various</w:t>
-      </w:r>
-      <w:proofErr w:type="spellEnd"/>
-      <w:r>
-        <w:rPr>
-          <w:lang w:val="es-ES"/>
-        </w:rPr>
-        <w:t xml:space="preserve"> </w:t>
-      </w:r>
-      <w:proofErr w:type="spellStart"/>
-      <w:r>
-        <w:rPr>
-          <w:lang w:val="es-ES"/>
-        </w:rPr>
-        <w:t>types</w:t>
-      </w:r>
-      <w:proofErr w:type="spellEnd"/>
-      <w:r>
-        <w:rPr>
-          <w:lang w:val="es-ES"/>
-        </w:rPr>
-        <w:t xml:space="preserve"> </w:t>
-      </w:r>
-      <w:proofErr w:type="spellStart"/>
-      <w:r>
-        <w:rPr>
-          <w:lang w:val="es-ES"/>
-        </w:rPr>
-        <w:t>of</w:t>
-      </w:r>
-      <w:proofErr w:type="spellEnd"/>
-      <w:r>
-        <w:rPr>
-          <w:lang w:val="es-ES"/>
-        </w:rPr>
-        <w:t xml:space="preserve"> </w:t>
-      </w:r>
-      <w:proofErr w:type="spellStart"/>
-      <w:r>
-        <w:rPr>
-          <w:lang w:val="es-ES"/>
-        </w:rPr>
-        <w:t>users</w:t>
-      </w:r>
-      <w:proofErr w:type="spellEnd"/>
-      <w:r>
-        <w:rPr>
-          <w:lang w:val="es-ES"/>
-        </w:rPr>
-        <w:t xml:space="preserve"> (</w:t>
-      </w:r>
-      <w:proofErr w:type="spellStart"/>
-      <w:r>
-        <w:rPr>
-          <w:lang w:val="es-ES"/>
-        </w:rPr>
-        <w:t>different</w:t>
-      </w:r>
-      <w:proofErr w:type="spellEnd"/>
-      <w:r>
-        <w:rPr>
-          <w:lang w:val="es-ES"/>
-        </w:rPr>
-        <w:t xml:space="preserve"> role, </w:t>
-      </w:r>
-      <w:proofErr w:type="spellStart"/>
-      <w:r>
-        <w:rPr>
-          <w:lang w:val="es-ES"/>
-        </w:rPr>
-        <w:t>unauthenticated</w:t>
-      </w:r>
-      <w:proofErr w:type="spellEnd"/>
-      <w:r>
-        <w:rPr>
-          <w:lang w:val="es-ES"/>
-        </w:rPr>
-        <w:t xml:space="preserve">, </w:t>
-      </w:r>
-      <w:proofErr w:type="spellStart"/>
-      <w:r>
-        <w:rPr>
-          <w:lang w:val="es-ES"/>
-        </w:rPr>
-        <w:t>same</w:t>
-      </w:r>
-      <w:proofErr w:type="spellEnd"/>
-      <w:r>
-        <w:rPr>
-          <w:lang w:val="es-ES"/>
-        </w:rPr>
-        <w:t xml:space="preserve"> role </w:t>
-      </w:r>
-      <w:proofErr w:type="spellStart"/>
-      <w:r>
-        <w:rPr>
-          <w:lang w:val="es-ES"/>
-        </w:rPr>
-        <w:t>but</w:t>
-      </w:r>
-      <w:proofErr w:type="spellEnd"/>
-      <w:r>
-        <w:rPr>
-          <w:lang w:val="es-ES"/>
-        </w:rPr>
-        <w:t xml:space="preserve"> </w:t>
-      </w:r>
-      <w:proofErr w:type="spellStart"/>
-      <w:r>
-        <w:rPr>
-          <w:lang w:val="es-ES"/>
-        </w:rPr>
-        <w:t>different</w:t>
-      </w:r>
-      <w:proofErr w:type="spellEnd"/>
-      <w:r>
-        <w:rPr>
-          <w:lang w:val="es-ES"/>
-        </w:rPr>
-        <w:t xml:space="preserve"> </w:t>
-      </w:r>
-      <w:proofErr w:type="spellStart"/>
-      <w:r>
-        <w:rPr>
-          <w:lang w:val="es-ES"/>
-        </w:rPr>
-        <w:t>customer</w:t>
-      </w:r>
-      <w:proofErr w:type="spellEnd"/>
-      <w:r>
-        <w:rPr>
-          <w:lang w:val="es-ES"/>
-        </w:rPr>
-        <w:t xml:space="preserve">) and </w:t>
-      </w:r>
-      <w:proofErr w:type="spellStart"/>
-      <w:r>
-        <w:rPr>
-          <w:lang w:val="es-ES"/>
-        </w:rPr>
-        <w:t>cover</w:t>
-      </w:r>
-      <w:proofErr w:type="spellEnd"/>
-      <w:r>
-        <w:rPr>
-          <w:lang w:val="es-ES"/>
-        </w:rPr>
-        <w:t xml:space="preserve"> </w:t>
-      </w:r>
-      <w:proofErr w:type="spellStart"/>
-      <w:r>
-        <w:rPr>
-          <w:lang w:val="es-ES"/>
-        </w:rPr>
-        <w:t>both</w:t>
-      </w:r>
-      <w:proofErr w:type="spellEnd"/>
-      <w:r>
-        <w:rPr>
-          <w:lang w:val="es-ES"/>
-        </w:rPr>
-        <w:t xml:space="preserve"> </w:t>
-      </w:r>
-      <w:proofErr w:type="spellStart"/>
-      <w:r>
-        <w:rPr>
-          <w:lang w:val="es-ES"/>
-        </w:rPr>
-        <w:t>published</w:t>
-      </w:r>
-      <w:proofErr w:type="spellEnd"/>
-      <w:r>
-        <w:rPr>
-          <w:lang w:val="es-ES"/>
-        </w:rPr>
-        <w:t xml:space="preserve"> and </w:t>
-      </w:r>
-      <w:proofErr w:type="spellStart"/>
-      <w:r>
-        <w:rPr>
-          <w:lang w:val="es-ES"/>
-        </w:rPr>
-        <w:t>unpublished</w:t>
-      </w:r>
-      <w:proofErr w:type="spellEnd"/>
-      <w:r>
-        <w:rPr>
-          <w:lang w:val="es-ES"/>
-        </w:rPr>
-        <w:t xml:space="preserve"> </w:t>
-      </w:r>
-      <w:proofErr w:type="spellStart"/>
-      <w:r>
-        <w:rPr>
-          <w:lang w:val="es-ES"/>
-        </w:rPr>
-        <w:t>scenarios</w:t>
-      </w:r>
-      <w:proofErr w:type="spellEnd"/>
-      <w:r>
-        <w:rPr>
-          <w:lang w:val="es-ES"/>
-        </w:rPr>
-        <w:t>.</w:t>
-      </w:r>
-      <w:r>
-        <w:rPr>
-          <w:lang w:val="es-ES"/>
-        </w:rPr>
-        <w:t xml:space="preserve"> </w:t>
-      </w:r>
-      <w:r>
-        <w:rPr>
-          <w:lang w:val="es-ES"/>
-        </w:rPr>
-        <w:br/>
-      </w:r>
-      <w:r>
-        <w:t>I also tested by modifying the fields via F12, using various invalid passengers — including unpublished ones, null values (e.g., id = 0 or an arbitrary id like 121331), passengers belonging to a different customer, or those already assigned to the same booking.</w:t>
-      </w:r>
-    </w:p>
-    <w:p>
-      <w:pPr>
-        <w:pStyle w:val="Ttulo4"/>
-      </w:pPr>
-      <w:bookmarkStart w:id="19" w:name="_Toc199190124"/>
-      <w:r>
-        <w:t>Delete</w:t>
-      </w:r>
-      <w:bookmarkEnd w:id="19"/>
-    </w:p>
-    <w:p>
-      <w:r>
-        <w:t>Here I achieved 9</w:t>
-      </w:r>
-      <w:r>
         <w:t>6</w:t>
       </w:r>
       <w:r>
-        <w:t>.</w:t>
-      </w:r>
-      <w:r>
-        <w:t>6</w:t>
-      </w:r>
-      <w:r>
-        <w:t xml:space="preserve">% coverage, even though everything appears green in the coverage report, so I’m not entirely sure why it didn’t reach 100%. </w:t>
-      </w:r>
-      <w:proofErr w:type="gramStart"/>
-      <w:r>
-        <w:t>The .safe</w:t>
-      </w:r>
-      <w:proofErr w:type="gramEnd"/>
-      <w:r>
-        <w:t xml:space="preserve"> test deletes an existing connection, while </w:t>
-      </w:r>
-      <w:proofErr w:type="gramStart"/>
-      <w:r>
-        <w:t>the .hack</w:t>
-      </w:r>
-      <w:proofErr w:type="gramEnd"/>
-      <w:r>
-        <w:t xml:space="preserve"> tests attempt to perform the deletion using unauthenticated users, users with a different role, and users with the same role but not the owner.</w:t>
+        <w:t>% coverage, even though everything appears green in the coverage report, so I’m not entirely sure why it didn’t reach 100%. The .safe test deletes an existing connection, while the .hack tests attempt to perform the deletion using unauthenticated users, users with a different role, and users with the same role but not the owner.</w:t>
       </w:r>
     </w:p>
     <w:p/>
@@ -4212,10 +1674,10 @@
     <w:p>
       <w:r>
         <w:drawing>
-          <wp:inline distT="0" distB="0" distL="0" distR="0" wp14:anchorId="6BBBB556" wp14:editId="7F8D2E80">
-            <wp:extent cx="4172532" cy="1352739"/>
-            <wp:effectExtent l="0" t="0" r="0" b="0"/>
-            <wp:docPr id="868200956" name="Imagen 1" descr="Interfaz de usuario gráfica, Texto, Aplicación&#10;&#10;El contenido generado por IA puede ser incorrecto."/>
+          <wp:inline distT="0" distB="0" distL="0" distR="0" wp14:anchorId="5F30C808" wp14:editId="7F28E7BC">
+            <wp:extent cx="4124901" cy="1305107"/>
+            <wp:effectExtent l="0" t="0" r="9525" b="9525"/>
+            <wp:docPr id="1451250305" name="Imagen 1" descr="Interfaz de usuario gráfica, Texto, Aplicación, Chat o mensaje de texto&#10;&#10;El contenido generado por IA puede ser incorrecto."/>
             <wp:cNvGraphicFramePr>
               <a:graphicFrameLocks xmlns:a="http://schemas.openxmlformats.org/drawingml/2006/main" noChangeAspect="1"/>
             </wp:cNvGraphicFramePr>
@@ -4223,7 +1685,7 @@
               <a:graphicData uri="http://schemas.openxmlformats.org/drawingml/2006/picture">
                 <pic:pic xmlns:pic="http://schemas.openxmlformats.org/drawingml/2006/picture">
                   <pic:nvPicPr>
-                    <pic:cNvPr id="868200956" name="Imagen 1" descr="Interfaz de usuario gráfica, Texto, Aplicación&#10;&#10;El contenido generado por IA puede ser incorrecto."/>
+                    <pic:cNvPr id="1451250305" name="Imagen 1" descr="Interfaz de usuario gráfica, Texto, Aplicación, Chat o mensaje de texto&#10;&#10;El contenido generado por IA puede ser incorrecto."/>
                     <pic:cNvPicPr/>
                   </pic:nvPicPr>
                   <pic:blipFill>
@@ -4235,7 +1697,7 @@
                   <pic:spPr>
                     <a:xfrm>
                       <a:off x="0" y="0"/>
-                      <a:ext cx="4172532" cy="1352739"/>
+                      <a:ext cx="4124901" cy="1305107"/>
                     </a:xfrm>
                     <a:prstGeom prst="rect">
                       <a:avLst/>
@@ -4260,23 +1722,7 @@
     </w:p>
     <w:p>
       <w:r>
-        <w:t xml:space="preserve">The tests here were simple, so I achieved 100% coverage. I </w:t>
-      </w:r>
-      <w:proofErr w:type="gramStart"/>
-      <w:r>
-        <w:t>created .safe</w:t>
-      </w:r>
-      <w:proofErr w:type="gramEnd"/>
-      <w:r>
-        <w:t xml:space="preserve"> tests to access and view the listing, including pagination and related functionality. </w:t>
-      </w:r>
-      <w:proofErr w:type="gramStart"/>
-      <w:r>
-        <w:t>The .hack</w:t>
-      </w:r>
-      <w:proofErr w:type="gramEnd"/>
-      <w:r>
-        <w:t xml:space="preserve"> tests simulate access attempts by users with different roles, unauthenticated users, and users with the same role accessing their own list.</w:t>
+        <w:t>The tests here were simple, so I achieved 100% coverage. I created .safe tests to access and view the listing, including pagination and related functionality. The .hack tests simulate access attempts by users with different roles, unauthenticated users, and users with the same role accessing their own list.</w:t>
       </w:r>
     </w:p>
     <w:p>
@@ -4307,19 +1753,82 @@
           <w:iCs w:val="0"/>
           <w:color w:val="auto"/>
         </w:rPr>
-        <w:t xml:space="preserve">I also achieved 100% coverage here. </w:t>
-      </w:r>
-      <w:proofErr w:type="gramStart"/>
-      <w:r>
+        <w:t>I also achieved 100% coverage here. The .safe tests check access to both published and unpublished bookings. The .hack tests include attempts by users with different roles, unauthenticated users, users with the same role but not the creator, and also attempts to access a null booking. All cases were tested for both published and unpublished bookings.</w:t>
+      </w:r>
+      <w:bookmarkEnd w:id="23"/>
+    </w:p>
+    <w:p>
+      <w:pPr>
+        <w:pStyle w:val="Ttulo4"/>
+      </w:pPr>
+      <w:bookmarkStart w:id="24" w:name="_Toc199190129"/>
+      <w:r>
+        <w:t>Create</w:t>
+      </w:r>
+      <w:bookmarkEnd w:id="24"/>
+    </w:p>
+    <w:p>
+      <w:r>
+        <w:t>Here I reached 9</w:t>
+      </w:r>
+      <w:r>
+        <w:t>6.</w:t>
+      </w:r>
+      <w:r>
+        <w:t>6</w:t>
+      </w:r>
+      <w:r>
+        <w:t>% coverage. The .safe tests involve executing the operation with different parameters to validate all types of constraints. The .hack tests simulate a create attempt by a user with a different role, an unauthenticated user, and a user with the same role accessing their own create.</w:t>
+      </w:r>
+    </w:p>
+    <w:p>
+      <w:pPr>
+        <w:pStyle w:val="Ttulo4"/>
+      </w:pPr>
+      <w:bookmarkStart w:id="25" w:name="_Toc199190130"/>
+      <w:r>
+        <w:t>Delete</w:t>
+      </w:r>
+      <w:bookmarkEnd w:id="25"/>
+    </w:p>
+    <w:p>
+      <w:r>
+        <w:t>For delete, I obtained 9</w:t>
+      </w:r>
+      <w:r>
+        <w:t>6</w:t>
+      </w:r>
+      <w:r>
+        <w:t xml:space="preserve">.9% coverage. The .safe tests verify deletion of an unpublished booking. The .hack tests cover access attempts by unauthenticated users, users with a different role, users with the same role but not the creator, and attempts to delete a published </w:t>
+      </w:r>
+      <w:r>
+        <w:t>passenger</w:t>
+      </w:r>
+      <w:r>
+        <w:t>.</w:t>
+      </w:r>
+    </w:p>
+    <w:p>
+      <w:pPr>
+        <w:pStyle w:val="Ttulo4"/>
+      </w:pPr>
+      <w:bookmarkStart w:id="26" w:name="_Toc199190131"/>
+      <w:r>
+        <w:t>Update</w:t>
+      </w:r>
+      <w:bookmarkEnd w:id="26"/>
+    </w:p>
+    <w:p>
+      <w:pPr>
+        <w:pStyle w:val="Ttulo4"/>
         <w:rPr>
           <w:rFonts w:eastAsiaTheme="minorEastAsia" w:cstheme="minorBidi"/>
           <w:i w:val="0"/>
           <w:iCs w:val="0"/>
           <w:color w:val="auto"/>
         </w:rPr>
-        <w:t>The .safe</w:t>
-      </w:r>
-      <w:proofErr w:type="gramEnd"/>
+      </w:pPr>
+      <w:bookmarkStart w:id="27" w:name="_Toc199190132"/>
       <w:r>
         <w:rPr>
           <w:rFonts w:eastAsiaTheme="minorEastAsia" w:cstheme="minorBidi"/>
@@ -4327,9 +1836,8 @@
           <w:iCs w:val="0"/>
           <w:color w:val="auto"/>
         </w:rPr>
-        <w:t xml:space="preserve"> tests check access to both published and unpublished bookings. </w:t>
-      </w:r>
-      <w:proofErr w:type="gramStart"/>
+        <w:t>Here I achieved 9</w:t>
+      </w:r>
       <w:r>
         <w:rPr>
           <w:rFonts w:eastAsiaTheme="minorEastAsia" w:cstheme="minorBidi"/>
@@ -4337,9 +1845,8 @@
           <w:iCs w:val="0"/>
           <w:color w:val="auto"/>
         </w:rPr>
-        <w:t>The .hack</w:t>
-      </w:r>
-      <w:proofErr w:type="gramEnd"/>
+        <w:t>6</w:t>
+      </w:r>
       <w:r>
         <w:rPr>
           <w:rFonts w:eastAsiaTheme="minorEastAsia" w:cstheme="minorBidi"/>
@@ -4347,9 +1854,8 @@
           <w:iCs w:val="0"/>
           <w:color w:val="auto"/>
         </w:rPr>
-        <w:t xml:space="preserve"> tests include attempts by users with different roles, unauthenticated users, users with the same role but not the creator, </w:t>
-      </w:r>
-      <w:proofErr w:type="gramStart"/>
+        <w:t>.</w:t>
+      </w:r>
       <w:r>
         <w:rPr>
           <w:rFonts w:eastAsiaTheme="minorEastAsia" w:cstheme="minorBidi"/>
@@ -4357,9 +1863,8 @@
           <w:iCs w:val="0"/>
           <w:color w:val="auto"/>
         </w:rPr>
-        <w:t>and also</w:t>
-      </w:r>
-      <w:proofErr w:type="gramEnd"/>
+        <w:t>9</w:t>
+      </w:r>
       <w:r>
         <w:rPr>
           <w:rFonts w:eastAsiaTheme="minorEastAsia" w:cstheme="minorBidi"/>
@@ -4367,228 +1872,16 @@
           <w:iCs w:val="0"/>
           <w:color w:val="auto"/>
         </w:rPr>
-        <w:t xml:space="preserve"> attempts to access a null booking. All cases were tested for both published and unpublished bookings.</w:t>
-      </w:r>
-      <w:bookmarkEnd w:id="23"/>
-    </w:p>
-    <w:p>
-      <w:pPr>
-        <w:pStyle w:val="Ttulo4"/>
-      </w:pPr>
-      <w:bookmarkStart w:id="24" w:name="_Toc199190129"/>
-      <w:r>
-        <w:t>Create</w:t>
-      </w:r>
-      <w:bookmarkEnd w:id="24"/>
-    </w:p>
-    <w:p>
-      <w:r>
-        <w:t>Here I reached 9</w:t>
-      </w:r>
-      <w:r>
-        <w:t>6.5</w:t>
-      </w:r>
-      <w:r>
-        <w:t xml:space="preserve">% coverage. </w:t>
-      </w:r>
-      <w:proofErr w:type="gramStart"/>
-      <w:r>
-        <w:t>The .safe</w:t>
-      </w:r>
-      <w:proofErr w:type="gramEnd"/>
-      <w:r>
-        <w:t xml:space="preserve"> tests involve executing the operation with different parameters to validate all types of constraints. </w:t>
-      </w:r>
-      <w:proofErr w:type="gramStart"/>
-      <w:r>
-        <w:t>The .hack</w:t>
-      </w:r>
-      <w:proofErr w:type="gramEnd"/>
-      <w:r>
-        <w:t xml:space="preserve"> tests simulate a </w:t>
-      </w:r>
-      <w:proofErr w:type="gramStart"/>
-      <w:r>
-        <w:t>create</w:t>
-      </w:r>
-      <w:proofErr w:type="gramEnd"/>
-      <w:r>
-        <w:t xml:space="preserve"> attempt by a user with a different role, an unauthenticated user, and a user with the same role accessing their own </w:t>
-      </w:r>
-      <w:proofErr w:type="gramStart"/>
-      <w:r>
-        <w:t>create</w:t>
-      </w:r>
-      <w:proofErr w:type="gramEnd"/>
-      <w:r>
-        <w:t>.</w:t>
-      </w:r>
-    </w:p>
-    <w:p>
-      <w:pPr>
-        <w:pStyle w:val="Ttulo4"/>
-      </w:pPr>
-      <w:bookmarkStart w:id="25" w:name="_Toc199190130"/>
-      <w:r>
-        <w:t>Delete</w:t>
-      </w:r>
-      <w:bookmarkEnd w:id="25"/>
-    </w:p>
-    <w:p>
-      <w:r>
-        <w:t>For delete, I obtained 9</w:t>
-      </w:r>
-      <w:r>
-        <w:t>6</w:t>
-      </w:r>
-      <w:r>
-        <w:t xml:space="preserve">.9% coverage. </w:t>
-      </w:r>
-      <w:proofErr w:type="gramStart"/>
-      <w:r>
-        <w:t>The .safe</w:t>
-      </w:r>
-      <w:proofErr w:type="gramEnd"/>
-      <w:r>
-        <w:t xml:space="preserve"> tests verify </w:t>
-      </w:r>
-      <w:proofErr w:type="gramStart"/>
-      <w:r>
-        <w:t>deletion</w:t>
-      </w:r>
-      <w:proofErr w:type="gramEnd"/>
-      <w:r>
-        <w:t xml:space="preserve"> of an unpublished booking. </w:t>
-      </w:r>
-      <w:proofErr w:type="gramStart"/>
-      <w:r>
-        <w:t>The .hack</w:t>
-      </w:r>
-      <w:proofErr w:type="gramEnd"/>
-      <w:r>
-        <w:t xml:space="preserve"> tests cover access attempts by unauthenticated users, users with a different role, users with the same role but not the creator, and attempts to delete a published </w:t>
-      </w:r>
-      <w:r>
-        <w:t>passenger</w:t>
-      </w:r>
-      <w:r>
-        <w:t>.</w:t>
-      </w:r>
-    </w:p>
-    <w:p>
-      <w:pPr>
-        <w:pStyle w:val="Ttulo4"/>
-      </w:pPr>
-      <w:bookmarkStart w:id="26" w:name="_Toc199190131"/>
-      <w:r>
-        <w:t>Update</w:t>
-      </w:r>
-      <w:bookmarkEnd w:id="26"/>
-    </w:p>
-    <w:p>
-      <w:pPr>
-        <w:pStyle w:val="Ttulo4"/>
+        <w:t>% coverage. The .safe tests include multiple parameter combinations to trigger all validation paths. The .hack tests involve an authenticated user with a different role, an unauthenticated user, a user with the same role but not the creator, and a published booking.</w:t>
+      </w:r>
+      <w:bookmarkEnd w:id="27"/>
+      <w:r>
         <w:rPr>
           <w:rFonts w:eastAsiaTheme="minorEastAsia" w:cstheme="minorBidi"/>
           <w:i w:val="0"/>
           <w:iCs w:val="0"/>
           <w:color w:val="auto"/>
         </w:rPr>
-      </w:pPr>
-      <w:bookmarkStart w:id="27" w:name="_Toc199190132"/>
-      <w:r>
-        <w:rPr>
-          <w:rFonts w:eastAsiaTheme="minorEastAsia" w:cstheme="minorBidi"/>
-          <w:i w:val="0"/>
-          <w:iCs w:val="0"/>
-          <w:color w:val="auto"/>
-        </w:rPr>
-        <w:t>Here I achieved 9</w:t>
-      </w:r>
-      <w:r>
-        <w:rPr>
-          <w:rFonts w:eastAsiaTheme="minorEastAsia" w:cstheme="minorBidi"/>
-          <w:i w:val="0"/>
-          <w:iCs w:val="0"/>
-          <w:color w:val="auto"/>
-        </w:rPr>
-        <w:t>6</w:t>
-      </w:r>
-      <w:r>
-        <w:rPr>
-          <w:rFonts w:eastAsiaTheme="minorEastAsia" w:cstheme="minorBidi"/>
-          <w:i w:val="0"/>
-          <w:iCs w:val="0"/>
-          <w:color w:val="auto"/>
-        </w:rPr>
-        <w:t>.</w:t>
-      </w:r>
-      <w:r>
-        <w:rPr>
-          <w:rFonts w:eastAsiaTheme="minorEastAsia" w:cstheme="minorBidi"/>
-          <w:i w:val="0"/>
-          <w:iCs w:val="0"/>
-          <w:color w:val="auto"/>
-        </w:rPr>
-        <w:t>9</w:t>
-      </w:r>
-      <w:r>
-        <w:rPr>
-          <w:rFonts w:eastAsiaTheme="minorEastAsia" w:cstheme="minorBidi"/>
-          <w:i w:val="0"/>
-          <w:iCs w:val="0"/>
-          <w:color w:val="auto"/>
-        </w:rPr>
-        <w:t xml:space="preserve">% coverage. </w:t>
-      </w:r>
-      <w:proofErr w:type="gramStart"/>
-      <w:r>
-        <w:rPr>
-          <w:rFonts w:eastAsiaTheme="minorEastAsia" w:cstheme="minorBidi"/>
-          <w:i w:val="0"/>
-          <w:iCs w:val="0"/>
-          <w:color w:val="auto"/>
-        </w:rPr>
-        <w:t>The .safe</w:t>
-      </w:r>
-      <w:proofErr w:type="gramEnd"/>
-      <w:r>
-        <w:rPr>
-          <w:rFonts w:eastAsiaTheme="minorEastAsia" w:cstheme="minorBidi"/>
-          <w:i w:val="0"/>
-          <w:iCs w:val="0"/>
-          <w:color w:val="auto"/>
-        </w:rPr>
-        <w:t xml:space="preserve"> tests include multiple parameter combinations to trigger all validation paths. </w:t>
-      </w:r>
-      <w:proofErr w:type="gramStart"/>
-      <w:r>
-        <w:rPr>
-          <w:rFonts w:eastAsiaTheme="minorEastAsia" w:cstheme="minorBidi"/>
-          <w:i w:val="0"/>
-          <w:iCs w:val="0"/>
-          <w:color w:val="auto"/>
-        </w:rPr>
-        <w:t>The .hack</w:t>
-      </w:r>
-      <w:proofErr w:type="gramEnd"/>
-      <w:r>
-        <w:rPr>
-          <w:rFonts w:eastAsiaTheme="minorEastAsia" w:cstheme="minorBidi"/>
-          <w:i w:val="0"/>
-          <w:iCs w:val="0"/>
-          <w:color w:val="auto"/>
-        </w:rPr>
-        <w:t xml:space="preserve"> tests involve an authenticated user with a different role, an unauthenticated user, a user with the same role but not the creator, and a published booking.</w:t>
-      </w:r>
-      <w:bookmarkEnd w:id="27"/>
-      <w:r>
-        <w:rPr>
-          <w:rFonts w:eastAsiaTheme="minorEastAsia" w:cstheme="minorBidi"/>
-          <w:i w:val="0"/>
-          <w:iCs w:val="0"/>
-          <w:color w:val="auto"/>
-        </w:rPr>
         <w:t xml:space="preserve"> </w:t>
       </w:r>
     </w:p>
@@ -4640,67 +1933,7 @@
           <w:sz w:val="24"/>
           <w:szCs w:val="24"/>
         </w:rPr>
-        <w:t xml:space="preserve">% coverage for the </w:t>
-      </w:r>
-      <w:proofErr w:type="gramStart"/>
-      <w:r>
-        <w:rPr>
-          <w:rFonts w:eastAsiaTheme="minorEastAsia" w:cstheme="minorBidi"/>
-          <w:color w:val="auto"/>
-          <w:sz w:val="24"/>
-          <w:szCs w:val="24"/>
-        </w:rPr>
-        <w:t>publish</w:t>
-      </w:r>
-      <w:proofErr w:type="gramEnd"/>
-      <w:r>
-        <w:rPr>
-          <w:rFonts w:eastAsiaTheme="minorEastAsia" w:cstheme="minorBidi"/>
-          <w:color w:val="auto"/>
-          <w:sz w:val="24"/>
-          <w:szCs w:val="24"/>
-        </w:rPr>
-        <w:t xml:space="preserve"> operation. </w:t>
-      </w:r>
-      <w:proofErr w:type="gramStart"/>
-      <w:r>
-        <w:rPr>
-          <w:rFonts w:eastAsiaTheme="minorEastAsia" w:cstheme="minorBidi"/>
-          <w:color w:val="auto"/>
-          <w:sz w:val="24"/>
-          <w:szCs w:val="24"/>
-        </w:rPr>
-        <w:t>The .safe</w:t>
-      </w:r>
-      <w:proofErr w:type="gramEnd"/>
-      <w:r>
-        <w:rPr>
-          <w:rFonts w:eastAsiaTheme="minorEastAsia" w:cstheme="minorBidi"/>
-          <w:color w:val="auto"/>
-          <w:sz w:val="24"/>
-          <w:szCs w:val="24"/>
-        </w:rPr>
-        <w:t xml:space="preserve"> tests focus on different parameter combinations to validate all constraints. </w:t>
-      </w:r>
-      <w:proofErr w:type="gramStart"/>
-      <w:r>
-        <w:rPr>
-          <w:rFonts w:eastAsiaTheme="minorEastAsia" w:cstheme="minorBidi"/>
-          <w:color w:val="auto"/>
-          <w:sz w:val="24"/>
-          <w:szCs w:val="24"/>
-        </w:rPr>
-        <w:t>The .hack</w:t>
-      </w:r>
-      <w:proofErr w:type="gramEnd"/>
-      <w:r>
-        <w:rPr>
-          <w:rFonts w:eastAsiaTheme="minorEastAsia" w:cstheme="minorBidi"/>
-          <w:color w:val="auto"/>
-          <w:sz w:val="24"/>
-          <w:szCs w:val="24"/>
-        </w:rPr>
-        <w:t xml:space="preserve"> tests include access attempts by an authenticated user with a different role, an unauthenticated user, a user with the same role but not the creator, and a published booking.</w:t>
+        <w:t>% coverage for the publish operation. The .safe tests focus on different parameter combinations to validate all constraints. The .hack tests include access attempts by an authenticated user with a different role, an unauthenticated user, a user with the same role but not the creator, and a published booking.</w:t>
       </w:r>
       <w:bookmarkEnd w:id="29"/>
       <w:r>
@@ -4757,6 +1990,9 @@
     <w:p/>
     <w:p>
       <w:r>
+        <w:rPr>
+          <w:noProof/>
+        </w:rPr>
         <w:drawing>
           <wp:inline distT="0" distB="0" distL="0" distR="0" wp14:anchorId="206A7763" wp14:editId="1AE0A960">
             <wp:extent cx="5943600" cy="2571115"/>
@@ -4796,15 +2032,7 @@
     </w:p>
     <w:p>
       <w:r>
-        <w:t xml:space="preserve">The graph allows us to intuitively observe that the average response time of the different instructions is </w:t>
-      </w:r>
-      <w:proofErr w:type="gramStart"/>
-      <w:r>
-        <w:t>more or less homogeneous</w:t>
-      </w:r>
-      <w:proofErr w:type="gramEnd"/>
-      <w:r>
-        <w:t>, highlighting those operations that need to write to the database and therefore have a considerably longer time.</w:t>
+        <w:t>The graph allows us to intuitively observe that the average response time of the different instructions is more or less homogeneous, highlighting those operations that need to write to the database and therefore have a considerably longer time.</w:t>
       </w:r>
     </w:p>
     <w:p>
@@ -4830,6 +2058,9 @@
     <w:p/>
     <w:p>
       <w:r>
+        <w:rPr>
+          <w:noProof/>
+        </w:rPr>
         <w:lastRenderedPageBreak/>
         <w:drawing>
           <wp:inline distT="0" distB="0" distL="0" distR="0" wp14:anchorId="07D9E198" wp14:editId="6012DA53">
@@ -4893,6 +2124,9 @@
     <w:p/>
     <w:p>
       <w:r>
+        <w:rPr>
+          <w:noProof/>
+        </w:rPr>
         <w:drawing>
           <wp:inline distT="0" distB="0" distL="0" distR="0" wp14:anchorId="4AA0B4B2" wp14:editId="597AA6FC">
             <wp:extent cx="5943600" cy="2536825"/>
@@ -4933,6 +2167,9 @@
     <w:p/>
     <w:p>
       <w:r>
+        <w:rPr>
+          <w:noProof/>
+        </w:rPr>
         <w:lastRenderedPageBreak/>
         <w:drawing>
           <wp:inline distT="0" distB="0" distL="0" distR="0" wp14:anchorId="3A991213" wp14:editId="36211DF0">
@@ -7289,6 +4526,7 @@
   <w:style w:type="character" w:default="1" w:styleId="Fuentedeprrafopredeter">
     <w:name w:val="Default Paragraph Font"/>
     <w:uiPriority w:val="1"/>
+    <w:semiHidden/>
     <w:unhideWhenUsed/>
   </w:style>
   <w:style w:type="table" w:default="1" w:styleId="Tablanormal">

</xml_diff>